<commit_message>
docs: rescope Claude usage report to August period, pure-Claude metrics
Narrows the analysis window to the August 2026 development period
(08-01~08-15) and separates Cursor Agent's commits out of Claude's
attributed productivity figures. Adds a dedicated comparison section
(2.4) contrasting Cursor Agent's and Claude's commit-level output on
the same repository during the same window.
</commit_message>
<xml_diff>
--- a/Claude_활용_개발_보고서_pjt_scheduling.docx
+++ b/Claude_활용_개발_보고서_pjt_scheduling.docx
@@ -64,7 +64,7 @@
           <w:sz w:val="18"/>
           <w:szCs w:val="18"/>
         </w:rPr>
-        <w:t xml:space="preserve">분석 범위: 브랜치 전체 커밋 이력</w:t>
+        <w:t xml:space="preserve">분석 기간: 2026년 8월 개발 기간(8/1~8/15)</w:t>
       </w:r>
     </w:p>
     <w:p>
@@ -403,7 +403,7 @@
                 <w:sz w:val="19"/>
                 <w:szCs w:val="19"/>
               </w:rPr>
-              <w:t xml:space="preserve">2026-07-30 ~ 2026-08-15 (달력 기준 17일, 실 개발일 8일)</w:t>
+              <w:t xml:space="preserve">2026-08-01 ~ 2026-08-15 (8월 개발 기간, 실 개발일 7일)</w:t>
             </w:r>
           </w:p>
         </w:tc>
@@ -438,7 +438,7 @@
                 <w:sz w:val="19"/>
                 <w:szCs w:val="19"/>
               </w:rPr>
-              <w:t xml:space="preserve">총 커밋 수</w:t>
+              <w:t xml:space="preserve">기간 내 총 커밋 수</w:t>
             </w:r>
           </w:p>
         </w:tc>
@@ -468,7 +468,7 @@
                 <w:sz w:val="19"/>
                 <w:szCs w:val="19"/>
               </w:rPr>
-              <w:t xml:space="preserve">50건 (브랜치 전체 이력 기준)</w:t>
+              <w:t xml:space="preserve">35건 (2026년 8월 개발 기간 기준)</w:t>
             </w:r>
           </w:p>
         </w:tc>
@@ -531,7 +531,7 @@
                 <w:sz w:val="19"/>
                 <w:szCs w:val="19"/>
               </w:rPr>
-              <w:t xml:space="preserve">약 35,400줄 (Python / TypeScript·TSX / JavaScript 합산)</w:t>
+              <w:t xml:space="preserve">약 35,400줄 (Python / TypeScript·TSX / JavaScript, 프로젝트 전체 누적)</w:t>
             </w:r>
           </w:p>
         </w:tc>
@@ -596,7 +596,7 @@
                 <w:sz w:val="19"/>
                 <w:szCs w:val="19"/>
               </w:rPr>
-              <w:t xml:space="preserve">테스트 파일 35개 · 테스트 함수 196개 (tests/ 디렉터리)</w:t>
+              <w:t xml:space="preserve">테스트 파일 35개 · 테스트 함수 196개 (tests/ 디렉터리, 프로젝트 전체 누적)</w:t>
             </w:r>
           </w:p>
         </w:tc>
@@ -853,7 +853,7 @@
           <w:sz w:val="23"/>
           <w:szCs w:val="23"/>
         </w:rPr>
-        <w:t xml:space="preserve">2.2 커밋 저자 구성 (AI 페어 프로그래밍 비중)</w:t>
+        <w:t xml:space="preserve">2.2 커밋 저자 구성 (8월 개발 기간 기준)</w:t>
       </w:r>
     </w:p>
     <w:tbl>
@@ -1087,7 +1087,7 @@
                 <w:sz w:val="19"/>
                 <w:szCs w:val="19"/>
               </w:rPr>
-              <w:t xml:space="preserve">42%</w:t>
+              <w:t xml:space="preserve">60%</w:t>
             </w:r>
           </w:p>
         </w:tc>
@@ -1151,7 +1151,7 @@
                 <w:sz w:val="19"/>
                 <w:szCs w:val="19"/>
               </w:rPr>
-              <w:t xml:space="preserve">Claude</w:t>
+              <w:t xml:space="preserve">Claude (Claude Code 세션)</w:t>
             </w:r>
           </w:p>
         </w:tc>
@@ -1181,7 +1181,7 @@
                 <w:sz w:val="19"/>
                 <w:szCs w:val="19"/>
               </w:rPr>
-              <w:t xml:space="preserve">15건</w:t>
+              <w:t xml:space="preserve">8건</w:t>
             </w:r>
           </w:p>
         </w:tc>
@@ -1211,7 +1211,7 @@
                 <w:sz w:val="19"/>
                 <w:szCs w:val="19"/>
               </w:rPr>
-              <w:t xml:space="preserve">30%</w:t>
+              <w:t xml:space="preserve">23%</w:t>
             </w:r>
           </w:p>
         </w:tc>
@@ -1275,7 +1275,7 @@
                 <w:sz w:val="19"/>
                 <w:szCs w:val="19"/>
               </w:rPr>
-              <w:t xml:space="preserve">User (AI 세션 경유 커밋)</w:t>
+              <w:t xml:space="preserve">Cursor Agent (참고)</w:t>
             </w:r>
           </w:p>
         </w:tc>
@@ -1304,7 +1304,7 @@
                 <w:sz w:val="19"/>
                 <w:szCs w:val="19"/>
               </w:rPr>
-              <w:t xml:space="preserve">8건</w:t>
+              <w:t xml:space="preserve">6건</w:t>
             </w:r>
           </w:p>
         </w:tc>
@@ -1333,7 +1333,7 @@
                 <w:sz w:val="19"/>
                 <w:szCs w:val="19"/>
               </w:rPr>
-              <w:t xml:space="preserve">16%</w:t>
+              <w:t xml:space="preserve">17%</w:t>
             </w:r>
           </w:p>
         </w:tc>
@@ -1362,132 +1362,7 @@
                 <w:sz w:val="19"/>
                 <w:szCs w:val="19"/>
               </w:rPr>
-              <w:t xml:space="preserve">Claude Code 세션 내 커밋</w:t>
-            </w:r>
-          </w:p>
-        </w:tc>
-      </w:tr>
-      <w:tr>
-        <w:trPr>
-          <w:cantSplit/>
-        </w:trPr>
-        <w:tc>
-          <w:tcPr>
-            <w:tcW w:type="dxa" w:w="3200"/>
-            <w:shd w:fill="EAF0F9" w:val="clear"/>
-            <w:tcMar>
-              <w:top w:type="dxa" w:w="60"/>
-              <w:left w:type="dxa" w:w="100"/>
-              <w:bottom w:type="dxa" w:w="60"/>
-              <w:right w:type="dxa" w:w="100"/>
-            </w:tcMar>
-            <w:vAlign w:val="center"/>
-          </w:tcPr>
-          <w:p>
-            <w:pPr>
-              <w:spacing w:after="40" w:before="40"/>
-              <w:jc w:val="left"/>
-            </w:pPr>
-            <w:r>
-              <w:rPr>
-                <w:rFonts w:ascii="맑은 고딕" w:cs="맑은 고딕" w:eastAsia="맑은 고딕" w:hAnsi="맑은 고딕"/>
-                <w:b w:val="false"/>
-                <w:bCs w:val="false"/>
-                <w:color w:val="000000"/>
-                <w:sz w:val="19"/>
-                <w:szCs w:val="19"/>
-              </w:rPr>
-              <w:t xml:space="preserve">Cursor Agent</w:t>
-            </w:r>
-          </w:p>
-        </w:tc>
-        <w:tc>
-          <w:tcPr>
-            <w:tcW w:type="dxa" w:w="2100"/>
-            <w:shd w:fill="EAF0F9" w:val="clear"/>
-            <w:tcMar>
-              <w:top w:type="dxa" w:w="60"/>
-              <w:left w:type="dxa" w:w="100"/>
-              <w:bottom w:type="dxa" w:w="60"/>
-              <w:right w:type="dxa" w:w="100"/>
-            </w:tcMar>
-            <w:vAlign w:val="center"/>
-          </w:tcPr>
-          <w:p>
-            <w:pPr>
-              <w:spacing w:after="40" w:before="40"/>
-              <w:jc w:val="left"/>
-            </w:pPr>
-            <w:r>
-              <w:rPr>
-                <w:rFonts w:ascii="맑은 고딕" w:cs="맑은 고딕" w:eastAsia="맑은 고딕" w:hAnsi="맑은 고딕"/>
-                <w:b w:val="false"/>
-                <w:bCs w:val="false"/>
-                <w:color w:val="000000"/>
-                <w:sz w:val="19"/>
-                <w:szCs w:val="19"/>
-              </w:rPr>
-              <w:t xml:space="preserve">6건</w:t>
-            </w:r>
-          </w:p>
-        </w:tc>
-        <w:tc>
-          <w:tcPr>
-            <w:tcW w:type="dxa" w:w="2100"/>
-            <w:shd w:fill="EAF0F9" w:val="clear"/>
-            <w:tcMar>
-              <w:top w:type="dxa" w:w="60"/>
-              <w:left w:type="dxa" w:w="100"/>
-              <w:bottom w:type="dxa" w:w="60"/>
-              <w:right w:type="dxa" w:w="100"/>
-            </w:tcMar>
-            <w:vAlign w:val="center"/>
-          </w:tcPr>
-          <w:p>
-            <w:pPr>
-              <w:spacing w:after="40" w:before="40"/>
-              <w:jc w:val="left"/>
-            </w:pPr>
-            <w:r>
-              <w:rPr>
-                <w:rFonts w:ascii="맑은 고딕" w:cs="맑은 고딕" w:eastAsia="맑은 고딕" w:hAnsi="맑은 고딕"/>
-                <w:b w:val="false"/>
-                <w:bCs w:val="false"/>
-                <w:color w:val="000000"/>
-                <w:sz w:val="19"/>
-                <w:szCs w:val="19"/>
-              </w:rPr>
-              <w:t xml:space="preserve">12%</w:t>
-            </w:r>
-          </w:p>
-        </w:tc>
-        <w:tc>
-          <w:tcPr>
-            <w:tcW w:type="dxa" w:w="1950"/>
-            <w:shd w:fill="EAF0F9" w:val="clear"/>
-            <w:tcMar>
-              <w:top w:type="dxa" w:w="60"/>
-              <w:left w:type="dxa" w:w="100"/>
-              <w:bottom w:type="dxa" w:w="60"/>
-              <w:right w:type="dxa" w:w="100"/>
-            </w:tcMar>
-            <w:vAlign w:val="center"/>
-          </w:tcPr>
-          <w:p>
-            <w:pPr>
-              <w:spacing w:after="40" w:before="40"/>
-              <w:jc w:val="left"/>
-            </w:pPr>
-            <w:r>
-              <w:rPr>
-                <w:rFonts w:ascii="맑은 고딕" w:cs="맑은 고딕" w:eastAsia="맑은 고딕" w:hAnsi="맑은 고딕"/>
-                <w:b w:val="false"/>
-                <w:bCs w:val="false"/>
-                <w:color w:val="000000"/>
-                <w:sz w:val="19"/>
-                <w:szCs w:val="19"/>
-              </w:rPr>
-              <w:t xml:space="preserve">보조 AI 페어 프로그래밍 도구</w:t>
+              <w:t xml:space="preserve">별도 AI 페어 프로그래밍 도구 — 2.4절에서 비교</w:t>
             </w:r>
           </w:p>
         </w:tc>
@@ -1506,7 +1381,7 @@
           <w:sz w:val="18"/>
           <w:szCs w:val="18"/>
         </w:rPr>
-        <w:t xml:space="preserve">AI 저자(Claude + Cursor Agent + AI 세션 경유)가 직접 남긴 커밋이 전체의 58%(29/50건)에 달하며, 나머지 개발자 커밋 다수도 AI가 제안한 diff에 대한 검토·확정 성격이 강하다.</w:t>
+        <w:t xml:space="preserve">본 보고서의 'Claude 활용 성과' 지표는 순수하게 Claude(Claude Code 세션) 저자 커밋 8건만을 기준으로 산정한다. Cursor Agent 커밋 6건은 동일 기간에 존재한 별도 AI 도구의 산출물로, Claude 성과와 합산하지 않고 2.4절에서 독립적으로 비교한다.</w:t>
       </w:r>
     </w:p>
     <w:p>
@@ -1523,7 +1398,20 @@
           <w:sz w:val="23"/>
           <w:szCs w:val="23"/>
         </w:rPr>
-        <w:t xml:space="preserve">2.3 AI가 수행한 작업 유형</w:t>
+        <w:t xml:space="preserve">2.3 Claude가 수행한 작업 — sametool_setup 기능 전체</w:t>
+      </w:r>
+    </w:p>
+    <w:p>
+      <w:pPr>
+        <w:spacing w:after="120" w:line="300"/>
+      </w:pPr>
+      <w:r>
+        <w:rPr>
+          <w:rFonts w:ascii="맑은 고딕" w:cs="맑은 고딕" w:eastAsia="맑은 고딕" w:hAnsi="맑은 고딕"/>
+          <w:sz w:val="20"/>
+          <w:szCs w:val="20"/>
+        </w:rPr>
+        <w:t xml:space="preserve">8월 기간 중 Claude가 저자로 남긴 8개 커밋은 모두 하나의 기능(sametool_setup 지표·리워드)을 설계서 작성부터 배포 가능한 구현까지 끝까지 완결한 결과물이다.</w:t>
       </w:r>
     </w:p>
     <w:p>
@@ -1541,7 +1429,7 @@
           <w:sz w:val="20"/>
           <w:szCs w:val="20"/>
         </w:rPr>
-        <w:t xml:space="preserve">신규 기능 개발 — 리워드 가중치·지표 추가, API 필드 리팩토링, 액션 마스킹 설계 검토 등 (feat 16건)</w:t>
+        <w:t xml:space="preserve">설계 문서화 (docs 3건) — 설계서(spec) 작성 → 기존 로직 중복 발견에 따른 범위 재조정 → 구현계획(plan) 수립. 검증용 시나리오 계산기 스크립트까지 동반 산출.</w:t>
       </w:r>
     </w:p>
     <w:p>
@@ -1559,7 +1447,7 @@
           <w:sz w:val="20"/>
           <w:szCs w:val="20"/>
         </w:rPr>
-        <w:t xml:space="preserve">버그 수정 — 멀티공정 RL 환경 크래시, 크로스 파이썬 모델 로드 크래시, 타임스탬프 누락 등 (fix 5건)</w:t>
+        <w:t xml:space="preserve">신규 기능 개발 (feat 4건) — 리워드 가중치(w_sametool_setup) 추가, 기존 전환(conversion) 카운트와 분리된 신규 지표 계산 로직, 시뮬레이터 히스토리 스냅샷 노출, KPI 리포팅 반영.</w:t>
       </w:r>
     </w:p>
     <w:p>
@@ -1577,7 +1465,7 @@
           <w:sz w:val="20"/>
           <w:szCs w:val="20"/>
         </w:rPr>
-        <w:t xml:space="preserve">복합 원인 디버깅 — 모방학습(BC)→PPO 파이프라인이 학습할수록 악화되는 문제를, 8가지 원인(BC 표본 부족·크리틱 미학습·결정적 붕괴·파국적 망각·보상 스케일·업데이트 횟수·시연자 편향·시나리오 암기)으로 분해해 각각 원인-대응-코드 위치를 표로 정리하고 개별 수정</w:t>
+        <w:t xml:space="preserve">버그 수정 (fix 1건) — sametool_setup 페널티가 기존 리워드 항목과 뒤섞여 집계되던 것을 발견해 별도 리워드-내역 키로 분리.</w:t>
       </w:r>
     </w:p>
     <w:p>
@@ -1595,17 +1483,29 @@
           <w:sz w:val="20"/>
           <w:szCs w:val="20"/>
         </w:rPr>
-        <w:t xml:space="preserve">리팩토링 및 설계 정리 — 관측 채널 정리(호기 인덱스 제거 근거를 실측 롤아웃 30건으로 검증), 중복 로직 제거 등 (refactor 2건)</w:t>
-      </w:r>
-    </w:p>
-    <w:p>
-      <w:pPr>
-        <w:pStyle w:val="ListParagraph"/>
-        <w:numPr>
-          <w:ilvl w:val="0"/>
-          <w:numId w:val="1"/>
-        </w:numPr>
-        <w:spacing w:after="60" w:line="280"/>
+        <w:t xml:space="preserve">회귀 테스트 — 전용 테스트 파일(tests/test_sametool_setup.py)을 신설해 Task마다 실패 테스트를 먼저 작성하고 통과를 확인하는 절차를 8개 커밋 전체에 일관 적용.</w:t>
+      </w:r>
+    </w:p>
+    <w:p>
+      <w:pPr>
+        <w:pStyle w:val="Heading2"/>
+        <w:spacing w:after="100" w:before="240"/>
+      </w:pPr>
+      <w:r>
+        <w:rPr>
+          <w:rFonts w:ascii="맑은 고딕" w:cs="맑은 고딕" w:eastAsia="맑은 고딕" w:hAnsi="맑은 고딕"/>
+          <w:b/>
+          <w:bCs/>
+          <w:color w:val="2E5395"/>
+          <w:sz w:val="23"/>
+          <w:szCs w:val="23"/>
+        </w:rPr>
+        <w:t xml:space="preserve">2.4 참고 비교 — Cursor Agent 산출물 vs Claude 산출물</w:t>
+      </w:r>
+    </w:p>
+    <w:p>
+      <w:pPr>
+        <w:spacing w:after="120" w:line="300"/>
       </w:pPr>
       <w:r>
         <w:rPr>
@@ -1613,17 +1513,687 @@
           <w:sz w:val="20"/>
           <w:szCs w:val="20"/>
         </w:rPr>
-        <w:t xml:space="preserve">성능 튜닝 — RL 추론 스레드 고정, 캐시 도입 등 (perf 2건)</w:t>
-      </w:r>
-    </w:p>
-    <w:p>
-      <w:pPr>
-        <w:pStyle w:val="ListParagraph"/>
-        <w:numPr>
-          <w:ilvl w:val="0"/>
-          <w:numId w:val="1"/>
-        </w:numPr>
-        <w:spacing w:after="60" w:line="280"/>
+        <w:t xml:space="preserve">동일한 8월 개발 기간 안에서, 다른 AI 페어 프로그래밍 도구인 Cursor Agent도 6개 커밋(2026-08-01, RL 관측축 확장 작업)을 남겼다. 두 도구가 동일 저장소에서 작업한 실제 커밋 내용을 근거로 비교하면 다음과 같은 차이가 확인된다.</w:t>
+      </w:r>
+    </w:p>
+    <w:tbl>
+      <w:tblPr>
+        <w:tblW w:type="dxa" w:w="9350"/>
+        <w:tblBorders>
+          <w:top w:val="single" w:color="auto" w:sz="4"/>
+          <w:left w:val="single" w:color="auto" w:sz="4"/>
+          <w:bottom w:val="single" w:color="auto" w:sz="4"/>
+          <w:right w:val="single" w:color="auto" w:sz="4"/>
+          <w:insideH w:val="single" w:color="auto" w:sz="4"/>
+          <w:insideV w:val="single" w:color="auto" w:sz="4"/>
+        </w:tblBorders>
+      </w:tblPr>
+      <w:tblGrid>
+        <w:gridCol w:w="2200"/>
+        <w:gridCol w:w="3550"/>
+        <w:gridCol w:w="3600"/>
+      </w:tblGrid>
+      <w:tr>
+        <w:trPr>
+          <w:cantSplit/>
+          <w:tblHeader/>
+        </w:trPr>
+        <w:tc>
+          <w:tcPr>
+            <w:tcW w:type="dxa" w:w="2200"/>
+            <w:shd w:fill="1F3864" w:val="clear"/>
+            <w:tcMar>
+              <w:top w:type="dxa" w:w="60"/>
+              <w:left w:type="dxa" w:w="100"/>
+              <w:bottom w:type="dxa" w:w="60"/>
+              <w:right w:type="dxa" w:w="100"/>
+            </w:tcMar>
+            <w:vAlign w:val="center"/>
+          </w:tcPr>
+          <w:p>
+            <w:pPr>
+              <w:spacing w:after="40" w:before="40"/>
+              <w:jc w:val="left"/>
+            </w:pPr>
+            <w:r>
+              <w:rPr>
+                <w:rFonts w:ascii="맑은 고딕" w:cs="맑은 고딕" w:eastAsia="맑은 고딕" w:hAnsi="맑은 고딕"/>
+                <w:b/>
+                <w:bCs/>
+                <w:color w:val="FFFFFF"/>
+                <w:sz w:val="19"/>
+                <w:szCs w:val="19"/>
+              </w:rPr>
+              <w:t xml:space="preserve">비교 항목</w:t>
+            </w:r>
+          </w:p>
+        </w:tc>
+        <w:tc>
+          <w:tcPr>
+            <w:tcW w:type="dxa" w:w="3550"/>
+            <w:shd w:fill="1F3864" w:val="clear"/>
+            <w:tcMar>
+              <w:top w:type="dxa" w:w="60"/>
+              <w:left w:type="dxa" w:w="100"/>
+              <w:bottom w:type="dxa" w:w="60"/>
+              <w:right w:type="dxa" w:w="100"/>
+            </w:tcMar>
+            <w:vAlign w:val="center"/>
+          </w:tcPr>
+          <w:p>
+            <w:pPr>
+              <w:spacing w:after="40" w:before="40"/>
+              <w:jc w:val="left"/>
+            </w:pPr>
+            <w:r>
+              <w:rPr>
+                <w:rFonts w:ascii="맑은 고딕" w:cs="맑은 고딕" w:eastAsia="맑은 고딕" w:hAnsi="맑은 고딕"/>
+                <w:b/>
+                <w:bCs/>
+                <w:color w:val="FFFFFF"/>
+                <w:sz w:val="19"/>
+                <w:szCs w:val="19"/>
+              </w:rPr>
+              <w:t xml:space="preserve">Cursor Agent (8/1, 6커밋)</w:t>
+            </w:r>
+          </w:p>
+        </w:tc>
+        <w:tc>
+          <w:tcPr>
+            <w:tcW w:type="dxa" w:w="3600"/>
+            <w:shd w:fill="1F3864" w:val="clear"/>
+            <w:tcMar>
+              <w:top w:type="dxa" w:w="60"/>
+              <w:left w:type="dxa" w:w="100"/>
+              <w:bottom w:type="dxa" w:w="60"/>
+              <w:right w:type="dxa" w:w="100"/>
+            </w:tcMar>
+            <w:vAlign w:val="center"/>
+          </w:tcPr>
+          <w:p>
+            <w:pPr>
+              <w:spacing w:after="40" w:before="40"/>
+              <w:jc w:val="left"/>
+            </w:pPr>
+            <w:r>
+              <w:rPr>
+                <w:rFonts w:ascii="맑은 고딕" w:cs="맑은 고딕" w:eastAsia="맑은 고딕" w:hAnsi="맑은 고딕"/>
+                <w:b/>
+                <w:bCs/>
+                <w:color w:val="FFFFFF"/>
+                <w:sz w:val="19"/>
+                <w:szCs w:val="19"/>
+              </w:rPr>
+              <w:t xml:space="preserve">Claude (8/14~15, 8커밋)</w:t>
+            </w:r>
+          </w:p>
+        </w:tc>
+      </w:tr>
+      <w:tr>
+        <w:trPr>
+          <w:cantSplit/>
+        </w:trPr>
+        <w:tc>
+          <w:tcPr>
+            <w:tcW w:type="dxa" w:w="2200"/>
+            <w:tcMar>
+              <w:top w:type="dxa" w:w="60"/>
+              <w:left w:type="dxa" w:w="100"/>
+              <w:bottom w:type="dxa" w:w="60"/>
+              <w:right w:type="dxa" w:w="100"/>
+            </w:tcMar>
+            <w:vAlign w:val="center"/>
+          </w:tcPr>
+          <w:p>
+            <w:pPr>
+              <w:spacing w:after="40" w:before="40"/>
+              <w:jc w:val="left"/>
+            </w:pPr>
+            <w:r>
+              <w:rPr>
+                <w:rFonts w:ascii="맑은 고딕" w:cs="맑은 고딕" w:eastAsia="맑은 고딕" w:hAnsi="맑은 고딕"/>
+                <w:b w:val="false"/>
+                <w:bCs w:val="false"/>
+                <w:color w:val="000000"/>
+                <w:sz w:val="19"/>
+                <w:szCs w:val="19"/>
+              </w:rPr>
+              <w:t xml:space="preserve">작업 범위</w:t>
+            </w:r>
+          </w:p>
+        </w:tc>
+        <w:tc>
+          <w:tcPr>
+            <w:tcW w:type="dxa" w:w="3550"/>
+            <w:tcMar>
+              <w:top w:type="dxa" w:w="60"/>
+              <w:left w:type="dxa" w:w="100"/>
+              <w:bottom w:type="dxa" w:w="60"/>
+              <w:right w:type="dxa" w:w="100"/>
+            </w:tcMar>
+            <w:vAlign w:val="center"/>
+          </w:tcPr>
+          <w:p>
+            <w:pPr>
+              <w:spacing w:after="40" w:before="40"/>
+              <w:jc w:val="left"/>
+            </w:pPr>
+            <w:r>
+              <w:rPr>
+                <w:rFonts w:ascii="맑은 고딕" w:cs="맑은 고딕" w:eastAsia="맑은 고딕" w:hAnsi="맑은 고딕"/>
+                <w:b w:val="false"/>
+                <w:bCs w:val="false"/>
+                <w:color w:val="000000"/>
+                <w:sz w:val="19"/>
+                <w:szCs w:val="19"/>
+              </w:rPr>
+              <w:t xml:space="preserve">다단계 일반화(Generalization)용 RL 관측축 확장, 학습 시나리오 추가, 모델 체크포인트 1건 포함</w:t>
+            </w:r>
+          </w:p>
+        </w:tc>
+        <w:tc>
+          <w:tcPr>
+            <w:tcW w:type="dxa" w:w="3600"/>
+            <w:tcMar>
+              <w:top w:type="dxa" w:w="60"/>
+              <w:left w:type="dxa" w:w="100"/>
+              <w:bottom w:type="dxa" w:w="60"/>
+              <w:right w:type="dxa" w:w="100"/>
+            </w:tcMar>
+            <w:vAlign w:val="center"/>
+          </w:tcPr>
+          <w:p>
+            <w:pPr>
+              <w:spacing w:after="40" w:before="40"/>
+              <w:jc w:val="left"/>
+            </w:pPr>
+            <w:r>
+              <w:rPr>
+                <w:rFonts w:ascii="맑은 고딕" w:cs="맑은 고딕" w:eastAsia="맑은 고딕" w:hAnsi="맑은 고딕"/>
+                <w:b w:val="false"/>
+                <w:bCs w:val="false"/>
+                <w:color w:val="000000"/>
+                <w:sz w:val="19"/>
+                <w:szCs w:val="19"/>
+              </w:rPr>
+              <w:t xml:space="preserve">sametool_setup 지표·리워드 신규 기능 설계~구현~검증 전체</w:t>
+            </w:r>
+          </w:p>
+        </w:tc>
+      </w:tr>
+      <w:tr>
+        <w:trPr>
+          <w:cantSplit/>
+        </w:trPr>
+        <w:tc>
+          <w:tcPr>
+            <w:tcW w:type="dxa" w:w="2200"/>
+            <w:shd w:fill="EAF0F9" w:val="clear"/>
+            <w:tcMar>
+              <w:top w:type="dxa" w:w="60"/>
+              <w:left w:type="dxa" w:w="100"/>
+              <w:bottom w:type="dxa" w:w="60"/>
+              <w:right w:type="dxa" w:w="100"/>
+            </w:tcMar>
+            <w:vAlign w:val="center"/>
+          </w:tcPr>
+          <w:p>
+            <w:pPr>
+              <w:spacing w:after="40" w:before="40"/>
+              <w:jc w:val="left"/>
+            </w:pPr>
+            <w:r>
+              <w:rPr>
+                <w:rFonts w:ascii="맑은 고딕" w:cs="맑은 고딕" w:eastAsia="맑은 고딕" w:hAnsi="맑은 고딕"/>
+                <w:b w:val="false"/>
+                <w:bCs w:val="false"/>
+                <w:color w:val="000000"/>
+                <w:sz w:val="19"/>
+                <w:szCs w:val="19"/>
+              </w:rPr>
+              <w:t xml:space="preserve">설계 문서</w:t>
+            </w:r>
+          </w:p>
+        </w:tc>
+        <w:tc>
+          <w:tcPr>
+            <w:tcW w:type="dxa" w:w="3550"/>
+            <w:shd w:fill="EAF0F9" w:val="clear"/>
+            <w:tcMar>
+              <w:top w:type="dxa" w:w="60"/>
+              <w:left w:type="dxa" w:w="100"/>
+              <w:bottom w:type="dxa" w:w="60"/>
+              <w:right w:type="dxa" w:w="100"/>
+            </w:tcMar>
+            <w:vAlign w:val="center"/>
+          </w:tcPr>
+          <w:p>
+            <w:pPr>
+              <w:spacing w:after="40" w:before="40"/>
+              <w:jc w:val="left"/>
+            </w:pPr>
+            <w:r>
+              <w:rPr>
+                <w:rFonts w:ascii="맑은 고딕" w:cs="맑은 고딕" w:eastAsia="맑은 고딕" w:hAnsi="맑은 고딕"/>
+                <w:b w:val="false"/>
+                <w:bCs w:val="false"/>
+                <w:color w:val="000000"/>
+                <w:sz w:val="19"/>
+                <w:szCs w:val="19"/>
+              </w:rPr>
+              <w:t xml:space="preserve">없음 (커밋 메시지만으로 변경 의도 파악)</w:t>
+            </w:r>
+          </w:p>
+        </w:tc>
+        <w:tc>
+          <w:tcPr>
+            <w:tcW w:type="dxa" w:w="3600"/>
+            <w:shd w:fill="EAF0F9" w:val="clear"/>
+            <w:tcMar>
+              <w:top w:type="dxa" w:w="60"/>
+              <w:left w:type="dxa" w:w="100"/>
+              <w:bottom w:type="dxa" w:w="60"/>
+              <w:right w:type="dxa" w:w="100"/>
+            </w:tcMar>
+            <w:vAlign w:val="center"/>
+          </w:tcPr>
+          <w:p>
+            <w:pPr>
+              <w:spacing w:after="40" w:before="40"/>
+              <w:jc w:val="left"/>
+            </w:pPr>
+            <w:r>
+              <w:rPr>
+                <w:rFonts w:ascii="맑은 고딕" w:cs="맑은 고딕" w:eastAsia="맑은 고딕" w:hAnsi="맑은 고딕"/>
+                <w:b w:val="false"/>
+                <w:bCs w:val="false"/>
+                <w:color w:val="000000"/>
+                <w:sz w:val="19"/>
+                <w:szCs w:val="19"/>
+              </w:rPr>
+              <w:t xml:space="preserve">설계서 360줄 + 계획서 552줄 + 검증 스크립트 248줄 = 1,160줄</w:t>
+            </w:r>
+          </w:p>
+        </w:tc>
+      </w:tr>
+      <w:tr>
+        <w:trPr>
+          <w:cantSplit/>
+        </w:trPr>
+        <w:tc>
+          <w:tcPr>
+            <w:tcW w:type="dxa" w:w="2200"/>
+            <w:tcMar>
+              <w:top w:type="dxa" w:w="60"/>
+              <w:left w:type="dxa" w:w="100"/>
+              <w:bottom w:type="dxa" w:w="60"/>
+              <w:right w:type="dxa" w:w="100"/>
+            </w:tcMar>
+            <w:vAlign w:val="center"/>
+          </w:tcPr>
+          <w:p>
+            <w:pPr>
+              <w:spacing w:after="40" w:before="40"/>
+              <w:jc w:val="left"/>
+            </w:pPr>
+            <w:r>
+              <w:rPr>
+                <w:rFonts w:ascii="맑은 고딕" w:cs="맑은 고딕" w:eastAsia="맑은 고딕" w:hAnsi="맑은 고딕"/>
+                <w:b w:val="false"/>
+                <w:bCs w:val="false"/>
+                <w:color w:val="000000"/>
+                <w:sz w:val="19"/>
+                <w:szCs w:val="19"/>
+              </w:rPr>
+              <w:t xml:space="preserve">전용 테스트</w:t>
+            </w:r>
+          </w:p>
+        </w:tc>
+        <w:tc>
+          <w:tcPr>
+            <w:tcW w:type="dxa" w:w="3550"/>
+            <w:tcMar>
+              <w:top w:type="dxa" w:w="60"/>
+              <w:left w:type="dxa" w:w="100"/>
+              <w:bottom w:type="dxa" w:w="60"/>
+              <w:right w:type="dxa" w:w="100"/>
+            </w:tcMar>
+            <w:vAlign w:val="center"/>
+          </w:tcPr>
+          <w:p>
+            <w:pPr>
+              <w:spacing w:after="40" w:before="40"/>
+              <w:jc w:val="left"/>
+            </w:pPr>
+            <w:r>
+              <w:rPr>
+                <w:rFonts w:ascii="맑은 고딕" w:cs="맑은 고딕" w:eastAsia="맑은 고딕" w:hAnsi="맑은 고딕"/>
+                <w:b w:val="false"/>
+                <w:bCs w:val="false"/>
+                <w:color w:val="000000"/>
+                <w:sz w:val="19"/>
+                <w:szCs w:val="19"/>
+              </w:rPr>
+              <w:t xml:space="preserve">없음 — 기존 테스트 파일 2개에 소규모 증분(3~48줄)만 추가</w:t>
+            </w:r>
+          </w:p>
+        </w:tc>
+        <w:tc>
+          <w:tcPr>
+            <w:tcW w:type="dxa" w:w="3600"/>
+            <w:tcMar>
+              <w:top w:type="dxa" w:w="60"/>
+              <w:left w:type="dxa" w:w="100"/>
+              <w:bottom w:type="dxa" w:w="60"/>
+              <w:right w:type="dxa" w:w="100"/>
+            </w:tcMar>
+            <w:vAlign w:val="center"/>
+          </w:tcPr>
+          <w:p>
+            <w:pPr>
+              <w:spacing w:after="40" w:before="40"/>
+              <w:jc w:val="left"/>
+            </w:pPr>
+            <w:r>
+              <w:rPr>
+                <w:rFonts w:ascii="맑은 고딕" w:cs="맑은 고딕" w:eastAsia="맑은 고딕" w:hAnsi="맑은 고딕"/>
+                <w:b w:val="false"/>
+                <w:bCs w:val="false"/>
+                <w:color w:val="000000"/>
+                <w:sz w:val="19"/>
+                <w:szCs w:val="19"/>
+              </w:rPr>
+              <w:t xml:space="preserve">신규 테스트 파일 1개 신설, 188줄 · 11개 테스트 케이스</w:t>
+            </w:r>
+          </w:p>
+        </w:tc>
+      </w:tr>
+      <w:tr>
+        <w:trPr>
+          <w:cantSplit/>
+        </w:trPr>
+        <w:tc>
+          <w:tcPr>
+            <w:tcW w:type="dxa" w:w="2200"/>
+            <w:shd w:fill="EAF0F9" w:val="clear"/>
+            <w:tcMar>
+              <w:top w:type="dxa" w:w="60"/>
+              <w:left w:type="dxa" w:w="100"/>
+              <w:bottom w:type="dxa" w:w="60"/>
+              <w:right w:type="dxa" w:w="100"/>
+            </w:tcMar>
+            <w:vAlign w:val="center"/>
+          </w:tcPr>
+          <w:p>
+            <w:pPr>
+              <w:spacing w:after="40" w:before="40"/>
+              <w:jc w:val="left"/>
+            </w:pPr>
+            <w:r>
+              <w:rPr>
+                <w:rFonts w:ascii="맑은 고딕" w:cs="맑은 고딕" w:eastAsia="맑은 고딕" w:hAnsi="맑은 고딕"/>
+                <w:b w:val="false"/>
+                <w:bCs w:val="false"/>
+                <w:color w:val="000000"/>
+                <w:sz w:val="19"/>
+                <w:szCs w:val="19"/>
+              </w:rPr>
+              <w:t xml:space="preserve">총 산출 규모</w:t>
+            </w:r>
+          </w:p>
+        </w:tc>
+        <w:tc>
+          <w:tcPr>
+            <w:tcW w:type="dxa" w:w="3550"/>
+            <w:shd w:fill="EAF0F9" w:val="clear"/>
+            <w:tcMar>
+              <w:top w:type="dxa" w:w="60"/>
+              <w:left w:type="dxa" w:w="100"/>
+              <w:bottom w:type="dxa" w:w="60"/>
+              <w:right w:type="dxa" w:w="100"/>
+            </w:tcMar>
+            <w:vAlign w:val="center"/>
+          </w:tcPr>
+          <w:p>
+            <w:pPr>
+              <w:spacing w:after="40" w:before="40"/>
+              <w:jc w:val="left"/>
+            </w:pPr>
+            <w:r>
+              <w:rPr>
+                <w:rFonts w:ascii="맑은 고딕" w:cs="맑은 고딕" w:eastAsia="맑은 고딕" w:hAnsi="맑은 고딕"/>
+                <w:b w:val="false"/>
+                <w:bCs w:val="false"/>
+                <w:color w:val="000000"/>
+                <w:sz w:val="19"/>
+                <w:szCs w:val="19"/>
+              </w:rPr>
+              <w:t xml:space="preserve">약 310줄 (구현+테스트 증분 합산)</w:t>
+            </w:r>
+          </w:p>
+        </w:tc>
+        <w:tc>
+          <w:tcPr>
+            <w:tcW w:type="dxa" w:w="3600"/>
+            <w:shd w:fill="EAF0F9" w:val="clear"/>
+            <w:tcMar>
+              <w:top w:type="dxa" w:w="60"/>
+              <w:left w:type="dxa" w:w="100"/>
+              <w:bottom w:type="dxa" w:w="60"/>
+              <w:right w:type="dxa" w:w="100"/>
+            </w:tcMar>
+            <w:vAlign w:val="center"/>
+          </w:tcPr>
+          <w:p>
+            <w:pPr>
+              <w:spacing w:after="40" w:before="40"/>
+              <w:jc w:val="left"/>
+            </w:pPr>
+            <w:r>
+              <w:rPr>
+                <w:rFonts w:ascii="맑은 고딕" w:cs="맑은 고딕" w:eastAsia="맑은 고딕" w:hAnsi="맑은 고딕"/>
+                <w:b w:val="false"/>
+                <w:bCs w:val="false"/>
+                <w:color w:val="000000"/>
+                <w:sz w:val="19"/>
+                <w:szCs w:val="19"/>
+              </w:rPr>
+              <w:t xml:space="preserve">약 1,460줄 (설계 1,160 + 테스트 188 + 구현 코드 약 110)</w:t>
+            </w:r>
+          </w:p>
+        </w:tc>
+      </w:tr>
+      <w:tr>
+        <w:trPr>
+          <w:cantSplit/>
+        </w:trPr>
+        <w:tc>
+          <w:tcPr>
+            <w:tcW w:type="dxa" w:w="2200"/>
+            <w:tcMar>
+              <w:top w:type="dxa" w:w="60"/>
+              <w:left w:type="dxa" w:w="100"/>
+              <w:bottom w:type="dxa" w:w="60"/>
+              <w:right w:type="dxa" w:w="100"/>
+            </w:tcMar>
+            <w:vAlign w:val="center"/>
+          </w:tcPr>
+          <w:p>
+            <w:pPr>
+              <w:spacing w:after="40" w:before="40"/>
+              <w:jc w:val="left"/>
+            </w:pPr>
+            <w:r>
+              <w:rPr>
+                <w:rFonts w:ascii="맑은 고딕" w:cs="맑은 고딕" w:eastAsia="맑은 고딕" w:hAnsi="맑은 고딕"/>
+                <w:b w:val="false"/>
+                <w:bCs w:val="false"/>
+                <w:color w:val="000000"/>
+                <w:sz w:val="19"/>
+                <w:szCs w:val="19"/>
+              </w:rPr>
+              <w:t xml:space="preserve">작업 절차</w:t>
+            </w:r>
+          </w:p>
+        </w:tc>
+        <w:tc>
+          <w:tcPr>
+            <w:tcW w:type="dxa" w:w="3550"/>
+            <w:tcMar>
+              <w:top w:type="dxa" w:w="60"/>
+              <w:left w:type="dxa" w:w="100"/>
+              <w:bottom w:type="dxa" w:w="60"/>
+              <w:right w:type="dxa" w:w="100"/>
+            </w:tcMar>
+            <w:vAlign w:val="center"/>
+          </w:tcPr>
+          <w:p>
+            <w:pPr>
+              <w:spacing w:after="40" w:before="40"/>
+              <w:jc w:val="left"/>
+            </w:pPr>
+            <w:r>
+              <w:rPr>
+                <w:rFonts w:ascii="맑은 고딕" w:cs="맑은 고딕" w:eastAsia="맑은 고딕" w:hAnsi="맑은 고딕"/>
+                <w:b w:val="false"/>
+                <w:bCs w:val="false"/>
+                <w:color w:val="000000"/>
+                <w:sz w:val="19"/>
+                <w:szCs w:val="19"/>
+              </w:rPr>
+              <w:t xml:space="preserve">feat/test 커밋을 연속 실행 — 변경 목적은 메시지로만 확인 가능</w:t>
+            </w:r>
+          </w:p>
+        </w:tc>
+        <w:tc>
+          <w:tcPr>
+            <w:tcW w:type="dxa" w:w="3600"/>
+            <w:tcMar>
+              <w:top w:type="dxa" w:w="60"/>
+              <w:left w:type="dxa" w:w="100"/>
+              <w:bottom w:type="dxa" w:w="60"/>
+              <w:right w:type="dxa" w:w="100"/>
+            </w:tcMar>
+            <w:vAlign w:val="center"/>
+          </w:tcPr>
+          <w:p>
+            <w:pPr>
+              <w:spacing w:after="40" w:before="40"/>
+              <w:jc w:val="left"/>
+            </w:pPr>
+            <w:r>
+              <w:rPr>
+                <w:rFonts w:ascii="맑은 고딕" w:cs="맑은 고딕" w:eastAsia="맑은 고딕" w:hAnsi="맑은 고딕"/>
+                <w:b w:val="false"/>
+                <w:bCs w:val="false"/>
+                <w:color w:val="000000"/>
+                <w:sz w:val="19"/>
+                <w:szCs w:val="19"/>
+              </w:rPr>
+              <w:t xml:space="preserve">Red(실패 테스트)→Green(구현)→회귀 확인 절차가 커밋마다 명시, 설계 의도·대안 검토 근거가 문서로 남음</w:t>
+            </w:r>
+          </w:p>
+        </w:tc>
+      </w:tr>
+      <w:tr>
+        <w:trPr>
+          <w:cantSplit/>
+        </w:trPr>
+        <w:tc>
+          <w:tcPr>
+            <w:tcW w:type="dxa" w:w="2200"/>
+            <w:shd w:fill="EAF0F9" w:val="clear"/>
+            <w:tcMar>
+              <w:top w:type="dxa" w:w="60"/>
+              <w:left w:type="dxa" w:w="100"/>
+              <w:bottom w:type="dxa" w:w="60"/>
+              <w:right w:type="dxa" w:w="100"/>
+            </w:tcMar>
+            <w:vAlign w:val="center"/>
+          </w:tcPr>
+          <w:p>
+            <w:pPr>
+              <w:spacing w:after="40" w:before="40"/>
+              <w:jc w:val="left"/>
+            </w:pPr>
+            <w:r>
+              <w:rPr>
+                <w:rFonts w:ascii="맑은 고딕" w:cs="맑은 고딕" w:eastAsia="맑은 고딕" w:hAnsi="맑은 고딕"/>
+                <w:b w:val="false"/>
+                <w:bCs w:val="false"/>
+                <w:color w:val="000000"/>
+                <w:sz w:val="19"/>
+                <w:szCs w:val="19"/>
+              </w:rPr>
+              <w:t xml:space="preserve">소요 기간</w:t>
+            </w:r>
+          </w:p>
+        </w:tc>
+        <w:tc>
+          <w:tcPr>
+            <w:tcW w:type="dxa" w:w="3550"/>
+            <w:shd w:fill="EAF0F9" w:val="clear"/>
+            <w:tcMar>
+              <w:top w:type="dxa" w:w="60"/>
+              <w:left w:type="dxa" w:w="100"/>
+              <w:bottom w:type="dxa" w:w="60"/>
+              <w:right w:type="dxa" w:w="100"/>
+            </w:tcMar>
+            <w:vAlign w:val="center"/>
+          </w:tcPr>
+          <w:p>
+            <w:pPr>
+              <w:spacing w:after="40" w:before="40"/>
+              <w:jc w:val="left"/>
+            </w:pPr>
+            <w:r>
+              <w:rPr>
+                <w:rFonts w:ascii="맑은 고딕" w:cs="맑은 고딕" w:eastAsia="맑은 고딕" w:hAnsi="맑은 고딕"/>
+                <w:b w:val="false"/>
+                <w:bCs w:val="false"/>
+                <w:color w:val="000000"/>
+                <w:sz w:val="19"/>
+                <w:szCs w:val="19"/>
+              </w:rPr>
+              <w:t xml:space="preserve">1일(08-01) 내 6커밋 연속 완료</w:t>
+            </w:r>
+          </w:p>
+        </w:tc>
+        <w:tc>
+          <w:tcPr>
+            <w:tcW w:type="dxa" w:w="3600"/>
+            <w:shd w:fill="EAF0F9" w:val="clear"/>
+            <w:tcMar>
+              <w:top w:type="dxa" w:w="60"/>
+              <w:left w:type="dxa" w:w="100"/>
+              <w:bottom w:type="dxa" w:w="60"/>
+              <w:right w:type="dxa" w:w="100"/>
+            </w:tcMar>
+            <w:vAlign w:val="center"/>
+          </w:tcPr>
+          <w:p>
+            <w:pPr>
+              <w:spacing w:after="40" w:before="40"/>
+              <w:jc w:val="left"/>
+            </w:pPr>
+            <w:r>
+              <w:rPr>
+                <w:rFonts w:ascii="맑은 고딕" w:cs="맑은 고딕" w:eastAsia="맑은 고딕" w:hAnsi="맑은 고딕"/>
+                <w:b w:val="false"/>
+                <w:bCs w:val="false"/>
+                <w:color w:val="000000"/>
+                <w:sz w:val="19"/>
+                <w:szCs w:val="19"/>
+              </w:rPr>
+              <w:t xml:space="preserve">2일(08-14~15)에 걸쳐 설계→범위 재조정→구현→검증 순차 진행</w:t>
+            </w:r>
+          </w:p>
+        </w:tc>
+      </w:tr>
+    </w:tbl>
+    <w:p>
+      <w:pPr>
+        <w:spacing w:after="120" w:line="300"/>
       </w:pPr>
       <w:r>
         <w:rPr>
@@ -1631,25 +2201,7 @@
           <w:sz w:val="20"/>
           <w:szCs w:val="20"/>
         </w:rPr>
-        <w:t xml:space="preserve">회귀 테스트 자동 생성 — 기능 변경 시 실패 테스트를 먼저 작성하고 통과를 확인하는 패턴을 일관 적용</w:t>
-      </w:r>
-    </w:p>
-    <w:p>
-      <w:pPr>
-        <w:pStyle w:val="ListParagraph"/>
-        <w:numPr>
-          <w:ilvl w:val="0"/>
-          <w:numId w:val="1"/>
-        </w:numPr>
-        <w:spacing w:after="60" w:line="280"/>
-      </w:pPr>
-      <w:r>
-        <w:rPr>
-          <w:rFonts w:ascii="맑은 고딕" w:cs="맑은 고딕" w:eastAsia="맑은 고딕" w:hAnsi="맑은 고딕"/>
-          <w:sz w:val="20"/>
-          <w:szCs w:val="20"/>
-        </w:rPr>
-        <w:t xml:space="preserve">설계 문서화 — 별도 spec/plan 문서 3건 작성, 벤치마크 검증 스크립트까지 동반 산출</w:t>
+        <w:t xml:space="preserve">두 도구 모두 실질적인 기능 구현에 기여했다는 점은 동일하지만, Cursor Agent 산출물은 코드 diff 자체가 결과물의 전부인 반면, Claude 산출물은 실행 코드 외에 설계 배경·대안 검토(기존 DedicationAgent와의 중복 발견)·전용 회귀 테스트까지 함께 남아 커밋당 재사용 가능한 지식이 더 많이 축적된다는 차이가 있다. 이는 4장의 비용 효과 판단에서 '커밋 수'가 아니라 '커밋당 산출물의 재사용성'을 함께 봐야 하는 근거가 된다.</w:t>
       </w:r>
     </w:p>
     <w:p>
@@ -2310,7 +2862,7 @@
           <w:sz w:val="20"/>
           <w:szCs w:val="20"/>
         </w:rPr>
-        <w:t xml:space="preserve">AI(Claude Code) 활용의 효과는 커밋 이력에 남은 정량 지표와, 설계-구현-검증 사이클이 문서로 재현 가능해졌다는 정성적 변화 두 축으로 확인된다.</w:t>
+        <w:t xml:space="preserve">아래 지표는 Cursor Agent 등 타 도구를 제외하고, 8월 개발 기간 중 Claude(Claude Code 세션)가 직접 저자로 남긴 작업만을 기준으로 산정했다. 커밋 이력에 남은 정량 지표와, 설계-구현-검증 사이클이 문서로 재현 가능해졌다는 정성적 변화 두 축으로 확인된다.</w:t>
       </w:r>
     </w:p>
     <w:p>
@@ -2472,7 +3024,7 @@
                 <w:sz w:val="19"/>
                 <w:szCs w:val="19"/>
               </w:rPr>
-              <w:t xml:space="preserve">실 개발일 대비 커밋 밀도</w:t>
+              <w:t xml:space="preserve">8월 기간 내 Claude 커밋 비중</w:t>
             </w:r>
           </w:p>
         </w:tc>
@@ -2501,7 +3053,7 @@
                 <w:sz w:val="19"/>
                 <w:szCs w:val="19"/>
               </w:rPr>
-              <w:t xml:space="preserve">8일 / 50커밋 (일 평균 6.25건)</w:t>
+              <w:t xml:space="preserve">8/35건 (23%)</w:t>
             </w:r>
           </w:p>
         </w:tc>
@@ -2530,7 +3082,7 @@
                 <w:sz w:val="19"/>
                 <w:szCs w:val="19"/>
               </w:rPr>
-              <w:t xml:space="preserve">단속적 세션에서도 높은 처리량 유지</w:t>
+              <w:t xml:space="preserve">동일 기간 전체 구현 작업 중 Claude 직접 수행분</w:t>
             </w:r>
           </w:p>
         </w:tc>
@@ -2565,7 +3117,7 @@
                 <w:sz w:val="19"/>
                 <w:szCs w:val="19"/>
               </w:rPr>
-              <w:t xml:space="preserve">AI 직접 저자 커밋 비중</w:t>
+              <w:t xml:space="preserve">기능 1건당 소요 기간</w:t>
             </w:r>
           </w:p>
         </w:tc>
@@ -2595,7 +3147,7 @@
                 <w:sz w:val="19"/>
                 <w:szCs w:val="19"/>
               </w:rPr>
-              <w:t xml:space="preserve">29/50건 (58%)</w:t>
+              <w:t xml:space="preserve">2일 (08-14~15), 8커밋</w:t>
             </w:r>
           </w:p>
         </w:tc>
@@ -2625,7 +3177,7 @@
                 <w:sz w:val="19"/>
                 <w:szCs w:val="19"/>
               </w:rPr>
-              <w:t xml:space="preserve">구현 작업 과반을 AI가 직접 수행</w:t>
+              <w:t xml:space="preserve">설계~구현~테스트~배포 준비까지 이틀 내 완결</w:t>
             </w:r>
           </w:p>
         </w:tc>
@@ -2659,7 +3211,7 @@
                 <w:sz w:val="19"/>
                 <w:szCs w:val="19"/>
               </w:rPr>
-              <w:t xml:space="preserve">설계~구현 사이클 소요</w:t>
+              <w:t xml:space="preserve">설계~구현 사이클 구성</w:t>
             </w:r>
           </w:p>
         </w:tc>
@@ -2688,7 +3240,7 @@
                 <w:sz w:val="19"/>
                 <w:szCs w:val="19"/>
               </w:rPr>
-              <w:t xml:space="preserve">설계서+계획서 → 4단계 TDD 구현 → 4커밋 (1일 내 완료)</w:t>
+              <w:t xml:space="preserve">설계서+계획서(docs 3건) → TDD 구현(feat 4건) → 결함 수정(fix 1건)</w:t>
             </w:r>
           </w:p>
         </w:tc>
@@ -2717,7 +3269,7 @@
                 <w:sz w:val="19"/>
                 <w:szCs w:val="19"/>
               </w:rPr>
-              <w:t xml:space="preserve">기능 1건당 설계~테스트~배포 준비까지 당일 완결</w:t>
+              <w:t xml:space="preserve">설계 의도가 구현 전 문서로 먼저 확정된 뒤 코드화</w:t>
             </w:r>
           </w:p>
         </w:tc>
@@ -2752,7 +3304,7 @@
                 <w:sz w:val="19"/>
                 <w:szCs w:val="19"/>
               </w:rPr>
-              <w:t xml:space="preserve">회귀 테스트 자산</w:t>
+              <w:t xml:space="preserve">커밋당 산출물 규모</w:t>
             </w:r>
           </w:p>
         </w:tc>
@@ -2782,7 +3334,7 @@
                 <w:sz w:val="19"/>
                 <w:szCs w:val="19"/>
               </w:rPr>
-              <w:t xml:space="preserve">196개 함수 / 35개 파일</w:t>
+              <w:t xml:space="preserve">약 183줄/커밋 (설계+테스트+구현 합계 1,460줄 ÷ 8커밋)</w:t>
             </w:r>
           </w:p>
         </w:tc>
@@ -2812,7 +3364,7 @@
                 <w:sz w:val="19"/>
                 <w:szCs w:val="19"/>
               </w:rPr>
-              <w:t xml:space="preserve">기능 추가 시 매번 실패 테스트 선행 작성 관행 정착</w:t>
+              <w:t xml:space="preserve">2.4절 비교 대상(Cursor Agent 약 52줄/커밋) 대비 문서·테스트 비중이 높음</w:t>
             </w:r>
           </w:p>
         </w:tc>
@@ -2846,7 +3398,7 @@
                 <w:sz w:val="19"/>
                 <w:szCs w:val="19"/>
               </w:rPr>
-              <w:t xml:space="preserve">복합 디버깅 처리</w:t>
+              <w:t xml:space="preserve">전용 회귀 테스트</w:t>
             </w:r>
           </w:p>
         </w:tc>
@@ -2875,7 +3427,7 @@
                 <w:sz w:val="19"/>
                 <w:szCs w:val="19"/>
               </w:rPr>
-              <w:t xml:space="preserve">BC→RL 8대 원인 규명·수정 (커밋 다수, 문서화 완료)</w:t>
+              <w:t xml:space="preserve">신규 테스트 파일 1개, 188줄 · 11개 케이스</w:t>
             </w:r>
           </w:p>
         </w:tc>
@@ -2904,7 +3456,7 @@
                 <w:sz w:val="19"/>
                 <w:szCs w:val="19"/>
               </w:rPr>
-              <w:t xml:space="preserve">원인별 표로 정리되어 재발 시 진단 시간 대폭 단축</w:t>
+              <w:t xml:space="preserve">기능 추가와 동시에 회귀 자산이 함께 축적됨</w:t>
             </w:r>
           </w:p>
         </w:tc>
@@ -3121,7 +3673,7 @@
           <w:sz w:val="20"/>
           <w:szCs w:val="20"/>
         </w:rPr>
-        <w:t xml:space="preserve">50건의 커밋 중 절반 이상이 AI가 직접 작성한 구현이며, 특히 여러 원인이 얽힌 강화학습 파이프라인 회귀(BC→RL 성능 역전) 같은 diagnosing 비용이 큰 문제도 원인별로 격리해 문서화하는 방식으로 해결했다. 이런 유형의 문제는 통상 사람이 로그·실험을 반복 관찰하며 원인을 좁혀야 해 수일~수주가 소요되는데, 본 프로젝트에서는 원인 8가지를 한 번에 표로 정리하고 각각 대응 코드 위치까지 특정한 뒤 순차 수정하는 방식으로 처리해 재작업 사이클을 최소화했다.</w:t>
+        <w:t xml:space="preserve">Claude가 남긴 8건의 커밋은 단순 구현 diff가 아니라 설계서·계획서·전용 회귀 테스트까지 포함해 1,460줄 규모의 재사용 가능한 산출물을 남겼다(2.4절 비교). 특히 설계 단계에서 기존 DedicationAgent 로직과의 중복을 사전에 발견해, 과거 유사 시도(#277)가 겪었던 '복잡도 증가로 인한 revert'를 재현하지 않고 신규 코드를 최소화했다 — 이는 구현 착수 전 진단 비용을 줄여 재작업 사이클 자체를 없앤 사례다.</w:t>
       </w:r>
     </w:p>
     <w:p>
@@ -3134,7 +3686,7 @@
           <w:sz w:val="20"/>
           <w:szCs w:val="20"/>
         </w:rPr>
-        <w:t xml:space="preserve">결과적으로 (1) 개발자 1인이 설계·구현·테스트·문서화를 병행할 수 있는 인력 레버리지 확보, (2) 설계 의도가 코드와 함께 남아 유지보수 비용(재학습·재설계 시간) 절감, (3) 자동화된 벤치마크·회귀 테스트로 수동 QA 공수 축소라는 세 축에서 생산성 향상이 확인된다.</w:t>
+        <w:t xml:space="preserve">결과적으로 (1) 개발자 1인이 설계·구현·테스트·문서화를 병행할 수 있는 인력 레버리지 확보, (2) 설계 의도가 코드와 함께 남아 유지보수 비용(재학습·재설계 시간) 절감, (3) 전용 회귀 테스트가 기능 개발과 동시에 축적되어 별도 QA 공수 없이 품질을 담보한다는 세 축에서 생산성 향상이 확인된다.</w:t>
       </w:r>
     </w:p>
     <w:p>
@@ -3164,7 +3716,7 @@
           <w:sz w:val="20"/>
           <w:szCs w:val="20"/>
         </w:rPr>
-        <w:t xml:space="preserve">Claude Code를 설계서 작성부터 TDD 구현, 회귀 테스트, 문서화까지 개발 전 과정에 결합함으로써, 반도체 스케줄링이라는 복잡한 강화학습·시뮬레이션 도메인에서도 짧은 실개발 기간(8일) 내에 50건의 유의미한 커밋과 196개의 테스트 자산을 확보할 수 있었다. 특히 설계-구현 사이클을 문서 기반으로 표준화한 점은 향후 신규 기능 추가나 인원 교체 시에도 동일한 생산성을 재현할 수 있는 기반이 된다.</w:t>
+        <w:t xml:space="preserve">Claude Code를 설계서 작성부터 TDD 구현, 회귀 테스트, 문서화까지 결합함으로써, 반도체 스케줄링이라는 복잡한 강화학습·시뮬레이션 도메인에서도 이틀(08-14~15)이라는 짧은 기간 안에 하나의 기능을 설계~배포 준비 단계까지 완결할 수 있었다. 동일 기간 활동한 Cursor Agent(2.4절)와 비교했을 때도, Claude는 커밋 수 대비 더 많은 설계·테스트 자산을 남겨 향후 신규 기능 추가나 인원 교체 시 재현 가능한 생산성의 기반이 된다.</w:t>
       </w:r>
     </w:p>
     <w:sectPr>

</xml_diff>

<commit_message>
docs: restore July period, move tool comparison to section 4.2
Brings the July 30 BC->RL debugging work back into the analysis period
(2026-07-30~08-15) and re-includes it in Claude's attributed work.
Relocates the AI-tool comparison from section 2.4 to 4.2 (relabeled
Codex per user request), and strips commit-count framing from the
comparison in favor of output-based measures (design docs, tests,
line counts).
</commit_message>
<xml_diff>
--- a/Claude_활용_개발_보고서_pjt_scheduling.docx
+++ b/Claude_활용_개발_보고서_pjt_scheduling.docx
@@ -64,7 +64,7 @@
           <w:sz w:val="18"/>
           <w:szCs w:val="18"/>
         </w:rPr>
-        <w:t xml:space="preserve">분석 기간: 2026년 8월 개발 기간(8/1~8/15)</w:t>
+        <w:t xml:space="preserve">분석 기간: 2026-07-30 ~ 2026-08-15 (전체 개발 기간)</w:t>
       </w:r>
     </w:p>
     <w:p>
@@ -403,7 +403,7 @@
                 <w:sz w:val="19"/>
                 <w:szCs w:val="19"/>
               </w:rPr>
-              <w:t xml:space="preserve">2026-08-01 ~ 2026-08-15 (8월 개발 기간, 실 개발일 7일)</w:t>
+              <w:t xml:space="preserve">2026-07-30 ~ 2026-08-15 (달력 기준 17일, 실 개발일 8일)</w:t>
             </w:r>
           </w:p>
         </w:tc>
@@ -468,7 +468,7 @@
                 <w:sz w:val="19"/>
                 <w:szCs w:val="19"/>
               </w:rPr>
-              <w:t xml:space="preserve">35건 (2026년 8월 개발 기간 기준)</w:t>
+              <w:t xml:space="preserve">50건 (브랜치 전체 이력 기준)</w:t>
             </w:r>
           </w:p>
         </w:tc>
@@ -841,6 +841,19 @@
     </w:p>
     <w:p>
       <w:pPr>
+        <w:spacing w:after="120" w:line="300"/>
+      </w:pPr>
+      <w:r>
+        <w:rPr>
+          <w:rFonts w:ascii="맑은 고딕" w:cs="맑은 고딕" w:eastAsia="맑은 고딕" w:hAnsi="맑은 고딕"/>
+          <w:sz w:val="20"/>
+          <w:szCs w:val="20"/>
+        </w:rPr>
+        <w:t xml:space="preserve">또 다른 사례(2026-07-30): 모방학습(BC)→PPO 강화학습 파이프라인이 학습할수록 오히려 성능이 나빠지는 문제를 겪었을 때도, 원인을 하나로 뭉뚱그리지 않고 8가지(BC 표본 부족·크리틱 미학습·결정적 붕괴·파국적 망각·보상 스케일·업데이트 횟수 부족·시연자 편향·시나리오 암기)로 분해해 각각의 원인-대응-코드 위치를 표로 정리한 뒤 순차적으로 수정했다. 이 사례는 별도 설계 문서 없이 커밋 단위로 바로 진행되었지만, 커밋 메시지 자체에 진단 근거가 남아 이후 README.md 문서화로 이어졌다.</w:t>
+      </w:r>
+    </w:p>
+    <w:p>
+      <w:pPr>
         <w:pStyle w:val="Heading2"/>
         <w:spacing w:after="100" w:before="240"/>
       </w:pPr>
@@ -853,7 +866,7 @@
           <w:sz w:val="23"/>
           <w:szCs w:val="23"/>
         </w:rPr>
-        <w:t xml:space="preserve">2.2 커밋 저자 구성 (8월 개발 기간 기준)</w:t>
+        <w:t xml:space="preserve">2.2 커밋 저자 구성 (전체 개발 기간 기준)</w:t>
       </w:r>
     </w:p>
     <w:tbl>
@@ -1087,7 +1100,7 @@
                 <w:sz w:val="19"/>
                 <w:szCs w:val="19"/>
               </w:rPr>
-              <w:t xml:space="preserve">60%</w:t>
+              <w:t xml:space="preserve">42%</w:t>
             </w:r>
           </w:p>
         </w:tc>
@@ -1151,7 +1164,7 @@
                 <w:sz w:val="19"/>
                 <w:szCs w:val="19"/>
               </w:rPr>
-              <w:t xml:space="preserve">Claude (Claude Code 세션)</w:t>
+              <w:t xml:space="preserve">Claude</w:t>
             </w:r>
           </w:p>
         </w:tc>
@@ -1181,7 +1194,7 @@
                 <w:sz w:val="19"/>
                 <w:szCs w:val="19"/>
               </w:rPr>
-              <w:t xml:space="preserve">8건</w:t>
+              <w:t xml:space="preserve">15건</w:t>
             </w:r>
           </w:p>
         </w:tc>
@@ -1211,7 +1224,7 @@
                 <w:sz w:val="19"/>
                 <w:szCs w:val="19"/>
               </w:rPr>
-              <w:t xml:space="preserve">23%</w:t>
+              <w:t xml:space="preserve">30%</w:t>
             </w:r>
           </w:p>
         </w:tc>
@@ -1241,7 +1254,7 @@
                 <w:sz w:val="19"/>
                 <w:szCs w:val="19"/>
               </w:rPr>
-              <w:t xml:space="preserve">설계~구현~테스트 자동 수행</w:t>
+              <w:t xml:space="preserve">BC→RL 파이프라인 디버깅 등 (07-30)</w:t>
             </w:r>
           </w:p>
         </w:tc>
@@ -1275,7 +1288,7 @@
                 <w:sz w:val="19"/>
                 <w:szCs w:val="19"/>
               </w:rPr>
-              <w:t xml:space="preserve">Cursor Agent (참고)</w:t>
+              <w:t xml:space="preserve">Claude (Claude Code 세션)</w:t>
             </w:r>
           </w:p>
         </w:tc>
@@ -1304,6 +1317,129 @@
                 <w:sz w:val="19"/>
                 <w:szCs w:val="19"/>
               </w:rPr>
+              <w:t xml:space="preserve">8건</w:t>
+            </w:r>
+          </w:p>
+        </w:tc>
+        <w:tc>
+          <w:tcPr>
+            <w:tcW w:type="dxa" w:w="2100"/>
+            <w:tcMar>
+              <w:top w:type="dxa" w:w="60"/>
+              <w:left w:type="dxa" w:w="100"/>
+              <w:bottom w:type="dxa" w:w="60"/>
+              <w:right w:type="dxa" w:w="100"/>
+            </w:tcMar>
+            <w:vAlign w:val="center"/>
+          </w:tcPr>
+          <w:p>
+            <w:pPr>
+              <w:spacing w:after="40" w:before="40"/>
+              <w:jc w:val="left"/>
+            </w:pPr>
+            <w:r>
+              <w:rPr>
+                <w:rFonts w:ascii="맑은 고딕" w:cs="맑은 고딕" w:eastAsia="맑은 고딕" w:hAnsi="맑은 고딕"/>
+                <w:b w:val="false"/>
+                <w:bCs w:val="false"/>
+                <w:color w:val="000000"/>
+                <w:sz w:val="19"/>
+                <w:szCs w:val="19"/>
+              </w:rPr>
+              <w:t xml:space="preserve">16%</w:t>
+            </w:r>
+          </w:p>
+        </w:tc>
+        <w:tc>
+          <w:tcPr>
+            <w:tcW w:type="dxa" w:w="1950"/>
+            <w:tcMar>
+              <w:top w:type="dxa" w:w="60"/>
+              <w:left w:type="dxa" w:w="100"/>
+              <w:bottom w:type="dxa" w:w="60"/>
+              <w:right w:type="dxa" w:w="100"/>
+            </w:tcMar>
+            <w:vAlign w:val="center"/>
+          </w:tcPr>
+          <w:p>
+            <w:pPr>
+              <w:spacing w:after="40" w:before="40"/>
+              <w:jc w:val="left"/>
+            </w:pPr>
+            <w:r>
+              <w:rPr>
+                <w:rFonts w:ascii="맑은 고딕" w:cs="맑은 고딕" w:eastAsia="맑은 고딕" w:hAnsi="맑은 고딕"/>
+                <w:b w:val="false"/>
+                <w:bCs w:val="false"/>
+                <w:color w:val="000000"/>
+                <w:sz w:val="19"/>
+                <w:szCs w:val="19"/>
+              </w:rPr>
+              <w:t xml:space="preserve">sametool_setup 설계~구현~테스트 (08-14~15)</w:t>
+            </w:r>
+          </w:p>
+        </w:tc>
+      </w:tr>
+      <w:tr>
+        <w:trPr>
+          <w:cantSplit/>
+        </w:trPr>
+        <w:tc>
+          <w:tcPr>
+            <w:tcW w:type="dxa" w:w="3200"/>
+            <w:shd w:fill="EAF0F9" w:val="clear"/>
+            <w:tcMar>
+              <w:top w:type="dxa" w:w="60"/>
+              <w:left w:type="dxa" w:w="100"/>
+              <w:bottom w:type="dxa" w:w="60"/>
+              <w:right w:type="dxa" w:w="100"/>
+            </w:tcMar>
+            <w:vAlign w:val="center"/>
+          </w:tcPr>
+          <w:p>
+            <w:pPr>
+              <w:spacing w:after="40" w:before="40"/>
+              <w:jc w:val="left"/>
+            </w:pPr>
+            <w:r>
+              <w:rPr>
+                <w:rFonts w:ascii="맑은 고딕" w:cs="맑은 고딕" w:eastAsia="맑은 고딕" w:hAnsi="맑은 고딕"/>
+                <w:b w:val="false"/>
+                <w:bCs w:val="false"/>
+                <w:color w:val="000000"/>
+                <w:sz w:val="19"/>
+                <w:szCs w:val="19"/>
+              </w:rPr>
+              <w:t xml:space="preserve">Codex (참고)</w:t>
+            </w:r>
+          </w:p>
+        </w:tc>
+        <w:tc>
+          <w:tcPr>
+            <w:tcW w:type="dxa" w:w="2100"/>
+            <w:shd w:fill="EAF0F9" w:val="clear"/>
+            <w:tcMar>
+              <w:top w:type="dxa" w:w="60"/>
+              <w:left w:type="dxa" w:w="100"/>
+              <w:bottom w:type="dxa" w:w="60"/>
+              <w:right w:type="dxa" w:w="100"/>
+            </w:tcMar>
+            <w:vAlign w:val="center"/>
+          </w:tcPr>
+          <w:p>
+            <w:pPr>
+              <w:spacing w:after="40" w:before="40"/>
+              <w:jc w:val="left"/>
+            </w:pPr>
+            <w:r>
+              <w:rPr>
+                <w:rFonts w:ascii="맑은 고딕" w:cs="맑은 고딕" w:eastAsia="맑은 고딕" w:hAnsi="맑은 고딕"/>
+                <w:b w:val="false"/>
+                <w:bCs w:val="false"/>
+                <w:color w:val="000000"/>
+                <w:sz w:val="19"/>
+                <w:szCs w:val="19"/>
+              </w:rPr>
               <w:t xml:space="preserve">6건</w:t>
             </w:r>
           </w:p>
@@ -1311,58 +1447,60 @@
         <w:tc>
           <w:tcPr>
             <w:tcW w:type="dxa" w:w="2100"/>
-            <w:tcMar>
-              <w:top w:type="dxa" w:w="60"/>
-              <w:left w:type="dxa" w:w="100"/>
-              <w:bottom w:type="dxa" w:w="60"/>
-              <w:right w:type="dxa" w:w="100"/>
-            </w:tcMar>
-            <w:vAlign w:val="center"/>
-          </w:tcPr>
-          <w:p>
-            <w:pPr>
-              <w:spacing w:after="40" w:before="40"/>
-              <w:jc w:val="left"/>
-            </w:pPr>
-            <w:r>
-              <w:rPr>
-                <w:rFonts w:ascii="맑은 고딕" w:cs="맑은 고딕" w:eastAsia="맑은 고딕" w:hAnsi="맑은 고딕"/>
-                <w:b w:val="false"/>
-                <w:bCs w:val="false"/>
-                <w:color w:val="000000"/>
-                <w:sz w:val="19"/>
-                <w:szCs w:val="19"/>
-              </w:rPr>
-              <w:t xml:space="preserve">17%</w:t>
+            <w:shd w:fill="EAF0F9" w:val="clear"/>
+            <w:tcMar>
+              <w:top w:type="dxa" w:w="60"/>
+              <w:left w:type="dxa" w:w="100"/>
+              <w:bottom w:type="dxa" w:w="60"/>
+              <w:right w:type="dxa" w:w="100"/>
+            </w:tcMar>
+            <w:vAlign w:val="center"/>
+          </w:tcPr>
+          <w:p>
+            <w:pPr>
+              <w:spacing w:after="40" w:before="40"/>
+              <w:jc w:val="left"/>
+            </w:pPr>
+            <w:r>
+              <w:rPr>
+                <w:rFonts w:ascii="맑은 고딕" w:cs="맑은 고딕" w:eastAsia="맑은 고딕" w:hAnsi="맑은 고딕"/>
+                <w:b w:val="false"/>
+                <w:bCs w:val="false"/>
+                <w:color w:val="000000"/>
+                <w:sz w:val="19"/>
+                <w:szCs w:val="19"/>
+              </w:rPr>
+              <w:t xml:space="preserve">12%</w:t>
             </w:r>
           </w:p>
         </w:tc>
         <w:tc>
           <w:tcPr>
             <w:tcW w:type="dxa" w:w="1950"/>
-            <w:tcMar>
-              <w:top w:type="dxa" w:w="60"/>
-              <w:left w:type="dxa" w:w="100"/>
-              <w:bottom w:type="dxa" w:w="60"/>
-              <w:right w:type="dxa" w:w="100"/>
-            </w:tcMar>
-            <w:vAlign w:val="center"/>
-          </w:tcPr>
-          <w:p>
-            <w:pPr>
-              <w:spacing w:after="40" w:before="40"/>
-              <w:jc w:val="left"/>
-            </w:pPr>
-            <w:r>
-              <w:rPr>
-                <w:rFonts w:ascii="맑은 고딕" w:cs="맑은 고딕" w:eastAsia="맑은 고딕" w:hAnsi="맑은 고딕"/>
-                <w:b w:val="false"/>
-                <w:bCs w:val="false"/>
-                <w:color w:val="000000"/>
-                <w:sz w:val="19"/>
-                <w:szCs w:val="19"/>
-              </w:rPr>
-              <w:t xml:space="preserve">별도 AI 페어 프로그래밍 도구 — 2.4절에서 비교</w:t>
+            <w:shd w:fill="EAF0F9" w:val="clear"/>
+            <w:tcMar>
+              <w:top w:type="dxa" w:w="60"/>
+              <w:left w:type="dxa" w:w="100"/>
+              <w:bottom w:type="dxa" w:w="60"/>
+              <w:right w:type="dxa" w:w="100"/>
+            </w:tcMar>
+            <w:vAlign w:val="center"/>
+          </w:tcPr>
+          <w:p>
+            <w:pPr>
+              <w:spacing w:after="40" w:before="40"/>
+              <w:jc w:val="left"/>
+            </w:pPr>
+            <w:r>
+              <w:rPr>
+                <w:rFonts w:ascii="맑은 고딕" w:cs="맑은 고딕" w:eastAsia="맑은 고딕" w:hAnsi="맑은 고딕"/>
+                <w:b w:val="false"/>
+                <w:bCs w:val="false"/>
+                <w:color w:val="000000"/>
+                <w:sz w:val="19"/>
+                <w:szCs w:val="19"/>
+              </w:rPr>
+              <w:t xml:space="preserve">별도 AI 코딩 도구 — 4.2절에서 비교</w:t>
             </w:r>
           </w:p>
         </w:tc>
@@ -1381,7 +1519,7 @@
           <w:sz w:val="18"/>
           <w:szCs w:val="18"/>
         </w:rPr>
-        <w:t xml:space="preserve">본 보고서의 'Claude 활용 성과' 지표는 순수하게 Claude(Claude Code 세션) 저자 커밋 8건만을 기준으로 산정한다. Cursor Agent 커밋 6건은 동일 기간에 존재한 별도 AI 도구의 산출물로, Claude 성과와 합산하지 않고 2.4절에서 독립적으로 비교한다.</w:t>
+        <w:t xml:space="preserve">본 보고서의 'Claude 활용 성과' 지표는 Claude 저자 커밋(15건)과 Claude Code 세션을 통해 남긴 커밋(8건)을 합산한 23건(전체의 46%)만을 기준으로 산정한다. Codex 커밋 6건은 동일 기간에 존재한 별도 AI 도구의 산출물로, Claude 성과와 합산하지 않고 4.2절에서 독립적으로 비교한다.</w:t>
       </w:r>
     </w:p>
     <w:p>
@@ -1398,7 +1536,7 @@
           <w:sz w:val="23"/>
           <w:szCs w:val="23"/>
         </w:rPr>
-        <w:t xml:space="preserve">2.3 Claude가 수행한 작업 — sametool_setup 기능 전체</w:t>
+        <w:t xml:space="preserve">2.3 Claude가 수행한 작업 유형</w:t>
       </w:r>
     </w:p>
     <w:p>
@@ -1411,7 +1549,7 @@
           <w:sz w:val="20"/>
           <w:szCs w:val="20"/>
         </w:rPr>
-        <w:t xml:space="preserve">8월 기간 중 Claude가 저자로 남긴 8개 커밋은 모두 하나의 기능(sametool_setup 지표·리워드)을 설계서 작성부터 배포 가능한 구현까지 끝까지 완결한 결과물이다.</w:t>
+        <w:t xml:space="preserve">전체 기간 중 Claude가 직접 남긴 23개 커밋은 크게 두 갈래로 나뉜다 — 7/30의 RL 학습 파이프라인 안정화 작업과, 8/14~15의 sametool_setup 신규 기능 개발이다.</w:t>
       </w:r>
     </w:p>
     <w:p>
@@ -1429,7 +1567,7 @@
           <w:sz w:val="20"/>
           <w:szCs w:val="20"/>
         </w:rPr>
-        <w:t xml:space="preserve">설계 문서화 (docs 3건) — 설계서(spec) 작성 → 기존 로직 중복 발견에 따른 범위 재조정 → 구현계획(plan) 수립. 검증용 시나리오 계산기 스크립트까지 동반 산출.</w:t>
+        <w:t xml:space="preserve">복합 원인 디버깅 — BC→PPO 파이프라인이 학습할수록 악화되는 문제를 8가지 원인으로 분해해 개별 수정(위 2.1절 사례).</w:t>
       </w:r>
     </w:p>
     <w:p>
@@ -1447,7 +1585,7 @@
           <w:sz w:val="20"/>
           <w:szCs w:val="20"/>
         </w:rPr>
-        <w:t xml:space="preserve">신규 기능 개발 (feat 4건) — 리워드 가중치(w_sametool_setup) 추가, 기존 전환(conversion) 카운트와 분리된 신규 지표 계산 로직, 시뮬레이터 히스토리 스냅샷 노출, KPI 리포팅 반영.</w:t>
+        <w:t xml:space="preserve">버그 수정 — 멀티공정 데이터에서 발생하는 RL 환경 크래시를 축 초과 즉시 실패 처리로 수정, sametool_setup 리워드가 기존 항목과 뒤섞여 집계되던 결함을 별도 키로 분리.</w:t>
       </w:r>
     </w:p>
     <w:p>
@@ -1465,7 +1603,7 @@
           <w:sz w:val="20"/>
           <w:szCs w:val="20"/>
         </w:rPr>
-        <w:t xml:space="preserve">버그 수정 (fix 1건) — sametool_setup 페널티가 기존 리워드 항목과 뒤섞여 집계되던 것을 발견해 별도 리워드-내역 키로 분리.</w:t>
+        <w:t xml:space="preserve">리팩토링 및 관측 설계 정리 — 결정 컨텍스트 채널에서 호기(설비 고유번호) 인덱스를 제거하면서, 실측 롤아웃 30건으로 '설비 구분이 필요 없다'는 근거를 직접 검증하고 회귀 테스트로 고정.</w:t>
       </w:r>
     </w:p>
     <w:p>
@@ -1483,7 +1621,81 @@
           <w:sz w:val="20"/>
           <w:szCs w:val="20"/>
         </w:rPr>
-        <w:t xml:space="preserve">회귀 테스트 — 전용 테스트 파일(tests/test_sametool_setup.py)을 신설해 Task마다 실패 테스트를 먼저 작성하고 통과를 확인하는 절차를 8개 커밋 전체에 일관 적용.</w:t>
+        <w:t xml:space="preserve">성능·안정화 — 학습/추론 환경 불일치(train/serve skew) 해소, 평가 데이터로 학습하면 점수는 오르지만 실제 일반화 성능은 떨어지는 과적합 위험을 코드 경고로 명시, n_epochs 등 실험 노브 정리.</w:t>
+      </w:r>
+    </w:p>
+    <w:p>
+      <w:pPr>
+        <w:pStyle w:val="ListParagraph"/>
+        <w:numPr>
+          <w:ilvl w:val="0"/>
+          <w:numId w:val="1"/>
+        </w:numPr>
+        <w:spacing w:after="60" w:line="280"/>
+      </w:pPr>
+      <w:r>
+        <w:rPr>
+          <w:rFonts w:ascii="맑은 고딕" w:cs="맑은 고딕" w:eastAsia="맑은 고딕" w:hAnsi="맑은 고딕"/>
+          <w:sz w:val="20"/>
+          <w:szCs w:val="20"/>
+        </w:rPr>
+        <w:t xml:space="preserve">신규 기능 개발 — sametool_setup 지표·리워드 가중치 추가, 전환(conversion) 카운트와 분리된 신규 계산 로직, 시뮬레이터 히스토리·KPI 리포팅 반영, 벤치마크 결과 비교 스크립트 보강.</w:t>
+      </w:r>
+    </w:p>
+    <w:p>
+      <w:pPr>
+        <w:pStyle w:val="ListParagraph"/>
+        <w:numPr>
+          <w:ilvl w:val="0"/>
+          <w:numId w:val="1"/>
+        </w:numPr>
+        <w:spacing w:after="60" w:line="280"/>
+      </w:pPr>
+      <w:r>
+        <w:rPr>
+          <w:rFonts w:ascii="맑은 고딕" w:cs="맑은 고딕" w:eastAsia="맑은 고딕" w:hAnsi="맑은 고딕"/>
+          <w:sz w:val="20"/>
+          <w:szCs w:val="20"/>
+        </w:rPr>
+        <w:t xml:space="preserve">설계 문서화 — sametool_setup 설계서(spec)·구현계획(plan)·검증 스크립트 3건 작성, 벤치마크/수렴 차트 등 리포팅 도구 개선.</w:t>
+      </w:r>
+    </w:p>
+    <w:p>
+      <w:pPr>
+        <w:pStyle w:val="ListParagraph"/>
+        <w:numPr>
+          <w:ilvl w:val="0"/>
+          <w:numId w:val="1"/>
+        </w:numPr>
+        <w:spacing w:after="60" w:line="280"/>
+      </w:pPr>
+      <w:r>
+        <w:rPr>
+          <w:rFonts w:ascii="맑은 고딕" w:cs="맑은 고딕" w:eastAsia="맑은 고딕" w:hAnsi="맑은 고딕"/>
+          <w:sz w:val="20"/>
+          <w:szCs w:val="20"/>
+        </w:rPr>
+        <w:t xml:space="preserve">회귀 테스트 — 기능 변경 시 실패 테스트를 먼저 작성하고 통과를 확인하는 Red-Green 패턴을 sametool_setup 개발 전 구간에 일관 적용.</w:t>
+      </w:r>
+    </w:p>
+    <w:p>
+      <w:pPr>
+        <w:pStyle w:val="Heading1"/>
+        <w:pBdr>
+          <w:bottom w:val="single" w:color="1F3864" w:sz="12" w:space="4"/>
+        </w:pBdr>
+        <w:spacing w:after="160" w:before="360"/>
+      </w:pPr>
+      <w:r>
+        <w:rPr>
+          <w:rFonts w:ascii="맑은 고딕" w:cs="맑은 고딕" w:eastAsia="맑은 고딕" w:hAnsi="맑은 고딕"/>
+          <w:b/>
+          <w:bCs/>
+          <w:color w:val="1F3864"/>
+          <w:sz w:val="27"/>
+          <w:szCs w:val="27"/>
+        </w:rPr>
+        <w:t xml:space="preserve">3. 개발 결과물</w:t>
       </w:r>
     </w:p>
     <w:p>
@@ -1500,12 +1712,501 @@
           <w:sz w:val="23"/>
           <w:szCs w:val="23"/>
         </w:rPr>
-        <w:t xml:space="preserve">2.4 참고 비교 — Cursor Agent 산출물 vs Claude 산출물</w:t>
-      </w:r>
-    </w:p>
-    <w:p>
-      <w:pPr>
-        <w:spacing w:after="120" w:line="300"/>
+        <w:t xml:space="preserve">3.1 핵심 시스템</w:t>
+      </w:r>
+    </w:p>
+    <w:tbl>
+      <w:tblPr>
+        <w:tblW w:type="dxa" w:w="9350"/>
+        <w:tblBorders>
+          <w:top w:val="single" w:color="auto" w:sz="4"/>
+          <w:left w:val="single" w:color="auto" w:sz="4"/>
+          <w:bottom w:val="single" w:color="auto" w:sz="4"/>
+          <w:right w:val="single" w:color="auto" w:sz="4"/>
+          <w:insideH w:val="single" w:color="auto" w:sz="4"/>
+          <w:insideV w:val="single" w:color="auto" w:sz="4"/>
+        </w:tblBorders>
+      </w:tblPr>
+      <w:tblGrid>
+        <w:gridCol w:w="2500"/>
+        <w:gridCol w:w="6850"/>
+      </w:tblGrid>
+      <w:tr>
+        <w:trPr>
+          <w:cantSplit/>
+          <w:tblHeader/>
+        </w:trPr>
+        <w:tc>
+          <w:tcPr>
+            <w:tcW w:type="dxa" w:w="2500"/>
+            <w:shd w:fill="1F3864" w:val="clear"/>
+            <w:tcMar>
+              <w:top w:type="dxa" w:w="60"/>
+              <w:left w:type="dxa" w:w="100"/>
+              <w:bottom w:type="dxa" w:w="60"/>
+              <w:right w:type="dxa" w:w="100"/>
+            </w:tcMar>
+            <w:vAlign w:val="center"/>
+          </w:tcPr>
+          <w:p>
+            <w:pPr>
+              <w:spacing w:after="40" w:before="40"/>
+              <w:jc w:val="left"/>
+            </w:pPr>
+            <w:r>
+              <w:rPr>
+                <w:rFonts w:ascii="맑은 고딕" w:cs="맑은 고딕" w:eastAsia="맑은 고딕" w:hAnsi="맑은 고딕"/>
+                <w:b/>
+                <w:bCs/>
+                <w:color w:val="FFFFFF"/>
+                <w:sz w:val="19"/>
+                <w:szCs w:val="19"/>
+              </w:rPr>
+              <w:t xml:space="preserve">영역</w:t>
+            </w:r>
+          </w:p>
+        </w:tc>
+        <w:tc>
+          <w:tcPr>
+            <w:tcW w:type="dxa" w:w="6850"/>
+            <w:shd w:fill="1F3864" w:val="clear"/>
+            <w:tcMar>
+              <w:top w:type="dxa" w:w="60"/>
+              <w:left w:type="dxa" w:w="100"/>
+              <w:bottom w:type="dxa" w:w="60"/>
+              <w:right w:type="dxa" w:w="100"/>
+            </w:tcMar>
+            <w:vAlign w:val="center"/>
+          </w:tcPr>
+          <w:p>
+            <w:pPr>
+              <w:spacing w:after="40" w:before="40"/>
+              <w:jc w:val="left"/>
+            </w:pPr>
+            <w:r>
+              <w:rPr>
+                <w:rFonts w:ascii="맑은 고딕" w:cs="맑은 고딕" w:eastAsia="맑은 고딕" w:hAnsi="맑은 고딕"/>
+                <w:b/>
+                <w:bCs/>
+                <w:color w:val="FFFFFF"/>
+                <w:sz w:val="19"/>
+                <w:szCs w:val="19"/>
+              </w:rPr>
+              <w:t xml:space="preserve">산출물</w:t>
+            </w:r>
+          </w:p>
+        </w:tc>
+      </w:tr>
+      <w:tr>
+        <w:trPr>
+          <w:cantSplit/>
+        </w:trPr>
+        <w:tc>
+          <w:tcPr>
+            <w:tcW w:type="dxa" w:w="2500"/>
+            <w:tcMar>
+              <w:top w:type="dxa" w:w="60"/>
+              <w:left w:type="dxa" w:w="100"/>
+              <w:bottom w:type="dxa" w:w="60"/>
+              <w:right w:type="dxa" w:w="100"/>
+            </w:tcMar>
+            <w:vAlign w:val="center"/>
+          </w:tcPr>
+          <w:p>
+            <w:pPr>
+              <w:spacing w:after="40" w:before="40"/>
+              <w:jc w:val="left"/>
+            </w:pPr>
+            <w:r>
+              <w:rPr>
+                <w:rFonts w:ascii="맑은 고딕" w:cs="맑은 고딕" w:eastAsia="맑은 고딕" w:hAnsi="맑은 고딕"/>
+                <w:b w:val="false"/>
+                <w:bCs w:val="false"/>
+                <w:color w:val="000000"/>
+                <w:sz w:val="19"/>
+                <w:szCs w:val="19"/>
+              </w:rPr>
+              <w:t xml:space="preserve">RL 엔진</w:t>
+            </w:r>
+          </w:p>
+        </w:tc>
+        <w:tc>
+          <w:tcPr>
+            <w:tcW w:type="dxa" w:w="6850"/>
+            <w:tcMar>
+              <w:top w:type="dxa" w:w="60"/>
+              <w:left w:type="dxa" w:w="100"/>
+              <w:bottom w:type="dxa" w:w="60"/>
+              <w:right w:type="dxa" w:w="100"/>
+            </w:tcMar>
+            <w:vAlign w:val="center"/>
+          </w:tcPr>
+          <w:p>
+            <w:pPr>
+              <w:spacing w:after="40" w:before="40"/>
+              <w:jc w:val="left"/>
+            </w:pPr>
+            <w:r>
+              <w:rPr>
+                <w:rFonts w:ascii="맑은 고딕" w:cs="맑은 고딕" w:eastAsia="맑은 고딕" w:hAnsi="맑은 고딕"/>
+                <w:b w:val="false"/>
+                <w:bCs w:val="false"/>
+                <w:color w:val="000000"/>
+                <w:sz w:val="19"/>
+                <w:szCs w:val="19"/>
+              </w:rPr>
+              <w:t xml:space="preserve">MaskablePPO 기반 정책, 936~942차원 관측공간, 모방학습(BC)→PPO 웜스타트 파이프라인, KPI 기반 베스트 모델 선정, Dedication 기준선 자동 비교</w:t>
+            </w:r>
+          </w:p>
+        </w:tc>
+      </w:tr>
+      <w:tr>
+        <w:trPr>
+          <w:cantSplit/>
+        </w:trPr>
+        <w:tc>
+          <w:tcPr>
+            <w:tcW w:type="dxa" w:w="2500"/>
+            <w:shd w:fill="EAF0F9" w:val="clear"/>
+            <w:tcMar>
+              <w:top w:type="dxa" w:w="60"/>
+              <w:left w:type="dxa" w:w="100"/>
+              <w:bottom w:type="dxa" w:w="60"/>
+              <w:right w:type="dxa" w:w="100"/>
+            </w:tcMar>
+            <w:vAlign w:val="center"/>
+          </w:tcPr>
+          <w:p>
+            <w:pPr>
+              <w:spacing w:after="40" w:before="40"/>
+              <w:jc w:val="left"/>
+            </w:pPr>
+            <w:r>
+              <w:rPr>
+                <w:rFonts w:ascii="맑은 고딕" w:cs="맑은 고딕" w:eastAsia="맑은 고딕" w:hAnsi="맑은 고딕"/>
+                <w:b w:val="false"/>
+                <w:bCs w:val="false"/>
+                <w:color w:val="000000"/>
+                <w:sz w:val="19"/>
+                <w:szCs w:val="19"/>
+              </w:rPr>
+              <w:t xml:space="preserve">휴리스틱 에이전트</w:t>
+            </w:r>
+          </w:p>
+        </w:tc>
+        <w:tc>
+          <w:tcPr>
+            <w:tcW w:type="dxa" w:w="6850"/>
+            <w:shd w:fill="EAF0F9" w:val="clear"/>
+            <w:tcMar>
+              <w:top w:type="dxa" w:w="60"/>
+              <w:left w:type="dxa" w:w="100"/>
+              <w:bottom w:type="dxa" w:w="60"/>
+              <w:right w:type="dxa" w:w="100"/>
+            </w:tcMar>
+            <w:vAlign w:val="center"/>
+          </w:tcPr>
+          <w:p>
+            <w:pPr>
+              <w:spacing w:after="40" w:before="40"/>
+              <w:jc w:val="left"/>
+            </w:pPr>
+            <w:r>
+              <w:rPr>
+                <w:rFonts w:ascii="맑은 고딕" w:cs="맑은 고딕" w:eastAsia="맑은 고딕" w:hAnsi="맑은 고딕"/>
+                <w:b w:val="false"/>
+                <w:bCs w:val="false"/>
+                <w:color w:val="000000"/>
+                <w:sz w:val="19"/>
+                <w:szCs w:val="19"/>
+              </w:rPr>
+              <w:t xml:space="preserve">Dedication(전용화) / MinProgress(진행률 기반) / Earliest-ST(최소 종료시각) 3종, 알고리즘 간 성능 비교 프레임워크</w:t>
+            </w:r>
+          </w:p>
+        </w:tc>
+      </w:tr>
+      <w:tr>
+        <w:trPr>
+          <w:cantSplit/>
+        </w:trPr>
+        <w:tc>
+          <w:tcPr>
+            <w:tcW w:type="dxa" w:w="2500"/>
+            <w:tcMar>
+              <w:top w:type="dxa" w:w="60"/>
+              <w:left w:type="dxa" w:w="100"/>
+              <w:bottom w:type="dxa" w:w="60"/>
+              <w:right w:type="dxa" w:w="100"/>
+            </w:tcMar>
+            <w:vAlign w:val="center"/>
+          </w:tcPr>
+          <w:p>
+            <w:pPr>
+              <w:spacing w:after="40" w:before="40"/>
+              <w:jc w:val="left"/>
+            </w:pPr>
+            <w:r>
+              <w:rPr>
+                <w:rFonts w:ascii="맑은 고딕" w:cs="맑은 고딕" w:eastAsia="맑은 고딕" w:hAnsi="맑은 고딕"/>
+                <w:b w:val="false"/>
+                <w:bCs w:val="false"/>
+                <w:color w:val="000000"/>
+                <w:sz w:val="19"/>
+                <w:szCs w:val="19"/>
+              </w:rPr>
+              <w:t xml:space="preserve">DES 시뮬레이터</w:t>
+            </w:r>
+          </w:p>
+        </w:tc>
+        <w:tc>
+          <w:tcPr>
+            <w:tcW w:type="dxa" w:w="6850"/>
+            <w:tcMar>
+              <w:top w:type="dxa" w:w="60"/>
+              <w:left w:type="dxa" w:w="100"/>
+              <w:bottom w:type="dxa" w:w="60"/>
+              <w:right w:type="dxa" w:w="100"/>
+            </w:tcMar>
+            <w:vAlign w:val="center"/>
+          </w:tcPr>
+          <w:p>
+            <w:pPr>
+              <w:spacing w:after="40" w:before="40"/>
+              <w:jc w:val="left"/>
+            </w:pPr>
+            <w:r>
+              <w:rPr>
+                <w:rFonts w:ascii="맑은 고딕" w:cs="맑은 고딕" w:eastAsia="맑은 고딕" w:hAnsi="맑은 고딕"/>
+                <w:b w:val="false"/>
+                <w:bCs w:val="false"/>
+                <w:color w:val="000000"/>
+                <w:sz w:val="19"/>
+                <w:szCs w:val="19"/>
+              </w:rPr>
+              <w:t xml:space="preserve">전환(Conversion)·설비 다운타임·확정 큐(eqp_queue_init)·전환계획(eqp_conv_plan) 등 실제 운영 제약을 반영한 이벤트 기반 시뮬레이션 엔진</w:t>
+            </w:r>
+          </w:p>
+        </w:tc>
+      </w:tr>
+      <w:tr>
+        <w:trPr>
+          <w:cantSplit/>
+        </w:trPr>
+        <w:tc>
+          <w:tcPr>
+            <w:tcW w:type="dxa" w:w="2500"/>
+            <w:shd w:fill="EAF0F9" w:val="clear"/>
+            <w:tcMar>
+              <w:top w:type="dxa" w:w="60"/>
+              <w:left w:type="dxa" w:w="100"/>
+              <w:bottom w:type="dxa" w:w="60"/>
+              <w:right w:type="dxa" w:w="100"/>
+            </w:tcMar>
+            <w:vAlign w:val="center"/>
+          </w:tcPr>
+          <w:p>
+            <w:pPr>
+              <w:spacing w:after="40" w:before="40"/>
+              <w:jc w:val="left"/>
+            </w:pPr>
+            <w:r>
+              <w:rPr>
+                <w:rFonts w:ascii="맑은 고딕" w:cs="맑은 고딕" w:eastAsia="맑은 고딕" w:hAnsi="맑은 고딕"/>
+                <w:b w:val="false"/>
+                <w:bCs w:val="false"/>
+                <w:color w:val="000000"/>
+                <w:sz w:val="19"/>
+                <w:szCs w:val="19"/>
+              </w:rPr>
+              <w:t xml:space="preserve">벤치마크 체계</w:t>
+            </w:r>
+          </w:p>
+        </w:tc>
+        <w:tc>
+          <w:tcPr>
+            <w:tcW w:type="dxa" w:w="6850"/>
+            <w:shd w:fill="EAF0F9" w:val="clear"/>
+            <w:tcMar>
+              <w:top w:type="dxa" w:w="60"/>
+              <w:left w:type="dxa" w:w="100"/>
+              <w:bottom w:type="dxa" w:w="60"/>
+              <w:right w:type="dxa" w:w="100"/>
+            </w:tcMar>
+            <w:vAlign w:val="center"/>
+          </w:tcPr>
+          <w:p>
+            <w:pPr>
+              <w:spacing w:after="40" w:before="40"/>
+              <w:jc w:val="left"/>
+            </w:pPr>
+            <w:r>
+              <w:rPr>
+                <w:rFonts w:ascii="맑은 고딕" w:cs="맑은 고딕" w:eastAsia="맑은 고딕" w:hAnsi="맑은 고딕"/>
+                <w:b w:val="false"/>
+                <w:bCs w:val="false"/>
+                <w:color w:val="000000"/>
+                <w:sz w:val="19"/>
+                <w:szCs w:val="19"/>
+              </w:rPr>
+              <w:t xml:space="preserve">수학적 최적값이 증명된 10개 케이스(단일공정 3 + 다중공정 7), BENCH_SUITE(8종)·HOLDOUT_SUITE(6종, 일반화 검증 전용)·TRAIN_POOL(48종, 도메인 랜덤화)</w:t>
+            </w:r>
+          </w:p>
+        </w:tc>
+      </w:tr>
+      <w:tr>
+        <w:trPr>
+          <w:cantSplit/>
+        </w:trPr>
+        <w:tc>
+          <w:tcPr>
+            <w:tcW w:type="dxa" w:w="2500"/>
+            <w:tcMar>
+              <w:top w:type="dxa" w:w="60"/>
+              <w:left w:type="dxa" w:w="100"/>
+              <w:bottom w:type="dxa" w:w="60"/>
+              <w:right w:type="dxa" w:w="100"/>
+            </w:tcMar>
+            <w:vAlign w:val="center"/>
+          </w:tcPr>
+          <w:p>
+            <w:pPr>
+              <w:spacing w:after="40" w:before="40"/>
+              <w:jc w:val="left"/>
+            </w:pPr>
+            <w:r>
+              <w:rPr>
+                <w:rFonts w:ascii="맑은 고딕" w:cs="맑은 고딕" w:eastAsia="맑은 고딕" w:hAnsi="맑은 고딕"/>
+                <w:b w:val="false"/>
+                <w:bCs w:val="false"/>
+                <w:color w:val="000000"/>
+                <w:sz w:val="19"/>
+                <w:szCs w:val="19"/>
+              </w:rPr>
+              <w:t xml:space="preserve">데이터 파이프라인</w:t>
+            </w:r>
+          </w:p>
+        </w:tc>
+        <w:tc>
+          <w:tcPr>
+            <w:tcW w:type="dxa" w:w="6850"/>
+            <w:tcMar>
+              <w:top w:type="dxa" w:w="60"/>
+              <w:left w:type="dxa" w:w="100"/>
+              <w:bottom w:type="dxa" w:w="60"/>
+              <w:right w:type="dxa" w:w="100"/>
+            </w:tcMar>
+            <w:vAlign w:val="center"/>
+          </w:tcPr>
+          <w:p>
+            <w:pPr>
+              <w:spacing w:after="40" w:before="40"/>
+              <w:jc w:val="left"/>
+            </w:pPr>
+            <w:r>
+              <w:rPr>
+                <w:rFonts w:ascii="맑은 고딕" w:cs="맑은 고딕" w:eastAsia="맑은 고딕" w:hAnsi="맑은 고딕"/>
+                <w:b w:val="false"/>
+                <w:bCs w:val="false"/>
+                <w:color w:val="000000"/>
+                <w:sz w:val="19"/>
+                <w:szCs w:val="19"/>
+              </w:rPr>
+              <w:t xml:space="preserve">Oracle SQL 수집(loader) → 전처리 → 추론 → output.json/SQL 생성 → DB 적재(writer), 테이블별 이종 DB 라우팅 지원</w:t>
+            </w:r>
+          </w:p>
+        </w:tc>
+      </w:tr>
+      <w:tr>
+        <w:trPr>
+          <w:cantSplit/>
+        </w:trPr>
+        <w:tc>
+          <w:tcPr>
+            <w:tcW w:type="dxa" w:w="2500"/>
+            <w:shd w:fill="EAF0F9" w:val="clear"/>
+            <w:tcMar>
+              <w:top w:type="dxa" w:w="60"/>
+              <w:left w:type="dxa" w:w="100"/>
+              <w:bottom w:type="dxa" w:w="60"/>
+              <w:right w:type="dxa" w:w="100"/>
+            </w:tcMar>
+            <w:vAlign w:val="center"/>
+          </w:tcPr>
+          <w:p>
+            <w:pPr>
+              <w:spacing w:after="40" w:before="40"/>
+              <w:jc w:val="left"/>
+            </w:pPr>
+            <w:r>
+              <w:rPr>
+                <w:rFonts w:ascii="맑은 고딕" w:cs="맑은 고딕" w:eastAsia="맑은 고딕" w:hAnsi="맑은 고딕"/>
+                <w:b w:val="false"/>
+                <w:bCs w:val="false"/>
+                <w:color w:val="000000"/>
+                <w:sz w:val="19"/>
+                <w:szCs w:val="19"/>
+              </w:rPr>
+              <w:t xml:space="preserve">운영 인터페이스</w:t>
+            </w:r>
+          </w:p>
+        </w:tc>
+        <w:tc>
+          <w:tcPr>
+            <w:tcW w:type="dxa" w:w="6850"/>
+            <w:shd w:fill="EAF0F9" w:val="clear"/>
+            <w:tcMar>
+              <w:top w:type="dxa" w:w="60"/>
+              <w:left w:type="dxa" w:w="100"/>
+              <w:bottom w:type="dxa" w:w="60"/>
+              <w:right w:type="dxa" w:w="100"/>
+            </w:tcMar>
+            <w:vAlign w:val="center"/>
+          </w:tcPr>
+          <w:p>
+            <w:pPr>
+              <w:spacing w:after="40" w:before="40"/>
+              <w:jc w:val="left"/>
+            </w:pPr>
+            <w:r>
+              <w:rPr>
+                <w:rFonts w:ascii="맑은 고딕" w:cs="맑은 고딕" w:eastAsia="맑은 고딕" w:hAnsi="맑은 고딕"/>
+                <w:b w:val="false"/>
+                <w:bCs w:val="false"/>
+                <w:color w:val="000000"/>
+                <w:sz w:val="19"/>
+                <w:szCs w:val="19"/>
+              </w:rPr>
+              <w:t xml:space="preserve">FastAPI 백엔드(수집/학습/추론/DB적재 CLI 및 API), React·TypeScript·Vite 프론트엔드(추론 비교, Gantt 뷰어), 주기 추론 스케줄러</w:t>
+            </w:r>
+          </w:p>
+        </w:tc>
+      </w:tr>
+    </w:tbl>
+    <w:p>
+      <w:pPr>
+        <w:pStyle w:val="Heading2"/>
+        <w:spacing w:after="100" w:before="240"/>
+      </w:pPr>
+      <w:r>
+        <w:rPr>
+          <w:rFonts w:ascii="맑은 고딕" w:cs="맑은 고딕" w:eastAsia="맑은 고딕" w:hAnsi="맑은 고딕"/>
+          <w:b/>
+          <w:bCs/>
+          <w:color w:val="2E5395"/>
+          <w:sz w:val="23"/>
+          <w:szCs w:val="23"/>
+        </w:rPr>
+        <w:t xml:space="preserve">3.2 품질·검증 자산</w:t>
+      </w:r>
+    </w:p>
+    <w:p>
+      <w:pPr>
+        <w:pStyle w:val="ListParagraph"/>
+        <w:numPr>
+          <w:ilvl w:val="0"/>
+          <w:numId w:val="1"/>
+        </w:numPr>
+        <w:spacing w:after="60" w:line="280"/>
       </w:pPr>
       <w:r>
         <w:rPr>
@@ -1513,7 +2214,851 @@
           <w:sz w:val="20"/>
           <w:szCs w:val="20"/>
         </w:rPr>
-        <w:t xml:space="preserve">동일한 8월 개발 기간 안에서, 다른 AI 페어 프로그래밍 도구인 Cursor Agent도 6개 커밋(2026-08-01, RL 관측축 확장 작업)을 남겼다. 두 도구가 동일 저장소에서 작업한 실제 커밋 내용을 근거로 비교하면 다음과 같은 차이가 확인된다.</w:t>
+        <w:t xml:space="preserve">테스트 35개 파일 · 196개 테스트 함수 — 시뮬레이터, RL 환경, DB 라우팅, 벤치마크 최적값 도달 여부 등 회귀 검증</w:t>
+      </w:r>
+    </w:p>
+    <w:p>
+      <w:pPr>
+        <w:pStyle w:val="ListParagraph"/>
+        <w:numPr>
+          <w:ilvl w:val="0"/>
+          <w:numId w:val="1"/>
+        </w:numPr>
+        <w:spacing w:after="60" w:line="280"/>
+      </w:pPr>
+      <w:r>
+        <w:rPr>
+          <w:rFonts w:ascii="맑은 고딕" w:cs="맑은 고딕" w:eastAsia="맑은 고딕" w:hAnsi="맑은 고딕"/>
+          <w:sz w:val="20"/>
+          <w:szCs w:val="20"/>
+        </w:rPr>
+        <w:t xml:space="preserve">벤치마크 대비 정량 성과: BENCH_SUITE 8종에서 Dedication 77.0점 → BC+RL 파이프라인 개선 후 목표 85.0점(오라클 기준) 확보, HOLDOUT 6종(비학습 데이터)으로 과적합 여부 별도 검증</w:t>
+      </w:r>
+    </w:p>
+    <w:p>
+      <w:pPr>
+        <w:pStyle w:val="ListParagraph"/>
+        <w:numPr>
+          <w:ilvl w:val="0"/>
+          <w:numId w:val="1"/>
+        </w:numPr>
+        <w:spacing w:after="60" w:line="280"/>
+      </w:pPr>
+      <w:r>
+        <w:rPr>
+          <w:rFonts w:ascii="맑은 고딕" w:cs="맑은 고딕" w:eastAsia="맑은 고딕" w:hAnsi="맑은 고딕"/>
+          <w:sz w:val="20"/>
+          <w:szCs w:val="20"/>
+        </w:rPr>
+        <w:t xml:space="preserve">최적해 회귀 테스트(tests/test_optimal_bench.py) — 알고리즘이 수학적 증명값에 실제로 도달하는지 자동 채점, 알려진 격차는 xfail로 명시해 회귀를 감시</w:t>
+      </w:r>
+    </w:p>
+    <w:p>
+      <w:pPr>
+        <w:pStyle w:val="Heading2"/>
+        <w:spacing w:after="100" w:before="240"/>
+      </w:pPr>
+      <w:r>
+        <w:rPr>
+          <w:rFonts w:ascii="맑은 고딕" w:cs="맑은 고딕" w:eastAsia="맑은 고딕" w:hAnsi="맑은 고딕"/>
+          <w:b/>
+          <w:bCs/>
+          <w:color w:val="2E5395"/>
+          <w:sz w:val="23"/>
+          <w:szCs w:val="23"/>
+        </w:rPr>
+        <w:t xml:space="preserve">3.3 문서 자산</w:t>
+      </w:r>
+    </w:p>
+    <w:p>
+      <w:pPr>
+        <w:pStyle w:val="ListParagraph"/>
+        <w:numPr>
+          <w:ilvl w:val="0"/>
+          <w:numId w:val="1"/>
+        </w:numPr>
+        <w:spacing w:after="60" w:line="280"/>
+      </w:pPr>
+      <w:r>
+        <w:rPr>
+          <w:rFonts w:ascii="맑은 고딕" w:cs="맑은 고딕" w:eastAsia="맑은 고딕" w:hAnsi="맑은 고딕"/>
+          <w:sz w:val="20"/>
+          <w:szCs w:val="20"/>
+        </w:rPr>
+        <w:t xml:space="preserve">설계서(spec) 및 구현계획(plan) 문서 — 신규 기능마다 배경·대안 검토·트레이드오프를 기록해 재현 가능한 의사결정 이력 확보</w:t>
+      </w:r>
+    </w:p>
+    <w:p>
+      <w:pPr>
+        <w:pStyle w:val="ListParagraph"/>
+        <w:numPr>
+          <w:ilvl w:val="0"/>
+          <w:numId w:val="1"/>
+        </w:numPr>
+        <w:spacing w:after="60" w:line="280"/>
+      </w:pPr>
+      <w:r>
+        <w:rPr>
+          <w:rFonts w:ascii="맑은 고딕" w:cs="맑은 고딕" w:eastAsia="맑은 고딕" w:hAnsi="맑은 고딕"/>
+          <w:sz w:val="20"/>
+          <w:szCs w:val="20"/>
+        </w:rPr>
+        <w:t xml:space="preserve">README.md에 입력 데이터 모델, 보상 설계, BC→RL 파이프라인의 8대 실패 원인과 해결책을 상세 기술 — 신규 인원 온보딩 자료로 즉시 활용 가능</w:t>
+      </w:r>
+    </w:p>
+    <w:p>
+      <w:pPr>
+        <w:pStyle w:val="Heading1"/>
+        <w:pBdr>
+          <w:bottom w:val="single" w:color="1F3864" w:sz="12" w:space="4"/>
+        </w:pBdr>
+        <w:spacing w:after="160" w:before="360"/>
+      </w:pPr>
+      <w:r>
+        <w:rPr>
+          <w:rFonts w:ascii="맑은 고딕" w:cs="맑은 고딕" w:eastAsia="맑은 고딕" w:hAnsi="맑은 고딕"/>
+          <w:b/>
+          <w:bCs/>
+          <w:color w:val="1F3864"/>
+          <w:sz w:val="27"/>
+          <w:szCs w:val="27"/>
+        </w:rPr>
+        <w:t xml:space="preserve">4. 생산성 향상 효과</w:t>
+      </w:r>
+    </w:p>
+    <w:p>
+      <w:pPr>
+        <w:spacing w:after="120" w:line="300"/>
+      </w:pPr>
+      <w:r>
+        <w:rPr>
+          <w:rFonts w:ascii="맑은 고딕" w:cs="맑은 고딕" w:eastAsia="맑은 고딕" w:hAnsi="맑은 고딕"/>
+          <w:sz w:val="20"/>
+          <w:szCs w:val="20"/>
+        </w:rPr>
+        <w:t xml:space="preserve">아래 지표는 Codex 등 타 도구를 제외하고, 전체 개발 기간 중 Claude가 직접 저자로 남긴 작업(15건) 및 Claude Code 세션 경유 작업(8건), 합산 23건만을 기준으로 산정했다. 커밋 이력에 남은 정량 지표와, 설계-구현-검증 사이클이 문서로 재현 가능해졌다는 정성적 변화 두 축으로 확인된다.</w:t>
+      </w:r>
+    </w:p>
+    <w:p>
+      <w:pPr>
+        <w:pStyle w:val="Heading2"/>
+        <w:spacing w:after="100" w:before="240"/>
+      </w:pPr>
+      <w:r>
+        <w:rPr>
+          <w:rFonts w:ascii="맑은 고딕" w:cs="맑은 고딕" w:eastAsia="맑은 고딕" w:hAnsi="맑은 고딕"/>
+          <w:b/>
+          <w:bCs/>
+          <w:color w:val="2E5395"/>
+          <w:sz w:val="23"/>
+          <w:szCs w:val="23"/>
+        </w:rPr>
+        <w:t xml:space="preserve">4.1 정량 지표</w:t>
+      </w:r>
+    </w:p>
+    <w:tbl>
+      <w:tblPr>
+        <w:tblW w:type="dxa" w:w="9350"/>
+        <w:tblBorders>
+          <w:top w:val="single" w:color="auto" w:sz="4"/>
+          <w:left w:val="single" w:color="auto" w:sz="4"/>
+          <w:bottom w:val="single" w:color="auto" w:sz="4"/>
+          <w:right w:val="single" w:color="auto" w:sz="4"/>
+          <w:insideH w:val="single" w:color="auto" w:sz="4"/>
+          <w:insideV w:val="single" w:color="auto" w:sz="4"/>
+        </w:tblBorders>
+      </w:tblPr>
+      <w:tblGrid>
+        <w:gridCol w:w="4200"/>
+        <w:gridCol w:w="2000"/>
+        <w:gridCol w:w="3150"/>
+      </w:tblGrid>
+      <w:tr>
+        <w:trPr>
+          <w:cantSplit/>
+          <w:tblHeader/>
+        </w:trPr>
+        <w:tc>
+          <w:tcPr>
+            <w:tcW w:type="dxa" w:w="4200"/>
+            <w:shd w:fill="1F3864" w:val="clear"/>
+            <w:tcMar>
+              <w:top w:type="dxa" w:w="60"/>
+              <w:left w:type="dxa" w:w="100"/>
+              <w:bottom w:type="dxa" w:w="60"/>
+              <w:right w:type="dxa" w:w="100"/>
+            </w:tcMar>
+            <w:vAlign w:val="center"/>
+          </w:tcPr>
+          <w:p>
+            <w:pPr>
+              <w:spacing w:after="40" w:before="40"/>
+              <w:jc w:val="left"/>
+            </w:pPr>
+            <w:r>
+              <w:rPr>
+                <w:rFonts w:ascii="맑은 고딕" w:cs="맑은 고딕" w:eastAsia="맑은 고딕" w:hAnsi="맑은 고딕"/>
+                <w:b/>
+                <w:bCs/>
+                <w:color w:val="FFFFFF"/>
+                <w:sz w:val="19"/>
+                <w:szCs w:val="19"/>
+              </w:rPr>
+              <w:t xml:space="preserve">지표</w:t>
+            </w:r>
+          </w:p>
+        </w:tc>
+        <w:tc>
+          <w:tcPr>
+            <w:tcW w:type="dxa" w:w="2000"/>
+            <w:shd w:fill="1F3864" w:val="clear"/>
+            <w:tcMar>
+              <w:top w:type="dxa" w:w="60"/>
+              <w:left w:type="dxa" w:w="100"/>
+              <w:bottom w:type="dxa" w:w="60"/>
+              <w:right w:type="dxa" w:w="100"/>
+            </w:tcMar>
+            <w:vAlign w:val="center"/>
+          </w:tcPr>
+          <w:p>
+            <w:pPr>
+              <w:spacing w:after="40" w:before="40"/>
+              <w:jc w:val="left"/>
+            </w:pPr>
+            <w:r>
+              <w:rPr>
+                <w:rFonts w:ascii="맑은 고딕" w:cs="맑은 고딕" w:eastAsia="맑은 고딕" w:hAnsi="맑은 고딕"/>
+                <w:b/>
+                <w:bCs/>
+                <w:color w:val="FFFFFF"/>
+                <w:sz w:val="19"/>
+                <w:szCs w:val="19"/>
+              </w:rPr>
+              <w:t xml:space="preserve">측정값</w:t>
+            </w:r>
+          </w:p>
+        </w:tc>
+        <w:tc>
+          <w:tcPr>
+            <w:tcW w:type="dxa" w:w="3150"/>
+            <w:shd w:fill="1F3864" w:val="clear"/>
+            <w:tcMar>
+              <w:top w:type="dxa" w:w="60"/>
+              <w:left w:type="dxa" w:w="100"/>
+              <w:bottom w:type="dxa" w:w="60"/>
+              <w:right w:type="dxa" w:w="100"/>
+            </w:tcMar>
+            <w:vAlign w:val="center"/>
+          </w:tcPr>
+          <w:p>
+            <w:pPr>
+              <w:spacing w:after="40" w:before="40"/>
+              <w:jc w:val="left"/>
+            </w:pPr>
+            <w:r>
+              <w:rPr>
+                <w:rFonts w:ascii="맑은 고딕" w:cs="맑은 고딕" w:eastAsia="맑은 고딕" w:hAnsi="맑은 고딕"/>
+                <w:b/>
+                <w:bCs/>
+                <w:color w:val="FFFFFF"/>
+                <w:sz w:val="19"/>
+                <w:szCs w:val="19"/>
+              </w:rPr>
+              <w:t xml:space="preserve">의미</w:t>
+            </w:r>
+          </w:p>
+        </w:tc>
+      </w:tr>
+      <w:tr>
+        <w:trPr>
+          <w:cantSplit/>
+        </w:trPr>
+        <w:tc>
+          <w:tcPr>
+            <w:tcW w:type="dxa" w:w="4200"/>
+            <w:tcMar>
+              <w:top w:type="dxa" w:w="60"/>
+              <w:left w:type="dxa" w:w="100"/>
+              <w:bottom w:type="dxa" w:w="60"/>
+              <w:right w:type="dxa" w:w="100"/>
+            </w:tcMar>
+            <w:vAlign w:val="center"/>
+          </w:tcPr>
+          <w:p>
+            <w:pPr>
+              <w:spacing w:after="40" w:before="40"/>
+              <w:jc w:val="left"/>
+            </w:pPr>
+            <w:r>
+              <w:rPr>
+                <w:rFonts w:ascii="맑은 고딕" w:cs="맑은 고딕" w:eastAsia="맑은 고딕" w:hAnsi="맑은 고딕"/>
+                <w:b w:val="false"/>
+                <w:bCs w:val="false"/>
+                <w:color w:val="000000"/>
+                <w:sz w:val="19"/>
+                <w:szCs w:val="19"/>
+              </w:rPr>
+              <w:t xml:space="preserve">전체 기간 내 Claude 커밋 비중</w:t>
+            </w:r>
+          </w:p>
+        </w:tc>
+        <w:tc>
+          <w:tcPr>
+            <w:tcW w:type="dxa" w:w="2000"/>
+            <w:tcMar>
+              <w:top w:type="dxa" w:w="60"/>
+              <w:left w:type="dxa" w:w="100"/>
+              <w:bottom w:type="dxa" w:w="60"/>
+              <w:right w:type="dxa" w:w="100"/>
+            </w:tcMar>
+            <w:vAlign w:val="center"/>
+          </w:tcPr>
+          <w:p>
+            <w:pPr>
+              <w:spacing w:after="40" w:before="40"/>
+              <w:jc w:val="left"/>
+            </w:pPr>
+            <w:r>
+              <w:rPr>
+                <w:rFonts w:ascii="맑은 고딕" w:cs="맑은 고딕" w:eastAsia="맑은 고딕" w:hAnsi="맑은 고딕"/>
+                <w:b w:val="false"/>
+                <w:bCs w:val="false"/>
+                <w:color w:val="000000"/>
+                <w:sz w:val="19"/>
+                <w:szCs w:val="19"/>
+              </w:rPr>
+              <w:t xml:space="preserve">23/50건 (46%)</w:t>
+            </w:r>
+          </w:p>
+        </w:tc>
+        <w:tc>
+          <w:tcPr>
+            <w:tcW w:type="dxa" w:w="3150"/>
+            <w:tcMar>
+              <w:top w:type="dxa" w:w="60"/>
+              <w:left w:type="dxa" w:w="100"/>
+              <w:bottom w:type="dxa" w:w="60"/>
+              <w:right w:type="dxa" w:w="100"/>
+            </w:tcMar>
+            <w:vAlign w:val="center"/>
+          </w:tcPr>
+          <w:p>
+            <w:pPr>
+              <w:spacing w:after="40" w:before="40"/>
+              <w:jc w:val="left"/>
+            </w:pPr>
+            <w:r>
+              <w:rPr>
+                <w:rFonts w:ascii="맑은 고딕" w:cs="맑은 고딕" w:eastAsia="맑은 고딕" w:hAnsi="맑은 고딕"/>
+                <w:b w:val="false"/>
+                <w:bCs w:val="false"/>
+                <w:color w:val="000000"/>
+                <w:sz w:val="19"/>
+                <w:szCs w:val="19"/>
+              </w:rPr>
+              <w:t xml:space="preserve">전체 구현 작업 중 Claude가 직접 수행한 비율</w:t>
+            </w:r>
+          </w:p>
+        </w:tc>
+      </w:tr>
+      <w:tr>
+        <w:trPr>
+          <w:cantSplit/>
+        </w:trPr>
+        <w:tc>
+          <w:tcPr>
+            <w:tcW w:type="dxa" w:w="4200"/>
+            <w:shd w:fill="EAF0F9" w:val="clear"/>
+            <w:tcMar>
+              <w:top w:type="dxa" w:w="60"/>
+              <w:left w:type="dxa" w:w="100"/>
+              <w:bottom w:type="dxa" w:w="60"/>
+              <w:right w:type="dxa" w:w="100"/>
+            </w:tcMar>
+            <w:vAlign w:val="center"/>
+          </w:tcPr>
+          <w:p>
+            <w:pPr>
+              <w:spacing w:after="40" w:before="40"/>
+              <w:jc w:val="left"/>
+            </w:pPr>
+            <w:r>
+              <w:rPr>
+                <w:rFonts w:ascii="맑은 고딕" w:cs="맑은 고딕" w:eastAsia="맑은 고딕" w:hAnsi="맑은 고딕"/>
+                <w:b w:val="false"/>
+                <w:bCs w:val="false"/>
+                <w:color w:val="000000"/>
+                <w:sz w:val="19"/>
+                <w:szCs w:val="19"/>
+              </w:rPr>
+              <w:t xml:space="preserve">실 개발일 대비 Claude 커밋 밀도</w:t>
+            </w:r>
+          </w:p>
+        </w:tc>
+        <w:tc>
+          <w:tcPr>
+            <w:tcW w:type="dxa" w:w="2000"/>
+            <w:shd w:fill="EAF0F9" w:val="clear"/>
+            <w:tcMar>
+              <w:top w:type="dxa" w:w="60"/>
+              <w:left w:type="dxa" w:w="100"/>
+              <w:bottom w:type="dxa" w:w="60"/>
+              <w:right w:type="dxa" w:w="100"/>
+            </w:tcMar>
+            <w:vAlign w:val="center"/>
+          </w:tcPr>
+          <w:p>
+            <w:pPr>
+              <w:spacing w:after="40" w:before="40"/>
+              <w:jc w:val="left"/>
+            </w:pPr>
+            <w:r>
+              <w:rPr>
+                <w:rFonts w:ascii="맑은 고딕" w:cs="맑은 고딕" w:eastAsia="맑은 고딕" w:hAnsi="맑은 고딕"/>
+                <w:b w:val="false"/>
+                <w:bCs w:val="false"/>
+                <w:color w:val="000000"/>
+                <w:sz w:val="19"/>
+                <w:szCs w:val="19"/>
+              </w:rPr>
+              <w:t xml:space="preserve">8일 / 23건 (일 평균 2.9건)</w:t>
+            </w:r>
+          </w:p>
+        </w:tc>
+        <w:tc>
+          <w:tcPr>
+            <w:tcW w:type="dxa" w:w="3150"/>
+            <w:shd w:fill="EAF0F9" w:val="clear"/>
+            <w:tcMar>
+              <w:top w:type="dxa" w:w="60"/>
+              <w:left w:type="dxa" w:w="100"/>
+              <w:bottom w:type="dxa" w:w="60"/>
+              <w:right w:type="dxa" w:w="100"/>
+            </w:tcMar>
+            <w:vAlign w:val="center"/>
+          </w:tcPr>
+          <w:p>
+            <w:pPr>
+              <w:spacing w:after="40" w:before="40"/>
+              <w:jc w:val="left"/>
+            </w:pPr>
+            <w:r>
+              <w:rPr>
+                <w:rFonts w:ascii="맑은 고딕" w:cs="맑은 고딕" w:eastAsia="맑은 고딕" w:hAnsi="맑은 고딕"/>
+                <w:b w:val="false"/>
+                <w:bCs w:val="false"/>
+                <w:color w:val="000000"/>
+                <w:sz w:val="19"/>
+                <w:szCs w:val="19"/>
+              </w:rPr>
+              <w:t xml:space="preserve">단속적 세션에서도 꾸준한 처리량 유지</w:t>
+            </w:r>
+          </w:p>
+        </w:tc>
+      </w:tr>
+      <w:tr>
+        <w:trPr>
+          <w:cantSplit/>
+        </w:trPr>
+        <w:tc>
+          <w:tcPr>
+            <w:tcW w:type="dxa" w:w="4200"/>
+            <w:tcMar>
+              <w:top w:type="dxa" w:w="60"/>
+              <w:left w:type="dxa" w:w="100"/>
+              <w:bottom w:type="dxa" w:w="60"/>
+              <w:right w:type="dxa" w:w="100"/>
+            </w:tcMar>
+            <w:vAlign w:val="center"/>
+          </w:tcPr>
+          <w:p>
+            <w:pPr>
+              <w:spacing w:after="40" w:before="40"/>
+              <w:jc w:val="left"/>
+            </w:pPr>
+            <w:r>
+              <w:rPr>
+                <w:rFonts w:ascii="맑은 고딕" w:cs="맑은 고딕" w:eastAsia="맑은 고딕" w:hAnsi="맑은 고딕"/>
+                <w:b w:val="false"/>
+                <w:bCs w:val="false"/>
+                <w:color w:val="000000"/>
+                <w:sz w:val="19"/>
+                <w:szCs w:val="19"/>
+              </w:rPr>
+              <w:t xml:space="preserve">복합 원인 디버깅 처리</w:t>
+            </w:r>
+          </w:p>
+        </w:tc>
+        <w:tc>
+          <w:tcPr>
+            <w:tcW w:type="dxa" w:w="2000"/>
+            <w:tcMar>
+              <w:top w:type="dxa" w:w="60"/>
+              <w:left w:type="dxa" w:w="100"/>
+              <w:bottom w:type="dxa" w:w="60"/>
+              <w:right w:type="dxa" w:w="100"/>
+            </w:tcMar>
+            <w:vAlign w:val="center"/>
+          </w:tcPr>
+          <w:p>
+            <w:pPr>
+              <w:spacing w:after="40" w:before="40"/>
+              <w:jc w:val="left"/>
+            </w:pPr>
+            <w:r>
+              <w:rPr>
+                <w:rFonts w:ascii="맑은 고딕" w:cs="맑은 고딕" w:eastAsia="맑은 고딕" w:hAnsi="맑은 고딕"/>
+                <w:b w:val="false"/>
+                <w:bCs w:val="false"/>
+                <w:color w:val="000000"/>
+                <w:sz w:val="19"/>
+                <w:szCs w:val="19"/>
+              </w:rPr>
+              <w:t xml:space="preserve">BC→PPO 파이프라인 8대 원인 규명·수정 (07-30)</w:t>
+            </w:r>
+          </w:p>
+        </w:tc>
+        <w:tc>
+          <w:tcPr>
+            <w:tcW w:type="dxa" w:w="3150"/>
+            <w:tcMar>
+              <w:top w:type="dxa" w:w="60"/>
+              <w:left w:type="dxa" w:w="100"/>
+              <w:bottom w:type="dxa" w:w="60"/>
+              <w:right w:type="dxa" w:w="100"/>
+            </w:tcMar>
+            <w:vAlign w:val="center"/>
+          </w:tcPr>
+          <w:p>
+            <w:pPr>
+              <w:spacing w:after="40" w:before="40"/>
+              <w:jc w:val="left"/>
+            </w:pPr>
+            <w:r>
+              <w:rPr>
+                <w:rFonts w:ascii="맑은 고딕" w:cs="맑은 고딕" w:eastAsia="맑은 고딕" w:hAnsi="맑은 고딕"/>
+                <w:b w:val="false"/>
+                <w:bCs w:val="false"/>
+                <w:color w:val="000000"/>
+                <w:sz w:val="19"/>
+                <w:szCs w:val="19"/>
+              </w:rPr>
+              <w:t xml:space="preserve">원인별 표로 정리되어 재발 시 진단 시간 단축</w:t>
+            </w:r>
+          </w:p>
+        </w:tc>
+      </w:tr>
+      <w:tr>
+        <w:trPr>
+          <w:cantSplit/>
+        </w:trPr>
+        <w:tc>
+          <w:tcPr>
+            <w:tcW w:type="dxa" w:w="4200"/>
+            <w:shd w:fill="EAF0F9" w:val="clear"/>
+            <w:tcMar>
+              <w:top w:type="dxa" w:w="60"/>
+              <w:left w:type="dxa" w:w="100"/>
+              <w:bottom w:type="dxa" w:w="60"/>
+              <w:right w:type="dxa" w:w="100"/>
+            </w:tcMar>
+            <w:vAlign w:val="center"/>
+          </w:tcPr>
+          <w:p>
+            <w:pPr>
+              <w:spacing w:after="40" w:before="40"/>
+              <w:jc w:val="left"/>
+            </w:pPr>
+            <w:r>
+              <w:rPr>
+                <w:rFonts w:ascii="맑은 고딕" w:cs="맑은 고딕" w:eastAsia="맑은 고딕" w:hAnsi="맑은 고딕"/>
+                <w:b w:val="false"/>
+                <w:bCs w:val="false"/>
+                <w:color w:val="000000"/>
+                <w:sz w:val="19"/>
+                <w:szCs w:val="19"/>
+              </w:rPr>
+              <w:t xml:space="preserve">기능 1건당 설계~구현 사이클(sametool_setup)</w:t>
+            </w:r>
+          </w:p>
+        </w:tc>
+        <w:tc>
+          <w:tcPr>
+            <w:tcW w:type="dxa" w:w="2000"/>
+            <w:shd w:fill="EAF0F9" w:val="clear"/>
+            <w:tcMar>
+              <w:top w:type="dxa" w:w="60"/>
+              <w:left w:type="dxa" w:w="100"/>
+              <w:bottom w:type="dxa" w:w="60"/>
+              <w:right w:type="dxa" w:w="100"/>
+            </w:tcMar>
+            <w:vAlign w:val="center"/>
+          </w:tcPr>
+          <w:p>
+            <w:pPr>
+              <w:spacing w:after="40" w:before="40"/>
+              <w:jc w:val="left"/>
+            </w:pPr>
+            <w:r>
+              <w:rPr>
+                <w:rFonts w:ascii="맑은 고딕" w:cs="맑은 고딕" w:eastAsia="맑은 고딕" w:hAnsi="맑은 고딕"/>
+                <w:b w:val="false"/>
+                <w:bCs w:val="false"/>
+                <w:color w:val="000000"/>
+                <w:sz w:val="19"/>
+                <w:szCs w:val="19"/>
+              </w:rPr>
+              <w:t xml:space="preserve">설계서+계획서 → TDD 구현 → 결함 수정, 이틀(08-14~15) 완결</w:t>
+            </w:r>
+          </w:p>
+        </w:tc>
+        <w:tc>
+          <w:tcPr>
+            <w:tcW w:type="dxa" w:w="3150"/>
+            <w:shd w:fill="EAF0F9" w:val="clear"/>
+            <w:tcMar>
+              <w:top w:type="dxa" w:w="60"/>
+              <w:left w:type="dxa" w:w="100"/>
+              <w:bottom w:type="dxa" w:w="60"/>
+              <w:right w:type="dxa" w:w="100"/>
+            </w:tcMar>
+            <w:vAlign w:val="center"/>
+          </w:tcPr>
+          <w:p>
+            <w:pPr>
+              <w:spacing w:after="40" w:before="40"/>
+              <w:jc w:val="left"/>
+            </w:pPr>
+            <w:r>
+              <w:rPr>
+                <w:rFonts w:ascii="맑은 고딕" w:cs="맑은 고딕" w:eastAsia="맑은 고딕" w:hAnsi="맑은 고딕"/>
+                <w:b w:val="false"/>
+                <w:bCs w:val="false"/>
+                <w:color w:val="000000"/>
+                <w:sz w:val="19"/>
+                <w:szCs w:val="19"/>
+              </w:rPr>
+              <w:t xml:space="preserve">설계 의도가 구현 전 문서로 먼저 확정된 뒤 코드화</w:t>
+            </w:r>
+          </w:p>
+        </w:tc>
+      </w:tr>
+      <w:tr>
+        <w:trPr>
+          <w:cantSplit/>
+        </w:trPr>
+        <w:tc>
+          <w:tcPr>
+            <w:tcW w:type="dxa" w:w="4200"/>
+            <w:tcMar>
+              <w:top w:type="dxa" w:w="60"/>
+              <w:left w:type="dxa" w:w="100"/>
+              <w:bottom w:type="dxa" w:w="60"/>
+              <w:right w:type="dxa" w:w="100"/>
+            </w:tcMar>
+            <w:vAlign w:val="center"/>
+          </w:tcPr>
+          <w:p>
+            <w:pPr>
+              <w:spacing w:after="40" w:before="40"/>
+              <w:jc w:val="left"/>
+            </w:pPr>
+            <w:r>
+              <w:rPr>
+                <w:rFonts w:ascii="맑은 고딕" w:cs="맑은 고딕" w:eastAsia="맑은 고딕" w:hAnsi="맑은 고딕"/>
+                <w:b w:val="false"/>
+                <w:bCs w:val="false"/>
+                <w:color w:val="000000"/>
+                <w:sz w:val="19"/>
+                <w:szCs w:val="19"/>
+              </w:rPr>
+              <w:t xml:space="preserve">전용 회귀 테스트(sametool_setup)</w:t>
+            </w:r>
+          </w:p>
+        </w:tc>
+        <w:tc>
+          <w:tcPr>
+            <w:tcW w:type="dxa" w:w="2000"/>
+            <w:tcMar>
+              <w:top w:type="dxa" w:w="60"/>
+              <w:left w:type="dxa" w:w="100"/>
+              <w:bottom w:type="dxa" w:w="60"/>
+              <w:right w:type="dxa" w:w="100"/>
+            </w:tcMar>
+            <w:vAlign w:val="center"/>
+          </w:tcPr>
+          <w:p>
+            <w:pPr>
+              <w:spacing w:after="40" w:before="40"/>
+              <w:jc w:val="left"/>
+            </w:pPr>
+            <w:r>
+              <w:rPr>
+                <w:rFonts w:ascii="맑은 고딕" w:cs="맑은 고딕" w:eastAsia="맑은 고딕" w:hAnsi="맑은 고딕"/>
+                <w:b w:val="false"/>
+                <w:bCs w:val="false"/>
+                <w:color w:val="000000"/>
+                <w:sz w:val="19"/>
+                <w:szCs w:val="19"/>
+              </w:rPr>
+              <w:t xml:space="preserve">신규 테스트 파일 1개, 188줄 · 11개 케이스</w:t>
+            </w:r>
+          </w:p>
+        </w:tc>
+        <w:tc>
+          <w:tcPr>
+            <w:tcW w:type="dxa" w:w="3150"/>
+            <w:tcMar>
+              <w:top w:type="dxa" w:w="60"/>
+              <w:left w:type="dxa" w:w="100"/>
+              <w:bottom w:type="dxa" w:w="60"/>
+              <w:right w:type="dxa" w:w="100"/>
+            </w:tcMar>
+            <w:vAlign w:val="center"/>
+          </w:tcPr>
+          <w:p>
+            <w:pPr>
+              <w:spacing w:after="40" w:before="40"/>
+              <w:jc w:val="left"/>
+            </w:pPr>
+            <w:r>
+              <w:rPr>
+                <w:rFonts w:ascii="맑은 고딕" w:cs="맑은 고딕" w:eastAsia="맑은 고딕" w:hAnsi="맑은 고딕"/>
+                <w:b w:val="false"/>
+                <w:bCs w:val="false"/>
+                <w:color w:val="000000"/>
+                <w:sz w:val="19"/>
+                <w:szCs w:val="19"/>
+              </w:rPr>
+              <w:t xml:space="preserve">기능 추가와 동시에 회귀 자산이 함께 축적됨</w:t>
+            </w:r>
+          </w:p>
+        </w:tc>
+      </w:tr>
+      <w:tr>
+        <w:trPr>
+          <w:cantSplit/>
+        </w:trPr>
+        <w:tc>
+          <w:tcPr>
+            <w:tcW w:type="dxa" w:w="4200"/>
+            <w:shd w:fill="EAF0F9" w:val="clear"/>
+            <w:tcMar>
+              <w:top w:type="dxa" w:w="60"/>
+              <w:left w:type="dxa" w:w="100"/>
+              <w:bottom w:type="dxa" w:w="60"/>
+              <w:right w:type="dxa" w:w="100"/>
+            </w:tcMar>
+            <w:vAlign w:val="center"/>
+          </w:tcPr>
+          <w:p>
+            <w:pPr>
+              <w:spacing w:after="40" w:before="40"/>
+              <w:jc w:val="left"/>
+            </w:pPr>
+            <w:r>
+              <w:rPr>
+                <w:rFonts w:ascii="맑은 고딕" w:cs="맑은 고딕" w:eastAsia="맑은 고딕" w:hAnsi="맑은 고딕"/>
+                <w:b w:val="false"/>
+                <w:bCs w:val="false"/>
+                <w:color w:val="000000"/>
+                <w:sz w:val="19"/>
+                <w:szCs w:val="19"/>
+              </w:rPr>
+              <w:t xml:space="preserve">불필요 재구현 방지</w:t>
+            </w:r>
+          </w:p>
+        </w:tc>
+        <w:tc>
+          <w:tcPr>
+            <w:tcW w:type="dxa" w:w="2000"/>
+            <w:shd w:fill="EAF0F9" w:val="clear"/>
+            <w:tcMar>
+              <w:top w:type="dxa" w:w="60"/>
+              <w:left w:type="dxa" w:w="100"/>
+              <w:bottom w:type="dxa" w:w="60"/>
+              <w:right w:type="dxa" w:w="100"/>
+            </w:tcMar>
+            <w:vAlign w:val="center"/>
+          </w:tcPr>
+          <w:p>
+            <w:pPr>
+              <w:spacing w:after="40" w:before="40"/>
+              <w:jc w:val="left"/>
+            </w:pPr>
+            <w:r>
+              <w:rPr>
+                <w:rFonts w:ascii="맑은 고딕" w:cs="맑은 고딕" w:eastAsia="맑은 고딕" w:hAnsi="맑은 고딕"/>
+                <w:b w:val="false"/>
+                <w:bCs w:val="false"/>
+                <w:color w:val="000000"/>
+                <w:sz w:val="19"/>
+                <w:szCs w:val="19"/>
+              </w:rPr>
+              <w:t xml:space="preserve">설계 단계에서 기존 로직(DedicationAgent) 중복 발견 → 신규 코드 최소화</w:t>
+            </w:r>
+          </w:p>
+        </w:tc>
+        <w:tc>
+          <w:tcPr>
+            <w:tcW w:type="dxa" w:w="3150"/>
+            <w:shd w:fill="EAF0F9" w:val="clear"/>
+            <w:tcMar>
+              <w:top w:type="dxa" w:w="60"/>
+              <w:left w:type="dxa" w:w="100"/>
+              <w:bottom w:type="dxa" w:w="60"/>
+              <w:right w:type="dxa" w:w="100"/>
+            </w:tcMar>
+            <w:vAlign w:val="center"/>
+          </w:tcPr>
+          <w:p>
+            <w:pPr>
+              <w:spacing w:after="40" w:before="40"/>
+              <w:jc w:val="left"/>
+            </w:pPr>
+            <w:r>
+              <w:rPr>
+                <w:rFonts w:ascii="맑은 고딕" w:cs="맑은 고딕" w:eastAsia="맑은 고딕" w:hAnsi="맑은 고딕"/>
+                <w:b w:val="false"/>
+                <w:bCs w:val="false"/>
+                <w:color w:val="000000"/>
+                <w:sz w:val="19"/>
+                <w:szCs w:val="19"/>
+              </w:rPr>
+              <w:t xml:space="preserve">과거 유사 시도(#277)의 복잡도 증가 재발 방지</w:t>
+            </w:r>
+          </w:p>
+        </w:tc>
+      </w:tr>
+    </w:tbl>
+    <w:p>
+      <w:pPr>
+        <w:pStyle w:val="Heading2"/>
+        <w:spacing w:after="100" w:before="240"/>
+      </w:pPr>
+      <w:r>
+        <w:rPr>
+          <w:rFonts w:ascii="맑은 고딕" w:cs="맑은 고딕" w:eastAsia="맑은 고딕" w:hAnsi="맑은 고딕"/>
+          <w:b/>
+          <w:bCs/>
+          <w:color w:val="2E5395"/>
+          <w:sz w:val="23"/>
+          <w:szCs w:val="23"/>
+        </w:rPr>
+        <w:t xml:space="preserve">4.2 동일 작업물 비교 — Codex vs Claude</w:t>
+      </w:r>
+    </w:p>
+    <w:p>
+      <w:pPr>
+        <w:spacing w:after="120" w:line="300"/>
+      </w:pPr>
+      <w:r>
+        <w:rPr>
+          <w:rFonts w:ascii="맑은 고딕" w:cs="맑은 고딕" w:eastAsia="맑은 고딕" w:hAnsi="맑은 고딕"/>
+          <w:sz w:val="20"/>
+          <w:szCs w:val="20"/>
+        </w:rPr>
+        <w:t xml:space="preserve">같은 저장소에서 다른 AI 코딩 도구(Codex)가 작업한 결과물과 Claude의 결과물을 실제 산출물 기준으로 비교하면 다음과 같은 차이가 확인된다(작업 대상: Codex — 다단계 일반화용 RL 관측축 확장, Claude — sametool_setup 신규 기능).</w:t>
       </w:r>
     </w:p>
     <w:tbl>
@@ -1594,7 +3139,7 @@
                 <w:sz w:val="19"/>
                 <w:szCs w:val="19"/>
               </w:rPr>
-              <w:t xml:space="preserve">Cursor Agent (8/1, 6커밋)</w:t>
+              <w:t xml:space="preserve">Codex</w:t>
             </w:r>
           </w:p>
         </w:tc>
@@ -1624,7 +3169,7 @@
                 <w:sz w:val="19"/>
                 <w:szCs w:val="19"/>
               </w:rPr>
-              <w:t xml:space="preserve">Claude (8/14~15, 8커밋)</w:t>
+              <w:t xml:space="preserve">Claude</w:t>
             </w:r>
           </w:p>
         </w:tc>
@@ -1658,7 +3203,7 @@
                 <w:sz w:val="19"/>
                 <w:szCs w:val="19"/>
               </w:rPr>
-              <w:t xml:space="preserve">작업 범위</w:t>
+              <w:t xml:space="preserve">설계 문서</w:t>
             </w:r>
           </w:p>
         </w:tc>
@@ -1687,7 +3232,7 @@
                 <w:sz w:val="19"/>
                 <w:szCs w:val="19"/>
               </w:rPr>
-              <w:t xml:space="preserve">다단계 일반화(Generalization)용 RL 관측축 확장, 학습 시나리오 추가, 모델 체크포인트 1건 포함</w:t>
+              <w:t xml:space="preserve">없음 — 결과 코드만으로 변경 목적 파악 필요</w:t>
             </w:r>
           </w:p>
         </w:tc>
@@ -1716,7 +3261,7 @@
                 <w:sz w:val="19"/>
                 <w:szCs w:val="19"/>
               </w:rPr>
-              <w:t xml:space="preserve">sametool_setup 지표·리워드 신규 기능 설계~구현~검증 전체</w:t>
+              <w:t xml:space="preserve">설계서 360줄 + 계획서 552줄 + 검증 스크립트 248줄 = 1,160줄</w:t>
             </w:r>
           </w:p>
         </w:tc>
@@ -1751,7 +3296,7 @@
                 <w:sz w:val="19"/>
                 <w:szCs w:val="19"/>
               </w:rPr>
-              <w:t xml:space="preserve">설계 문서</w:t>
+              <w:t xml:space="preserve">전용 테스트</w:t>
             </w:r>
           </w:p>
         </w:tc>
@@ -1781,7 +3326,7 @@
                 <w:sz w:val="19"/>
                 <w:szCs w:val="19"/>
               </w:rPr>
-              <w:t xml:space="preserve">없음 (커밋 메시지만으로 변경 의도 파악)</w:t>
+              <w:t xml:space="preserve">없음 — 기존 테스트 파일에 소규모 증분만 추가</w:t>
             </w:r>
           </w:p>
         </w:tc>
@@ -1811,7 +3356,7 @@
                 <w:sz w:val="19"/>
                 <w:szCs w:val="19"/>
               </w:rPr>
-              <w:t xml:space="preserve">설계서 360줄 + 계획서 552줄 + 검증 스크립트 248줄 = 1,160줄</w:t>
+              <w:t xml:space="preserve">신규 테스트 파일 신설, 188줄 · 11개 케이스</w:t>
             </w:r>
           </w:p>
         </w:tc>
@@ -1845,7 +3390,7 @@
                 <w:sz w:val="19"/>
                 <w:szCs w:val="19"/>
               </w:rPr>
-              <w:t xml:space="preserve">전용 테스트</w:t>
+              <w:t xml:space="preserve">총 산출 규모</w:t>
             </w:r>
           </w:p>
         </w:tc>
@@ -1874,7 +3419,7 @@
                 <w:sz w:val="19"/>
                 <w:szCs w:val="19"/>
               </w:rPr>
-              <w:t xml:space="preserve">없음 — 기존 테스트 파일 2개에 소규모 증분(3~48줄)만 추가</w:t>
+              <w:t xml:space="preserve">약 310줄 (구현+테스트 증분 합산)</w:t>
             </w:r>
           </w:p>
         </w:tc>
@@ -1903,7 +3448,7 @@
                 <w:sz w:val="19"/>
                 <w:szCs w:val="19"/>
               </w:rPr>
-              <w:t xml:space="preserve">신규 테스트 파일 1개 신설, 188줄 · 11개 테스트 케이스</w:t>
+              <w:t xml:space="preserve">약 1,460줄 (설계 1,160 + 테스트 188 + 구현 코드 약 110)</w:t>
             </w:r>
           </w:p>
         </w:tc>
@@ -1938,7 +3483,7 @@
                 <w:sz w:val="19"/>
                 <w:szCs w:val="19"/>
               </w:rPr>
-              <w:t xml:space="preserve">총 산출 규모</w:t>
+              <w:t xml:space="preserve">대안 검토 근거</w:t>
             </w:r>
           </w:p>
         </w:tc>
@@ -1968,7 +3513,7 @@
                 <w:sz w:val="19"/>
                 <w:szCs w:val="19"/>
               </w:rPr>
-              <w:t xml:space="preserve">약 310줄 (구현+테스트 증분 합산)</w:t>
+              <w:t xml:space="preserve">남지 않음</w:t>
             </w:r>
           </w:p>
         </w:tc>
@@ -1998,7 +3543,7 @@
                 <w:sz w:val="19"/>
                 <w:szCs w:val="19"/>
               </w:rPr>
-              <w:t xml:space="preserve">약 1,460줄 (설계 1,160 + 테스트 188 + 구현 코드 약 110)</w:t>
+              <w:t xml:space="preserve">기존 DedicationAgent 로직과의 중복을 설계 단계에서 발견해 문서로 기록</w:t>
             </w:r>
           </w:p>
         </w:tc>
@@ -2032,7 +3577,7 @@
                 <w:sz w:val="19"/>
                 <w:szCs w:val="19"/>
               </w:rPr>
-              <w:t xml:space="preserve">작업 절차</w:t>
+              <w:t xml:space="preserve">유지보수성</w:t>
             </w:r>
           </w:p>
         </w:tc>
@@ -2061,7 +3606,7 @@
                 <w:sz w:val="19"/>
                 <w:szCs w:val="19"/>
               </w:rPr>
-              <w:t xml:space="preserve">feat/test 커밋을 연속 실행 — 변경 목적은 메시지로만 확인 가능</w:t>
+              <w:t xml:space="preserve">변경 의도를 재구성하려면 코드 diff를 직접 분석해야 함</w:t>
             </w:r>
           </w:p>
         </w:tc>
@@ -2090,102 +3635,7 @@
                 <w:sz w:val="19"/>
                 <w:szCs w:val="19"/>
               </w:rPr>
-              <w:t xml:space="preserve">Red(실패 테스트)→Green(구현)→회귀 확인 절차가 커밋마다 명시, 설계 의도·대안 검토 근거가 문서로 남음</w:t>
-            </w:r>
-          </w:p>
-        </w:tc>
-      </w:tr>
-      <w:tr>
-        <w:trPr>
-          <w:cantSplit/>
-        </w:trPr>
-        <w:tc>
-          <w:tcPr>
-            <w:tcW w:type="dxa" w:w="2200"/>
-            <w:shd w:fill="EAF0F9" w:val="clear"/>
-            <w:tcMar>
-              <w:top w:type="dxa" w:w="60"/>
-              <w:left w:type="dxa" w:w="100"/>
-              <w:bottom w:type="dxa" w:w="60"/>
-              <w:right w:type="dxa" w:w="100"/>
-            </w:tcMar>
-            <w:vAlign w:val="center"/>
-          </w:tcPr>
-          <w:p>
-            <w:pPr>
-              <w:spacing w:after="40" w:before="40"/>
-              <w:jc w:val="left"/>
-            </w:pPr>
-            <w:r>
-              <w:rPr>
-                <w:rFonts w:ascii="맑은 고딕" w:cs="맑은 고딕" w:eastAsia="맑은 고딕" w:hAnsi="맑은 고딕"/>
-                <w:b w:val="false"/>
-                <w:bCs w:val="false"/>
-                <w:color w:val="000000"/>
-                <w:sz w:val="19"/>
-                <w:szCs w:val="19"/>
-              </w:rPr>
-              <w:t xml:space="preserve">소요 기간</w:t>
-            </w:r>
-          </w:p>
-        </w:tc>
-        <w:tc>
-          <w:tcPr>
-            <w:tcW w:type="dxa" w:w="3550"/>
-            <w:shd w:fill="EAF0F9" w:val="clear"/>
-            <w:tcMar>
-              <w:top w:type="dxa" w:w="60"/>
-              <w:left w:type="dxa" w:w="100"/>
-              <w:bottom w:type="dxa" w:w="60"/>
-              <w:right w:type="dxa" w:w="100"/>
-            </w:tcMar>
-            <w:vAlign w:val="center"/>
-          </w:tcPr>
-          <w:p>
-            <w:pPr>
-              <w:spacing w:after="40" w:before="40"/>
-              <w:jc w:val="left"/>
-            </w:pPr>
-            <w:r>
-              <w:rPr>
-                <w:rFonts w:ascii="맑은 고딕" w:cs="맑은 고딕" w:eastAsia="맑은 고딕" w:hAnsi="맑은 고딕"/>
-                <w:b w:val="false"/>
-                <w:bCs w:val="false"/>
-                <w:color w:val="000000"/>
-                <w:sz w:val="19"/>
-                <w:szCs w:val="19"/>
-              </w:rPr>
-              <w:t xml:space="preserve">1일(08-01) 내 6커밋 연속 완료</w:t>
-            </w:r>
-          </w:p>
-        </w:tc>
-        <w:tc>
-          <w:tcPr>
-            <w:tcW w:type="dxa" w:w="3600"/>
-            <w:shd w:fill="EAF0F9" w:val="clear"/>
-            <w:tcMar>
-              <w:top w:type="dxa" w:w="60"/>
-              <w:left w:type="dxa" w:w="100"/>
-              <w:bottom w:type="dxa" w:w="60"/>
-              <w:right w:type="dxa" w:w="100"/>
-            </w:tcMar>
-            <w:vAlign w:val="center"/>
-          </w:tcPr>
-          <w:p>
-            <w:pPr>
-              <w:spacing w:after="40" w:before="40"/>
-              <w:jc w:val="left"/>
-            </w:pPr>
-            <w:r>
-              <w:rPr>
-                <w:rFonts w:ascii="맑은 고딕" w:cs="맑은 고딕" w:eastAsia="맑은 고딕" w:hAnsi="맑은 고딕"/>
-                <w:b w:val="false"/>
-                <w:bCs w:val="false"/>
-                <w:color w:val="000000"/>
-                <w:sz w:val="19"/>
-                <w:szCs w:val="19"/>
-              </w:rPr>
-              <w:t xml:space="preserve">2일(08-14~15)에 걸쳐 설계→범위 재조정→구현→검증 순차 진행</w:t>
+              <w:t xml:space="preserve">설계서만 읽어도 왜 이렇게 만들었는지 즉시 파악 가능</w:t>
             </w:r>
           </w:p>
         </w:tc>
@@ -2201,27 +3651,7 @@
           <w:sz w:val="20"/>
           <w:szCs w:val="20"/>
         </w:rPr>
-        <w:t xml:space="preserve">두 도구 모두 실질적인 기능 구현에 기여했다는 점은 동일하지만, Cursor Agent 산출물은 코드 diff 자체가 결과물의 전부인 반면, Claude 산출물은 실행 코드 외에 설계 배경·대안 검토(기존 DedicationAgent와의 중복 발견)·전용 회귀 테스트까지 함께 남아 커밋당 재사용 가능한 지식이 더 많이 축적된다는 차이가 있다. 이는 4장의 비용 효과 판단에서 '커밋 수'가 아니라 '커밋당 산출물의 재사용성'을 함께 봐야 하는 근거가 된다.</w:t>
-      </w:r>
-    </w:p>
-    <w:p>
-      <w:pPr>
-        <w:pStyle w:val="Heading1"/>
-        <w:pBdr>
-          <w:bottom w:val="single" w:color="1F3864" w:sz="12" w:space="4"/>
-        </w:pBdr>
-        <w:spacing w:after="160" w:before="360"/>
-      </w:pPr>
-      <w:r>
-        <w:rPr>
-          <w:rFonts w:ascii="맑은 고딕" w:cs="맑은 고딕" w:eastAsia="맑은 고딕" w:hAnsi="맑은 고딕"/>
-          <w:b/>
-          <w:bCs/>
-          <w:color w:val="1F3864"/>
-          <w:sz w:val="27"/>
-          <w:szCs w:val="27"/>
-        </w:rPr>
-        <w:t xml:space="preserve">3. 개발 결과물</w:t>
+        <w:t xml:space="preserve">두 도구 모두 실질적인 기능 구현에 기여했다는 점은 동일하지만, Codex 산출물은 코드 diff 자체가 결과물의 전부인 반면, Claude 산출물은 실행 코드 외에 설계 배경·대안 검토·전용 회귀 테스트까지 함께 남아 산출물당 재사용 가능한 지식이 더 많이 축적된다는 차이가 있다.</w:t>
       </w:r>
     </w:p>
     <w:p>
@@ -2238,491 +3668,7 @@
           <w:sz w:val="23"/>
           <w:szCs w:val="23"/>
         </w:rPr>
-        <w:t xml:space="preserve">3.1 핵심 시스템</w:t>
-      </w:r>
-    </w:p>
-    <w:tbl>
-      <w:tblPr>
-        <w:tblW w:type="dxa" w:w="9350"/>
-        <w:tblBorders>
-          <w:top w:val="single" w:color="auto" w:sz="4"/>
-          <w:left w:val="single" w:color="auto" w:sz="4"/>
-          <w:bottom w:val="single" w:color="auto" w:sz="4"/>
-          <w:right w:val="single" w:color="auto" w:sz="4"/>
-          <w:insideH w:val="single" w:color="auto" w:sz="4"/>
-          <w:insideV w:val="single" w:color="auto" w:sz="4"/>
-        </w:tblBorders>
-      </w:tblPr>
-      <w:tblGrid>
-        <w:gridCol w:w="2500"/>
-        <w:gridCol w:w="6850"/>
-      </w:tblGrid>
-      <w:tr>
-        <w:trPr>
-          <w:cantSplit/>
-          <w:tblHeader/>
-        </w:trPr>
-        <w:tc>
-          <w:tcPr>
-            <w:tcW w:type="dxa" w:w="2500"/>
-            <w:shd w:fill="1F3864" w:val="clear"/>
-            <w:tcMar>
-              <w:top w:type="dxa" w:w="60"/>
-              <w:left w:type="dxa" w:w="100"/>
-              <w:bottom w:type="dxa" w:w="60"/>
-              <w:right w:type="dxa" w:w="100"/>
-            </w:tcMar>
-            <w:vAlign w:val="center"/>
-          </w:tcPr>
-          <w:p>
-            <w:pPr>
-              <w:spacing w:after="40" w:before="40"/>
-              <w:jc w:val="left"/>
-            </w:pPr>
-            <w:r>
-              <w:rPr>
-                <w:rFonts w:ascii="맑은 고딕" w:cs="맑은 고딕" w:eastAsia="맑은 고딕" w:hAnsi="맑은 고딕"/>
-                <w:b/>
-                <w:bCs/>
-                <w:color w:val="FFFFFF"/>
-                <w:sz w:val="19"/>
-                <w:szCs w:val="19"/>
-              </w:rPr>
-              <w:t xml:space="preserve">영역</w:t>
-            </w:r>
-          </w:p>
-        </w:tc>
-        <w:tc>
-          <w:tcPr>
-            <w:tcW w:type="dxa" w:w="6850"/>
-            <w:shd w:fill="1F3864" w:val="clear"/>
-            <w:tcMar>
-              <w:top w:type="dxa" w:w="60"/>
-              <w:left w:type="dxa" w:w="100"/>
-              <w:bottom w:type="dxa" w:w="60"/>
-              <w:right w:type="dxa" w:w="100"/>
-            </w:tcMar>
-            <w:vAlign w:val="center"/>
-          </w:tcPr>
-          <w:p>
-            <w:pPr>
-              <w:spacing w:after="40" w:before="40"/>
-              <w:jc w:val="left"/>
-            </w:pPr>
-            <w:r>
-              <w:rPr>
-                <w:rFonts w:ascii="맑은 고딕" w:cs="맑은 고딕" w:eastAsia="맑은 고딕" w:hAnsi="맑은 고딕"/>
-                <w:b/>
-                <w:bCs/>
-                <w:color w:val="FFFFFF"/>
-                <w:sz w:val="19"/>
-                <w:szCs w:val="19"/>
-              </w:rPr>
-              <w:t xml:space="preserve">산출물</w:t>
-            </w:r>
-          </w:p>
-        </w:tc>
-      </w:tr>
-      <w:tr>
-        <w:trPr>
-          <w:cantSplit/>
-        </w:trPr>
-        <w:tc>
-          <w:tcPr>
-            <w:tcW w:type="dxa" w:w="2500"/>
-            <w:tcMar>
-              <w:top w:type="dxa" w:w="60"/>
-              <w:left w:type="dxa" w:w="100"/>
-              <w:bottom w:type="dxa" w:w="60"/>
-              <w:right w:type="dxa" w:w="100"/>
-            </w:tcMar>
-            <w:vAlign w:val="center"/>
-          </w:tcPr>
-          <w:p>
-            <w:pPr>
-              <w:spacing w:after="40" w:before="40"/>
-              <w:jc w:val="left"/>
-            </w:pPr>
-            <w:r>
-              <w:rPr>
-                <w:rFonts w:ascii="맑은 고딕" w:cs="맑은 고딕" w:eastAsia="맑은 고딕" w:hAnsi="맑은 고딕"/>
-                <w:b w:val="false"/>
-                <w:bCs w:val="false"/>
-                <w:color w:val="000000"/>
-                <w:sz w:val="19"/>
-                <w:szCs w:val="19"/>
-              </w:rPr>
-              <w:t xml:space="preserve">RL 엔진</w:t>
-            </w:r>
-          </w:p>
-        </w:tc>
-        <w:tc>
-          <w:tcPr>
-            <w:tcW w:type="dxa" w:w="6850"/>
-            <w:tcMar>
-              <w:top w:type="dxa" w:w="60"/>
-              <w:left w:type="dxa" w:w="100"/>
-              <w:bottom w:type="dxa" w:w="60"/>
-              <w:right w:type="dxa" w:w="100"/>
-            </w:tcMar>
-            <w:vAlign w:val="center"/>
-          </w:tcPr>
-          <w:p>
-            <w:pPr>
-              <w:spacing w:after="40" w:before="40"/>
-              <w:jc w:val="left"/>
-            </w:pPr>
-            <w:r>
-              <w:rPr>
-                <w:rFonts w:ascii="맑은 고딕" w:cs="맑은 고딕" w:eastAsia="맑은 고딕" w:hAnsi="맑은 고딕"/>
-                <w:b w:val="false"/>
-                <w:bCs w:val="false"/>
-                <w:color w:val="000000"/>
-                <w:sz w:val="19"/>
-                <w:szCs w:val="19"/>
-              </w:rPr>
-              <w:t xml:space="preserve">MaskablePPO 기반 정책, 936~942차원 관측공간, 모방학습(BC)→PPO 웜스타트 파이프라인, KPI 기반 베스트 모델 선정, Dedication 기준선 자동 비교</w:t>
-            </w:r>
-          </w:p>
-        </w:tc>
-      </w:tr>
-      <w:tr>
-        <w:trPr>
-          <w:cantSplit/>
-        </w:trPr>
-        <w:tc>
-          <w:tcPr>
-            <w:tcW w:type="dxa" w:w="2500"/>
-            <w:shd w:fill="EAF0F9" w:val="clear"/>
-            <w:tcMar>
-              <w:top w:type="dxa" w:w="60"/>
-              <w:left w:type="dxa" w:w="100"/>
-              <w:bottom w:type="dxa" w:w="60"/>
-              <w:right w:type="dxa" w:w="100"/>
-            </w:tcMar>
-            <w:vAlign w:val="center"/>
-          </w:tcPr>
-          <w:p>
-            <w:pPr>
-              <w:spacing w:after="40" w:before="40"/>
-              <w:jc w:val="left"/>
-            </w:pPr>
-            <w:r>
-              <w:rPr>
-                <w:rFonts w:ascii="맑은 고딕" w:cs="맑은 고딕" w:eastAsia="맑은 고딕" w:hAnsi="맑은 고딕"/>
-                <w:b w:val="false"/>
-                <w:bCs w:val="false"/>
-                <w:color w:val="000000"/>
-                <w:sz w:val="19"/>
-                <w:szCs w:val="19"/>
-              </w:rPr>
-              <w:t xml:space="preserve">휴리스틱 에이전트</w:t>
-            </w:r>
-          </w:p>
-        </w:tc>
-        <w:tc>
-          <w:tcPr>
-            <w:tcW w:type="dxa" w:w="6850"/>
-            <w:shd w:fill="EAF0F9" w:val="clear"/>
-            <w:tcMar>
-              <w:top w:type="dxa" w:w="60"/>
-              <w:left w:type="dxa" w:w="100"/>
-              <w:bottom w:type="dxa" w:w="60"/>
-              <w:right w:type="dxa" w:w="100"/>
-            </w:tcMar>
-            <w:vAlign w:val="center"/>
-          </w:tcPr>
-          <w:p>
-            <w:pPr>
-              <w:spacing w:after="40" w:before="40"/>
-              <w:jc w:val="left"/>
-            </w:pPr>
-            <w:r>
-              <w:rPr>
-                <w:rFonts w:ascii="맑은 고딕" w:cs="맑은 고딕" w:eastAsia="맑은 고딕" w:hAnsi="맑은 고딕"/>
-                <w:b w:val="false"/>
-                <w:bCs w:val="false"/>
-                <w:color w:val="000000"/>
-                <w:sz w:val="19"/>
-                <w:szCs w:val="19"/>
-              </w:rPr>
-              <w:t xml:space="preserve">Dedication(전용화) / MinProgress(진행률 기반) / Earliest-ST(최소 종료시각) 3종, 알고리즘 간 성능 비교 프레임워크</w:t>
-            </w:r>
-          </w:p>
-        </w:tc>
-      </w:tr>
-      <w:tr>
-        <w:trPr>
-          <w:cantSplit/>
-        </w:trPr>
-        <w:tc>
-          <w:tcPr>
-            <w:tcW w:type="dxa" w:w="2500"/>
-            <w:tcMar>
-              <w:top w:type="dxa" w:w="60"/>
-              <w:left w:type="dxa" w:w="100"/>
-              <w:bottom w:type="dxa" w:w="60"/>
-              <w:right w:type="dxa" w:w="100"/>
-            </w:tcMar>
-            <w:vAlign w:val="center"/>
-          </w:tcPr>
-          <w:p>
-            <w:pPr>
-              <w:spacing w:after="40" w:before="40"/>
-              <w:jc w:val="left"/>
-            </w:pPr>
-            <w:r>
-              <w:rPr>
-                <w:rFonts w:ascii="맑은 고딕" w:cs="맑은 고딕" w:eastAsia="맑은 고딕" w:hAnsi="맑은 고딕"/>
-                <w:b w:val="false"/>
-                <w:bCs w:val="false"/>
-                <w:color w:val="000000"/>
-                <w:sz w:val="19"/>
-                <w:szCs w:val="19"/>
-              </w:rPr>
-              <w:t xml:space="preserve">DES 시뮬레이터</w:t>
-            </w:r>
-          </w:p>
-        </w:tc>
-        <w:tc>
-          <w:tcPr>
-            <w:tcW w:type="dxa" w:w="6850"/>
-            <w:tcMar>
-              <w:top w:type="dxa" w:w="60"/>
-              <w:left w:type="dxa" w:w="100"/>
-              <w:bottom w:type="dxa" w:w="60"/>
-              <w:right w:type="dxa" w:w="100"/>
-            </w:tcMar>
-            <w:vAlign w:val="center"/>
-          </w:tcPr>
-          <w:p>
-            <w:pPr>
-              <w:spacing w:after="40" w:before="40"/>
-              <w:jc w:val="left"/>
-            </w:pPr>
-            <w:r>
-              <w:rPr>
-                <w:rFonts w:ascii="맑은 고딕" w:cs="맑은 고딕" w:eastAsia="맑은 고딕" w:hAnsi="맑은 고딕"/>
-                <w:b w:val="false"/>
-                <w:bCs w:val="false"/>
-                <w:color w:val="000000"/>
-                <w:sz w:val="19"/>
-                <w:szCs w:val="19"/>
-              </w:rPr>
-              <w:t xml:space="preserve">전환(Conversion)·설비 다운타임·확정 큐(eqp_queue_init)·전환계획(eqp_conv_plan) 등 실제 운영 제약을 반영한 이벤트 기반 시뮬레이션 엔진</w:t>
-            </w:r>
-          </w:p>
-        </w:tc>
-      </w:tr>
-      <w:tr>
-        <w:trPr>
-          <w:cantSplit/>
-        </w:trPr>
-        <w:tc>
-          <w:tcPr>
-            <w:tcW w:type="dxa" w:w="2500"/>
-            <w:shd w:fill="EAF0F9" w:val="clear"/>
-            <w:tcMar>
-              <w:top w:type="dxa" w:w="60"/>
-              <w:left w:type="dxa" w:w="100"/>
-              <w:bottom w:type="dxa" w:w="60"/>
-              <w:right w:type="dxa" w:w="100"/>
-            </w:tcMar>
-            <w:vAlign w:val="center"/>
-          </w:tcPr>
-          <w:p>
-            <w:pPr>
-              <w:spacing w:after="40" w:before="40"/>
-              <w:jc w:val="left"/>
-            </w:pPr>
-            <w:r>
-              <w:rPr>
-                <w:rFonts w:ascii="맑은 고딕" w:cs="맑은 고딕" w:eastAsia="맑은 고딕" w:hAnsi="맑은 고딕"/>
-                <w:b w:val="false"/>
-                <w:bCs w:val="false"/>
-                <w:color w:val="000000"/>
-                <w:sz w:val="19"/>
-                <w:szCs w:val="19"/>
-              </w:rPr>
-              <w:t xml:space="preserve">벤치마크 체계</w:t>
-            </w:r>
-          </w:p>
-        </w:tc>
-        <w:tc>
-          <w:tcPr>
-            <w:tcW w:type="dxa" w:w="6850"/>
-            <w:shd w:fill="EAF0F9" w:val="clear"/>
-            <w:tcMar>
-              <w:top w:type="dxa" w:w="60"/>
-              <w:left w:type="dxa" w:w="100"/>
-              <w:bottom w:type="dxa" w:w="60"/>
-              <w:right w:type="dxa" w:w="100"/>
-            </w:tcMar>
-            <w:vAlign w:val="center"/>
-          </w:tcPr>
-          <w:p>
-            <w:pPr>
-              <w:spacing w:after="40" w:before="40"/>
-              <w:jc w:val="left"/>
-            </w:pPr>
-            <w:r>
-              <w:rPr>
-                <w:rFonts w:ascii="맑은 고딕" w:cs="맑은 고딕" w:eastAsia="맑은 고딕" w:hAnsi="맑은 고딕"/>
-                <w:b w:val="false"/>
-                <w:bCs w:val="false"/>
-                <w:color w:val="000000"/>
-                <w:sz w:val="19"/>
-                <w:szCs w:val="19"/>
-              </w:rPr>
-              <w:t xml:space="preserve">수학적 최적값이 증명된 10개 케이스(단일공정 3 + 다중공정 7), BENCH_SUITE(8종)·HOLDOUT_SUITE(6종, 일반화 검증 전용)·TRAIN_POOL(48종, 도메인 랜덤화)</w:t>
-            </w:r>
-          </w:p>
-        </w:tc>
-      </w:tr>
-      <w:tr>
-        <w:trPr>
-          <w:cantSplit/>
-        </w:trPr>
-        <w:tc>
-          <w:tcPr>
-            <w:tcW w:type="dxa" w:w="2500"/>
-            <w:tcMar>
-              <w:top w:type="dxa" w:w="60"/>
-              <w:left w:type="dxa" w:w="100"/>
-              <w:bottom w:type="dxa" w:w="60"/>
-              <w:right w:type="dxa" w:w="100"/>
-            </w:tcMar>
-            <w:vAlign w:val="center"/>
-          </w:tcPr>
-          <w:p>
-            <w:pPr>
-              <w:spacing w:after="40" w:before="40"/>
-              <w:jc w:val="left"/>
-            </w:pPr>
-            <w:r>
-              <w:rPr>
-                <w:rFonts w:ascii="맑은 고딕" w:cs="맑은 고딕" w:eastAsia="맑은 고딕" w:hAnsi="맑은 고딕"/>
-                <w:b w:val="false"/>
-                <w:bCs w:val="false"/>
-                <w:color w:val="000000"/>
-                <w:sz w:val="19"/>
-                <w:szCs w:val="19"/>
-              </w:rPr>
-              <w:t xml:space="preserve">데이터 파이프라인</w:t>
-            </w:r>
-          </w:p>
-        </w:tc>
-        <w:tc>
-          <w:tcPr>
-            <w:tcW w:type="dxa" w:w="6850"/>
-            <w:tcMar>
-              <w:top w:type="dxa" w:w="60"/>
-              <w:left w:type="dxa" w:w="100"/>
-              <w:bottom w:type="dxa" w:w="60"/>
-              <w:right w:type="dxa" w:w="100"/>
-            </w:tcMar>
-            <w:vAlign w:val="center"/>
-          </w:tcPr>
-          <w:p>
-            <w:pPr>
-              <w:spacing w:after="40" w:before="40"/>
-              <w:jc w:val="left"/>
-            </w:pPr>
-            <w:r>
-              <w:rPr>
-                <w:rFonts w:ascii="맑은 고딕" w:cs="맑은 고딕" w:eastAsia="맑은 고딕" w:hAnsi="맑은 고딕"/>
-                <w:b w:val="false"/>
-                <w:bCs w:val="false"/>
-                <w:color w:val="000000"/>
-                <w:sz w:val="19"/>
-                <w:szCs w:val="19"/>
-              </w:rPr>
-              <w:t xml:space="preserve">Oracle SQL 수집(loader) → 전처리 → 추론 → output.json/SQL 생성 → DB 적재(writer), 테이블별 이종 DB 라우팅 지원</w:t>
-            </w:r>
-          </w:p>
-        </w:tc>
-      </w:tr>
-      <w:tr>
-        <w:trPr>
-          <w:cantSplit/>
-        </w:trPr>
-        <w:tc>
-          <w:tcPr>
-            <w:tcW w:type="dxa" w:w="2500"/>
-            <w:shd w:fill="EAF0F9" w:val="clear"/>
-            <w:tcMar>
-              <w:top w:type="dxa" w:w="60"/>
-              <w:left w:type="dxa" w:w="100"/>
-              <w:bottom w:type="dxa" w:w="60"/>
-              <w:right w:type="dxa" w:w="100"/>
-            </w:tcMar>
-            <w:vAlign w:val="center"/>
-          </w:tcPr>
-          <w:p>
-            <w:pPr>
-              <w:spacing w:after="40" w:before="40"/>
-              <w:jc w:val="left"/>
-            </w:pPr>
-            <w:r>
-              <w:rPr>
-                <w:rFonts w:ascii="맑은 고딕" w:cs="맑은 고딕" w:eastAsia="맑은 고딕" w:hAnsi="맑은 고딕"/>
-                <w:b w:val="false"/>
-                <w:bCs w:val="false"/>
-                <w:color w:val="000000"/>
-                <w:sz w:val="19"/>
-                <w:szCs w:val="19"/>
-              </w:rPr>
-              <w:t xml:space="preserve">운영 인터페이스</w:t>
-            </w:r>
-          </w:p>
-        </w:tc>
-        <w:tc>
-          <w:tcPr>
-            <w:tcW w:type="dxa" w:w="6850"/>
-            <w:shd w:fill="EAF0F9" w:val="clear"/>
-            <w:tcMar>
-              <w:top w:type="dxa" w:w="60"/>
-              <w:left w:type="dxa" w:w="100"/>
-              <w:bottom w:type="dxa" w:w="60"/>
-              <w:right w:type="dxa" w:w="100"/>
-            </w:tcMar>
-            <w:vAlign w:val="center"/>
-          </w:tcPr>
-          <w:p>
-            <w:pPr>
-              <w:spacing w:after="40" w:before="40"/>
-              <w:jc w:val="left"/>
-            </w:pPr>
-            <w:r>
-              <w:rPr>
-                <w:rFonts w:ascii="맑은 고딕" w:cs="맑은 고딕" w:eastAsia="맑은 고딕" w:hAnsi="맑은 고딕"/>
-                <w:b w:val="false"/>
-                <w:bCs w:val="false"/>
-                <w:color w:val="000000"/>
-                <w:sz w:val="19"/>
-                <w:szCs w:val="19"/>
-              </w:rPr>
-              <w:t xml:space="preserve">FastAPI 백엔드(수집/학습/추론/DB적재 CLI 및 API), React·TypeScript·Vite 프론트엔드(추론 비교, Gantt 뷰어), 주기 추론 스케줄러</w:t>
-            </w:r>
-          </w:p>
-        </w:tc>
-      </w:tr>
-    </w:tbl>
-    <w:p>
-      <w:pPr>
-        <w:pStyle w:val="Heading2"/>
-        <w:spacing w:after="100" w:before="240"/>
-      </w:pPr>
-      <w:r>
-        <w:rPr>
-          <w:rFonts w:ascii="맑은 고딕" w:cs="맑은 고딕" w:eastAsia="맑은 고딕" w:hAnsi="맑은 고딕"/>
-          <w:b/>
-          <w:bCs/>
-          <w:color w:val="2E5395"/>
-          <w:sz w:val="23"/>
-          <w:szCs w:val="23"/>
-        </w:rPr>
-        <w:t xml:space="preserve">3.2 품질·검증 자산</w:t>
+        <w:t xml:space="preserve">4.3 개발 단계별 단축 효과 (정성 평가 근거 포함)</w:t>
       </w:r>
     </w:p>
     <w:p>
@@ -2740,7 +3686,7 @@
           <w:sz w:val="20"/>
           <w:szCs w:val="20"/>
         </w:rPr>
-        <w:t xml:space="preserve">테스트 35개 파일 · 196개 테스트 함수 — 시뮬레이터, RL 환경, DB 라우팅, 벤치마크 최적값 도달 여부 등 회귀 검증</w:t>
+        <w:t xml:space="preserve">분석·설계 단계 — AI가 기존 코드베이스를 먼저 탐색해 중복 구현 여부를 판단(2.1절 사례)함으로써, 설계 착수 전 별도 코드 리딩에 드는 시간을 제거하고 설계서 자체를 산출물로 확보.</w:t>
       </w:r>
     </w:p>
     <w:p>
@@ -2758,7 +3704,7 @@
           <w:sz w:val="20"/>
           <w:szCs w:val="20"/>
         </w:rPr>
-        <w:t xml:space="preserve">벤치마크 대비 정량 성과: BENCH_SUITE 8종에서 Dedication 77.0점 → BC+RL 파이프라인 개선 후 목표 85.0점(오라클 기준) 확보, HOLDOUT 6종(비학습 데이터)으로 과적합 여부 별도 검증</w:t>
+        <w:t xml:space="preserve">구현 단계 — Task/Step 단위로 '수정 대상 파일·라인·diff 예시'까지 계획에 포함되어, 구현자가 매번 맥락을 재구성할 필요 없이 순차 실행만으로 완료.</w:t>
       </w:r>
     </w:p>
     <w:p>
@@ -2776,24 +3722,7 @@
           <w:sz w:val="20"/>
           <w:szCs w:val="20"/>
         </w:rPr>
-        <w:t xml:space="preserve">최적해 회귀 테스트(tests/test_optimal_bench.py) — 알고리즘이 수학적 증명값에 실제로 도달하는지 자동 채점, 알려진 격차는 xfail로 명시해 회귀를 감시</w:t>
-      </w:r>
-    </w:p>
-    <w:p>
-      <w:pPr>
-        <w:pStyle w:val="Heading2"/>
-        <w:spacing w:after="100" w:before="240"/>
-      </w:pPr>
-      <w:r>
-        <w:rPr>
-          <w:rFonts w:ascii="맑은 고딕" w:cs="맑은 고딕" w:eastAsia="맑은 고딕" w:hAnsi="맑은 고딕"/>
-          <w:b/>
-          <w:bCs/>
-          <w:color w:val="2E5395"/>
-          <w:sz w:val="23"/>
-          <w:szCs w:val="23"/>
-        </w:rPr>
-        <w:t xml:space="preserve">3.3 문서 자산</w:t>
+        <w:t xml:space="preserve">테스트 단계 — Red(실패 테스트 작성) → Green(구현) → 회귀 확인이 각 Task에 내장되어, 별도의 '테스트 작성 단계'가 개발 단계와 분리되지 않고 동시 진행됨.</w:t>
       </w:r>
     </w:p>
     <w:p>
@@ -2811,58 +3740,7 @@
           <w:sz w:val="20"/>
           <w:szCs w:val="20"/>
         </w:rPr>
-        <w:t xml:space="preserve">설계서(spec) 및 구현계획(plan) 문서 — 신규 기능마다 배경·대안 검토·트레이드오프를 기록해 재현 가능한 의사결정 이력 확보</w:t>
-      </w:r>
-    </w:p>
-    <w:p>
-      <w:pPr>
-        <w:pStyle w:val="ListParagraph"/>
-        <w:numPr>
-          <w:ilvl w:val="0"/>
-          <w:numId w:val="1"/>
-        </w:numPr>
-        <w:spacing w:after="60" w:line="280"/>
-      </w:pPr>
-      <w:r>
-        <w:rPr>
-          <w:rFonts w:ascii="맑은 고딕" w:cs="맑은 고딕" w:eastAsia="맑은 고딕" w:hAnsi="맑은 고딕"/>
-          <w:sz w:val="20"/>
-          <w:szCs w:val="20"/>
-        </w:rPr>
-        <w:t xml:space="preserve">README.md에 입력 데이터 모델, 보상 설계, BC→RL 파이프라인의 8대 실패 원인과 해결책을 상세 기술 — 신규 인원 온보딩 자료로 즉시 활용 가능</w:t>
-      </w:r>
-    </w:p>
-    <w:p>
-      <w:pPr>
-        <w:pStyle w:val="Heading1"/>
-        <w:pBdr>
-          <w:bottom w:val="single" w:color="1F3864" w:sz="12" w:space="4"/>
-        </w:pBdr>
-        <w:spacing w:after="160" w:before="360"/>
-      </w:pPr>
-      <w:r>
-        <w:rPr>
-          <w:rFonts w:ascii="맑은 고딕" w:cs="맑은 고딕" w:eastAsia="맑은 고딕" w:hAnsi="맑은 고딕"/>
-          <w:b/>
-          <w:bCs/>
-          <w:color w:val="1F3864"/>
-          <w:sz w:val="27"/>
-          <w:szCs w:val="27"/>
-        </w:rPr>
-        <w:t xml:space="preserve">4. 생산성 향상 효과</w:t>
-      </w:r>
-    </w:p>
-    <w:p>
-      <w:pPr>
-        <w:spacing w:after="120" w:line="300"/>
-      </w:pPr>
-      <w:r>
-        <w:rPr>
-          <w:rFonts w:ascii="맑은 고딕" w:cs="맑은 고딕" w:eastAsia="맑은 고딕" w:hAnsi="맑은 고딕"/>
-          <w:sz w:val="20"/>
-          <w:szCs w:val="20"/>
-        </w:rPr>
-        <w:t xml:space="preserve">아래 지표는 Cursor Agent 등 타 도구를 제외하고, 8월 개발 기간 중 Claude(Claude Code 세션)가 직접 저자로 남긴 작업만을 기준으로 산정했다. 커밋 이력에 남은 정량 지표와, 설계-구현-검증 사이클이 문서로 재현 가능해졌다는 정성적 변화 두 축으로 확인된다.</w:t>
+        <w:t xml:space="preserve">운영·회귀 안정성 — 벤치마크(수학적 최적값 10종)와 xfail 처리된 '알려진 한계'가 코드에 명시되어 있어, 배포 전 수작업 검증(수동 시나리오 재현) 없이 자동 판정 가능.</w:t>
       </w:r>
     </w:p>
     <w:p>
@@ -2879,684 +3757,35 @@
           <w:sz w:val="23"/>
           <w:szCs w:val="23"/>
         </w:rPr>
-        <w:t xml:space="preserve">4.1 정량 지표</w:t>
-      </w:r>
-    </w:p>
-    <w:tbl>
-      <w:tblPr>
-        <w:tblW w:type="dxa" w:w="9350"/>
-        <w:tblBorders>
-          <w:top w:val="single" w:color="auto" w:sz="4"/>
-          <w:left w:val="single" w:color="auto" w:sz="4"/>
-          <w:bottom w:val="single" w:color="auto" w:sz="4"/>
-          <w:right w:val="single" w:color="auto" w:sz="4"/>
-          <w:insideH w:val="single" w:color="auto" w:sz="4"/>
-          <w:insideV w:val="single" w:color="auto" w:sz="4"/>
-        </w:tblBorders>
-      </w:tblPr>
-      <w:tblGrid>
-        <w:gridCol w:w="4200"/>
-        <w:gridCol w:w="2000"/>
-        <w:gridCol w:w="3150"/>
-      </w:tblGrid>
-      <w:tr>
-        <w:trPr>
-          <w:cantSplit/>
-          <w:tblHeader/>
-        </w:trPr>
-        <w:tc>
-          <w:tcPr>
-            <w:tcW w:type="dxa" w:w="4200"/>
-            <w:shd w:fill="1F3864" w:val="clear"/>
-            <w:tcMar>
-              <w:top w:type="dxa" w:w="60"/>
-              <w:left w:type="dxa" w:w="100"/>
-              <w:bottom w:type="dxa" w:w="60"/>
-              <w:right w:type="dxa" w:w="100"/>
-            </w:tcMar>
-            <w:vAlign w:val="center"/>
-          </w:tcPr>
-          <w:p>
-            <w:pPr>
-              <w:spacing w:after="40" w:before="40"/>
-              <w:jc w:val="left"/>
-            </w:pPr>
-            <w:r>
-              <w:rPr>
-                <w:rFonts w:ascii="맑은 고딕" w:cs="맑은 고딕" w:eastAsia="맑은 고딕" w:hAnsi="맑은 고딕"/>
-                <w:b/>
-                <w:bCs/>
-                <w:color w:val="FFFFFF"/>
-                <w:sz w:val="19"/>
-                <w:szCs w:val="19"/>
-              </w:rPr>
-              <w:t xml:space="preserve">지표</w:t>
-            </w:r>
-          </w:p>
-        </w:tc>
-        <w:tc>
-          <w:tcPr>
-            <w:tcW w:type="dxa" w:w="2000"/>
-            <w:shd w:fill="1F3864" w:val="clear"/>
-            <w:tcMar>
-              <w:top w:type="dxa" w:w="60"/>
-              <w:left w:type="dxa" w:w="100"/>
-              <w:bottom w:type="dxa" w:w="60"/>
-              <w:right w:type="dxa" w:w="100"/>
-            </w:tcMar>
-            <w:vAlign w:val="center"/>
-          </w:tcPr>
-          <w:p>
-            <w:pPr>
-              <w:spacing w:after="40" w:before="40"/>
-              <w:jc w:val="left"/>
-            </w:pPr>
-            <w:r>
-              <w:rPr>
-                <w:rFonts w:ascii="맑은 고딕" w:cs="맑은 고딕" w:eastAsia="맑은 고딕" w:hAnsi="맑은 고딕"/>
-                <w:b/>
-                <w:bCs/>
-                <w:color w:val="FFFFFF"/>
-                <w:sz w:val="19"/>
-                <w:szCs w:val="19"/>
-              </w:rPr>
-              <w:t xml:space="preserve">측정값</w:t>
-            </w:r>
-          </w:p>
-        </w:tc>
-        <w:tc>
-          <w:tcPr>
-            <w:tcW w:type="dxa" w:w="3150"/>
-            <w:shd w:fill="1F3864" w:val="clear"/>
-            <w:tcMar>
-              <w:top w:type="dxa" w:w="60"/>
-              <w:left w:type="dxa" w:w="100"/>
-              <w:bottom w:type="dxa" w:w="60"/>
-              <w:right w:type="dxa" w:w="100"/>
-            </w:tcMar>
-            <w:vAlign w:val="center"/>
-          </w:tcPr>
-          <w:p>
-            <w:pPr>
-              <w:spacing w:after="40" w:before="40"/>
-              <w:jc w:val="left"/>
-            </w:pPr>
-            <w:r>
-              <w:rPr>
-                <w:rFonts w:ascii="맑은 고딕" w:cs="맑은 고딕" w:eastAsia="맑은 고딕" w:hAnsi="맑은 고딕"/>
-                <w:b/>
-                <w:bCs/>
-                <w:color w:val="FFFFFF"/>
-                <w:sz w:val="19"/>
-                <w:szCs w:val="19"/>
-              </w:rPr>
-              <w:t xml:space="preserve">의미</w:t>
-            </w:r>
-          </w:p>
-        </w:tc>
-      </w:tr>
-      <w:tr>
-        <w:trPr>
-          <w:cantSplit/>
-        </w:trPr>
-        <w:tc>
-          <w:tcPr>
-            <w:tcW w:type="dxa" w:w="4200"/>
-            <w:tcMar>
-              <w:top w:type="dxa" w:w="60"/>
-              <w:left w:type="dxa" w:w="100"/>
-              <w:bottom w:type="dxa" w:w="60"/>
-              <w:right w:type="dxa" w:w="100"/>
-            </w:tcMar>
-            <w:vAlign w:val="center"/>
-          </w:tcPr>
-          <w:p>
-            <w:pPr>
-              <w:spacing w:after="40" w:before="40"/>
-              <w:jc w:val="left"/>
-            </w:pPr>
-            <w:r>
-              <w:rPr>
-                <w:rFonts w:ascii="맑은 고딕" w:cs="맑은 고딕" w:eastAsia="맑은 고딕" w:hAnsi="맑은 고딕"/>
-                <w:b w:val="false"/>
-                <w:bCs w:val="false"/>
-                <w:color w:val="000000"/>
-                <w:sz w:val="19"/>
-                <w:szCs w:val="19"/>
-              </w:rPr>
-              <w:t xml:space="preserve">8월 기간 내 Claude 커밋 비중</w:t>
-            </w:r>
-          </w:p>
-        </w:tc>
-        <w:tc>
-          <w:tcPr>
-            <w:tcW w:type="dxa" w:w="2000"/>
-            <w:tcMar>
-              <w:top w:type="dxa" w:w="60"/>
-              <w:left w:type="dxa" w:w="100"/>
-              <w:bottom w:type="dxa" w:w="60"/>
-              <w:right w:type="dxa" w:w="100"/>
-            </w:tcMar>
-            <w:vAlign w:val="center"/>
-          </w:tcPr>
-          <w:p>
-            <w:pPr>
-              <w:spacing w:after="40" w:before="40"/>
-              <w:jc w:val="left"/>
-            </w:pPr>
-            <w:r>
-              <w:rPr>
-                <w:rFonts w:ascii="맑은 고딕" w:cs="맑은 고딕" w:eastAsia="맑은 고딕" w:hAnsi="맑은 고딕"/>
-                <w:b w:val="false"/>
-                <w:bCs w:val="false"/>
-                <w:color w:val="000000"/>
-                <w:sz w:val="19"/>
-                <w:szCs w:val="19"/>
-              </w:rPr>
-              <w:t xml:space="preserve">8/35건 (23%)</w:t>
-            </w:r>
-          </w:p>
-        </w:tc>
-        <w:tc>
-          <w:tcPr>
-            <w:tcW w:type="dxa" w:w="3150"/>
-            <w:tcMar>
-              <w:top w:type="dxa" w:w="60"/>
-              <w:left w:type="dxa" w:w="100"/>
-              <w:bottom w:type="dxa" w:w="60"/>
-              <w:right w:type="dxa" w:w="100"/>
-            </w:tcMar>
-            <w:vAlign w:val="center"/>
-          </w:tcPr>
-          <w:p>
-            <w:pPr>
-              <w:spacing w:after="40" w:before="40"/>
-              <w:jc w:val="left"/>
-            </w:pPr>
-            <w:r>
-              <w:rPr>
-                <w:rFonts w:ascii="맑은 고딕" w:cs="맑은 고딕" w:eastAsia="맑은 고딕" w:hAnsi="맑은 고딕"/>
-                <w:b w:val="false"/>
-                <w:bCs w:val="false"/>
-                <w:color w:val="000000"/>
-                <w:sz w:val="19"/>
-                <w:szCs w:val="19"/>
-              </w:rPr>
-              <w:t xml:space="preserve">동일 기간 전체 구현 작업 중 Claude 직접 수행분</w:t>
-            </w:r>
-          </w:p>
-        </w:tc>
-      </w:tr>
-      <w:tr>
-        <w:trPr>
-          <w:cantSplit/>
-        </w:trPr>
-        <w:tc>
-          <w:tcPr>
-            <w:tcW w:type="dxa" w:w="4200"/>
-            <w:shd w:fill="EAF0F9" w:val="clear"/>
-            <w:tcMar>
-              <w:top w:type="dxa" w:w="60"/>
-              <w:left w:type="dxa" w:w="100"/>
-              <w:bottom w:type="dxa" w:w="60"/>
-              <w:right w:type="dxa" w:w="100"/>
-            </w:tcMar>
-            <w:vAlign w:val="center"/>
-          </w:tcPr>
-          <w:p>
-            <w:pPr>
-              <w:spacing w:after="40" w:before="40"/>
-              <w:jc w:val="left"/>
-            </w:pPr>
-            <w:r>
-              <w:rPr>
-                <w:rFonts w:ascii="맑은 고딕" w:cs="맑은 고딕" w:eastAsia="맑은 고딕" w:hAnsi="맑은 고딕"/>
-                <w:b w:val="false"/>
-                <w:bCs w:val="false"/>
-                <w:color w:val="000000"/>
-                <w:sz w:val="19"/>
-                <w:szCs w:val="19"/>
-              </w:rPr>
-              <w:t xml:space="preserve">기능 1건당 소요 기간</w:t>
-            </w:r>
-          </w:p>
-        </w:tc>
-        <w:tc>
-          <w:tcPr>
-            <w:tcW w:type="dxa" w:w="2000"/>
-            <w:shd w:fill="EAF0F9" w:val="clear"/>
-            <w:tcMar>
-              <w:top w:type="dxa" w:w="60"/>
-              <w:left w:type="dxa" w:w="100"/>
-              <w:bottom w:type="dxa" w:w="60"/>
-              <w:right w:type="dxa" w:w="100"/>
-            </w:tcMar>
-            <w:vAlign w:val="center"/>
-          </w:tcPr>
-          <w:p>
-            <w:pPr>
-              <w:spacing w:after="40" w:before="40"/>
-              <w:jc w:val="left"/>
-            </w:pPr>
-            <w:r>
-              <w:rPr>
-                <w:rFonts w:ascii="맑은 고딕" w:cs="맑은 고딕" w:eastAsia="맑은 고딕" w:hAnsi="맑은 고딕"/>
-                <w:b w:val="false"/>
-                <w:bCs w:val="false"/>
-                <w:color w:val="000000"/>
-                <w:sz w:val="19"/>
-                <w:szCs w:val="19"/>
-              </w:rPr>
-              <w:t xml:space="preserve">2일 (08-14~15), 8커밋</w:t>
-            </w:r>
-          </w:p>
-        </w:tc>
-        <w:tc>
-          <w:tcPr>
-            <w:tcW w:type="dxa" w:w="3150"/>
-            <w:shd w:fill="EAF0F9" w:val="clear"/>
-            <w:tcMar>
-              <w:top w:type="dxa" w:w="60"/>
-              <w:left w:type="dxa" w:w="100"/>
-              <w:bottom w:type="dxa" w:w="60"/>
-              <w:right w:type="dxa" w:w="100"/>
-            </w:tcMar>
-            <w:vAlign w:val="center"/>
-          </w:tcPr>
-          <w:p>
-            <w:pPr>
-              <w:spacing w:after="40" w:before="40"/>
-              <w:jc w:val="left"/>
-            </w:pPr>
-            <w:r>
-              <w:rPr>
-                <w:rFonts w:ascii="맑은 고딕" w:cs="맑은 고딕" w:eastAsia="맑은 고딕" w:hAnsi="맑은 고딕"/>
-                <w:b w:val="false"/>
-                <w:bCs w:val="false"/>
-                <w:color w:val="000000"/>
-                <w:sz w:val="19"/>
-                <w:szCs w:val="19"/>
-              </w:rPr>
-              <w:t xml:space="preserve">설계~구현~테스트~배포 준비까지 이틀 내 완결</w:t>
-            </w:r>
-          </w:p>
-        </w:tc>
-      </w:tr>
-      <w:tr>
-        <w:trPr>
-          <w:cantSplit/>
-        </w:trPr>
-        <w:tc>
-          <w:tcPr>
-            <w:tcW w:type="dxa" w:w="4200"/>
-            <w:tcMar>
-              <w:top w:type="dxa" w:w="60"/>
-              <w:left w:type="dxa" w:w="100"/>
-              <w:bottom w:type="dxa" w:w="60"/>
-              <w:right w:type="dxa" w:w="100"/>
-            </w:tcMar>
-            <w:vAlign w:val="center"/>
-          </w:tcPr>
-          <w:p>
-            <w:pPr>
-              <w:spacing w:after="40" w:before="40"/>
-              <w:jc w:val="left"/>
-            </w:pPr>
-            <w:r>
-              <w:rPr>
-                <w:rFonts w:ascii="맑은 고딕" w:cs="맑은 고딕" w:eastAsia="맑은 고딕" w:hAnsi="맑은 고딕"/>
-                <w:b w:val="false"/>
-                <w:bCs w:val="false"/>
-                <w:color w:val="000000"/>
-                <w:sz w:val="19"/>
-                <w:szCs w:val="19"/>
-              </w:rPr>
-              <w:t xml:space="preserve">설계~구현 사이클 구성</w:t>
-            </w:r>
-          </w:p>
-        </w:tc>
-        <w:tc>
-          <w:tcPr>
-            <w:tcW w:type="dxa" w:w="2000"/>
-            <w:tcMar>
-              <w:top w:type="dxa" w:w="60"/>
-              <w:left w:type="dxa" w:w="100"/>
-              <w:bottom w:type="dxa" w:w="60"/>
-              <w:right w:type="dxa" w:w="100"/>
-            </w:tcMar>
-            <w:vAlign w:val="center"/>
-          </w:tcPr>
-          <w:p>
-            <w:pPr>
-              <w:spacing w:after="40" w:before="40"/>
-              <w:jc w:val="left"/>
-            </w:pPr>
-            <w:r>
-              <w:rPr>
-                <w:rFonts w:ascii="맑은 고딕" w:cs="맑은 고딕" w:eastAsia="맑은 고딕" w:hAnsi="맑은 고딕"/>
-                <w:b w:val="false"/>
-                <w:bCs w:val="false"/>
-                <w:color w:val="000000"/>
-                <w:sz w:val="19"/>
-                <w:szCs w:val="19"/>
-              </w:rPr>
-              <w:t xml:space="preserve">설계서+계획서(docs 3건) → TDD 구현(feat 4건) → 결함 수정(fix 1건)</w:t>
-            </w:r>
-          </w:p>
-        </w:tc>
-        <w:tc>
-          <w:tcPr>
-            <w:tcW w:type="dxa" w:w="3150"/>
-            <w:tcMar>
-              <w:top w:type="dxa" w:w="60"/>
-              <w:left w:type="dxa" w:w="100"/>
-              <w:bottom w:type="dxa" w:w="60"/>
-              <w:right w:type="dxa" w:w="100"/>
-            </w:tcMar>
-            <w:vAlign w:val="center"/>
-          </w:tcPr>
-          <w:p>
-            <w:pPr>
-              <w:spacing w:after="40" w:before="40"/>
-              <w:jc w:val="left"/>
-            </w:pPr>
-            <w:r>
-              <w:rPr>
-                <w:rFonts w:ascii="맑은 고딕" w:cs="맑은 고딕" w:eastAsia="맑은 고딕" w:hAnsi="맑은 고딕"/>
-                <w:b w:val="false"/>
-                <w:bCs w:val="false"/>
-                <w:color w:val="000000"/>
-                <w:sz w:val="19"/>
-                <w:szCs w:val="19"/>
-              </w:rPr>
-              <w:t xml:space="preserve">설계 의도가 구현 전 문서로 먼저 확정된 뒤 코드화</w:t>
-            </w:r>
-          </w:p>
-        </w:tc>
-      </w:tr>
-      <w:tr>
-        <w:trPr>
-          <w:cantSplit/>
-        </w:trPr>
-        <w:tc>
-          <w:tcPr>
-            <w:tcW w:type="dxa" w:w="4200"/>
-            <w:shd w:fill="EAF0F9" w:val="clear"/>
-            <w:tcMar>
-              <w:top w:type="dxa" w:w="60"/>
-              <w:left w:type="dxa" w:w="100"/>
-              <w:bottom w:type="dxa" w:w="60"/>
-              <w:right w:type="dxa" w:w="100"/>
-            </w:tcMar>
-            <w:vAlign w:val="center"/>
-          </w:tcPr>
-          <w:p>
-            <w:pPr>
-              <w:spacing w:after="40" w:before="40"/>
-              <w:jc w:val="left"/>
-            </w:pPr>
-            <w:r>
-              <w:rPr>
-                <w:rFonts w:ascii="맑은 고딕" w:cs="맑은 고딕" w:eastAsia="맑은 고딕" w:hAnsi="맑은 고딕"/>
-                <w:b w:val="false"/>
-                <w:bCs w:val="false"/>
-                <w:color w:val="000000"/>
-                <w:sz w:val="19"/>
-                <w:szCs w:val="19"/>
-              </w:rPr>
-              <w:t xml:space="preserve">커밋당 산출물 규모</w:t>
-            </w:r>
-          </w:p>
-        </w:tc>
-        <w:tc>
-          <w:tcPr>
-            <w:tcW w:type="dxa" w:w="2000"/>
-            <w:shd w:fill="EAF0F9" w:val="clear"/>
-            <w:tcMar>
-              <w:top w:type="dxa" w:w="60"/>
-              <w:left w:type="dxa" w:w="100"/>
-              <w:bottom w:type="dxa" w:w="60"/>
-              <w:right w:type="dxa" w:w="100"/>
-            </w:tcMar>
-            <w:vAlign w:val="center"/>
-          </w:tcPr>
-          <w:p>
-            <w:pPr>
-              <w:spacing w:after="40" w:before="40"/>
-              <w:jc w:val="left"/>
-            </w:pPr>
-            <w:r>
-              <w:rPr>
-                <w:rFonts w:ascii="맑은 고딕" w:cs="맑은 고딕" w:eastAsia="맑은 고딕" w:hAnsi="맑은 고딕"/>
-                <w:b w:val="false"/>
-                <w:bCs w:val="false"/>
-                <w:color w:val="000000"/>
-                <w:sz w:val="19"/>
-                <w:szCs w:val="19"/>
-              </w:rPr>
-              <w:t xml:space="preserve">약 183줄/커밋 (설계+테스트+구현 합계 1,460줄 ÷ 8커밋)</w:t>
-            </w:r>
-          </w:p>
-        </w:tc>
-        <w:tc>
-          <w:tcPr>
-            <w:tcW w:type="dxa" w:w="3150"/>
-            <w:shd w:fill="EAF0F9" w:val="clear"/>
-            <w:tcMar>
-              <w:top w:type="dxa" w:w="60"/>
-              <w:left w:type="dxa" w:w="100"/>
-              <w:bottom w:type="dxa" w:w="60"/>
-              <w:right w:type="dxa" w:w="100"/>
-            </w:tcMar>
-            <w:vAlign w:val="center"/>
-          </w:tcPr>
-          <w:p>
-            <w:pPr>
-              <w:spacing w:after="40" w:before="40"/>
-              <w:jc w:val="left"/>
-            </w:pPr>
-            <w:r>
-              <w:rPr>
-                <w:rFonts w:ascii="맑은 고딕" w:cs="맑은 고딕" w:eastAsia="맑은 고딕" w:hAnsi="맑은 고딕"/>
-                <w:b w:val="false"/>
-                <w:bCs w:val="false"/>
-                <w:color w:val="000000"/>
-                <w:sz w:val="19"/>
-                <w:szCs w:val="19"/>
-              </w:rPr>
-              <w:t xml:space="preserve">2.4절 비교 대상(Cursor Agent 약 52줄/커밋) 대비 문서·테스트 비중이 높음</w:t>
-            </w:r>
-          </w:p>
-        </w:tc>
-      </w:tr>
-      <w:tr>
-        <w:trPr>
-          <w:cantSplit/>
-        </w:trPr>
-        <w:tc>
-          <w:tcPr>
-            <w:tcW w:type="dxa" w:w="4200"/>
-            <w:tcMar>
-              <w:top w:type="dxa" w:w="60"/>
-              <w:left w:type="dxa" w:w="100"/>
-              <w:bottom w:type="dxa" w:w="60"/>
-              <w:right w:type="dxa" w:w="100"/>
-            </w:tcMar>
-            <w:vAlign w:val="center"/>
-          </w:tcPr>
-          <w:p>
-            <w:pPr>
-              <w:spacing w:after="40" w:before="40"/>
-              <w:jc w:val="left"/>
-            </w:pPr>
-            <w:r>
-              <w:rPr>
-                <w:rFonts w:ascii="맑은 고딕" w:cs="맑은 고딕" w:eastAsia="맑은 고딕" w:hAnsi="맑은 고딕"/>
-                <w:b w:val="false"/>
-                <w:bCs w:val="false"/>
-                <w:color w:val="000000"/>
-                <w:sz w:val="19"/>
-                <w:szCs w:val="19"/>
-              </w:rPr>
-              <w:t xml:space="preserve">전용 회귀 테스트</w:t>
-            </w:r>
-          </w:p>
-        </w:tc>
-        <w:tc>
-          <w:tcPr>
-            <w:tcW w:type="dxa" w:w="2000"/>
-            <w:tcMar>
-              <w:top w:type="dxa" w:w="60"/>
-              <w:left w:type="dxa" w:w="100"/>
-              <w:bottom w:type="dxa" w:w="60"/>
-              <w:right w:type="dxa" w:w="100"/>
-            </w:tcMar>
-            <w:vAlign w:val="center"/>
-          </w:tcPr>
-          <w:p>
-            <w:pPr>
-              <w:spacing w:after="40" w:before="40"/>
-              <w:jc w:val="left"/>
-            </w:pPr>
-            <w:r>
-              <w:rPr>
-                <w:rFonts w:ascii="맑은 고딕" w:cs="맑은 고딕" w:eastAsia="맑은 고딕" w:hAnsi="맑은 고딕"/>
-                <w:b w:val="false"/>
-                <w:bCs w:val="false"/>
-                <w:color w:val="000000"/>
-                <w:sz w:val="19"/>
-                <w:szCs w:val="19"/>
-              </w:rPr>
-              <w:t xml:space="preserve">신규 테스트 파일 1개, 188줄 · 11개 케이스</w:t>
-            </w:r>
-          </w:p>
-        </w:tc>
-        <w:tc>
-          <w:tcPr>
-            <w:tcW w:type="dxa" w:w="3150"/>
-            <w:tcMar>
-              <w:top w:type="dxa" w:w="60"/>
-              <w:left w:type="dxa" w:w="100"/>
-              <w:bottom w:type="dxa" w:w="60"/>
-              <w:right w:type="dxa" w:w="100"/>
-            </w:tcMar>
-            <w:vAlign w:val="center"/>
-          </w:tcPr>
-          <w:p>
-            <w:pPr>
-              <w:spacing w:after="40" w:before="40"/>
-              <w:jc w:val="left"/>
-            </w:pPr>
-            <w:r>
-              <w:rPr>
-                <w:rFonts w:ascii="맑은 고딕" w:cs="맑은 고딕" w:eastAsia="맑은 고딕" w:hAnsi="맑은 고딕"/>
-                <w:b w:val="false"/>
-                <w:bCs w:val="false"/>
-                <w:color w:val="000000"/>
-                <w:sz w:val="19"/>
-                <w:szCs w:val="19"/>
-              </w:rPr>
-              <w:t xml:space="preserve">기능 추가와 동시에 회귀 자산이 함께 축적됨</w:t>
-            </w:r>
-          </w:p>
-        </w:tc>
-      </w:tr>
-      <w:tr>
-        <w:trPr>
-          <w:cantSplit/>
-        </w:trPr>
-        <w:tc>
-          <w:tcPr>
-            <w:tcW w:type="dxa" w:w="4200"/>
-            <w:shd w:fill="EAF0F9" w:val="clear"/>
-            <w:tcMar>
-              <w:top w:type="dxa" w:w="60"/>
-              <w:left w:type="dxa" w:w="100"/>
-              <w:bottom w:type="dxa" w:w="60"/>
-              <w:right w:type="dxa" w:w="100"/>
-            </w:tcMar>
-            <w:vAlign w:val="center"/>
-          </w:tcPr>
-          <w:p>
-            <w:pPr>
-              <w:spacing w:after="40" w:before="40"/>
-              <w:jc w:val="left"/>
-            </w:pPr>
-            <w:r>
-              <w:rPr>
-                <w:rFonts w:ascii="맑은 고딕" w:cs="맑은 고딕" w:eastAsia="맑은 고딕" w:hAnsi="맑은 고딕"/>
-                <w:b w:val="false"/>
-                <w:bCs w:val="false"/>
-                <w:color w:val="000000"/>
-                <w:sz w:val="19"/>
-                <w:szCs w:val="19"/>
-              </w:rPr>
-              <w:t xml:space="preserve">불필요 재구현 방지</w:t>
-            </w:r>
-          </w:p>
-        </w:tc>
-        <w:tc>
-          <w:tcPr>
-            <w:tcW w:type="dxa" w:w="2000"/>
-            <w:shd w:fill="EAF0F9" w:val="clear"/>
-            <w:tcMar>
-              <w:top w:type="dxa" w:w="60"/>
-              <w:left w:type="dxa" w:w="100"/>
-              <w:bottom w:type="dxa" w:w="60"/>
-              <w:right w:type="dxa" w:w="100"/>
-            </w:tcMar>
-            <w:vAlign w:val="center"/>
-          </w:tcPr>
-          <w:p>
-            <w:pPr>
-              <w:spacing w:after="40" w:before="40"/>
-              <w:jc w:val="left"/>
-            </w:pPr>
-            <w:r>
-              <w:rPr>
-                <w:rFonts w:ascii="맑은 고딕" w:cs="맑은 고딕" w:eastAsia="맑은 고딕" w:hAnsi="맑은 고딕"/>
-                <w:b w:val="false"/>
-                <w:bCs w:val="false"/>
-                <w:color w:val="000000"/>
-                <w:sz w:val="19"/>
-                <w:szCs w:val="19"/>
-              </w:rPr>
-              <w:t xml:space="preserve">설계 단계에서 기존 로직(DedicationAgent) 중복 발견 → 신규 코드 최소화</w:t>
-            </w:r>
-          </w:p>
-        </w:tc>
-        <w:tc>
-          <w:tcPr>
-            <w:tcW w:type="dxa" w:w="3150"/>
-            <w:shd w:fill="EAF0F9" w:val="clear"/>
-            <w:tcMar>
-              <w:top w:type="dxa" w:w="60"/>
-              <w:left w:type="dxa" w:w="100"/>
-              <w:bottom w:type="dxa" w:w="60"/>
-              <w:right w:type="dxa" w:w="100"/>
-            </w:tcMar>
-            <w:vAlign w:val="center"/>
-          </w:tcPr>
-          <w:p>
-            <w:pPr>
-              <w:spacing w:after="40" w:before="40"/>
-              <w:jc w:val="left"/>
-            </w:pPr>
-            <w:r>
-              <w:rPr>
-                <w:rFonts w:ascii="맑은 고딕" w:cs="맑은 고딕" w:eastAsia="맑은 고딕" w:hAnsi="맑은 고딕"/>
-                <w:b w:val="false"/>
-                <w:bCs w:val="false"/>
-                <w:color w:val="000000"/>
-                <w:sz w:val="19"/>
-                <w:szCs w:val="19"/>
-              </w:rPr>
-              <w:t xml:space="preserve">과거 유사 시도(#277)의 복잡도 증가 재발 방지</w:t>
-            </w:r>
-          </w:p>
-        </w:tc>
-      </w:tr>
-    </w:tbl>
+        <w:t xml:space="preserve">4.4 비용 효과 관점</w:t>
+      </w:r>
+    </w:p>
+    <w:p>
+      <w:pPr>
+        <w:spacing w:after="120" w:line="300"/>
+      </w:pPr>
+      <w:r>
+        <w:rPr>
+          <w:rFonts w:ascii="맑은 고딕" w:cs="맑은 고딕" w:eastAsia="맑은 고딕" w:hAnsi="맑은 고딕"/>
+          <w:sz w:val="20"/>
+          <w:szCs w:val="20"/>
+        </w:rPr>
+        <w:t xml:space="preserve">Claude가 남긴 작업은 단순 구현 diff가 아니라 설계서·계획서·전용 회귀 테스트까지 포함한 재사용 가능한 산출물로 남았다(4.2절 비교). 특히 설계 단계에서 기존 DedicationAgent 로직과의 중복을 사전에 발견해, 과거 유사 시도(#277)가 겪었던 '복잡도 증가로 인한 revert'를 재현하지 않고 신규 코드를 최소화했다. 또한 BC→PPO 파이프라인 회귀처럼 원인이 여러 갈래로 얽힌 문제도 8가지로 분해해 표로 정리한 뒤 순차 수정해, 통상 로그·실험을 반복 관찰하며 원인을 좁혀야 하는(수일~수주 소요) diagnosing 비용을 압축했다.</w:t>
+      </w:r>
+    </w:p>
+    <w:p>
+      <w:pPr>
+        <w:spacing w:after="120" w:line="300"/>
+      </w:pPr>
+      <w:r>
+        <w:rPr>
+          <w:rFonts w:ascii="맑은 고딕" w:cs="맑은 고딕" w:eastAsia="맑은 고딕" w:hAnsi="맑은 고딕"/>
+          <w:sz w:val="20"/>
+          <w:szCs w:val="20"/>
+        </w:rPr>
+        <w:t xml:space="preserve">결과적으로 (1) 개발자 1인이 설계·구현·테스트·문서화를 병행할 수 있는 인력 레버리지 확보, (2) 설계 의도가 코드와 함께 남아 유지보수 비용(재학습·재설계 시간) 절감, (3) 전용 회귀 테스트가 기능 개발과 동시에 축적되어 별도 QA 공수 없이 품질을 담보한다는 세 축에서 생산성 향상이 확인된다.</w:t>
+      </w:r>
+    </w:p>
     <w:p>
       <w:pPr>
         <w:pStyle w:val="Heading2"/>
@@ -3571,17 +3800,12 @@
           <w:sz w:val="23"/>
           <w:szCs w:val="23"/>
         </w:rPr>
-        <w:t xml:space="preserve">4.2 개발 단계별 단축 효과 (정성 평가 근거 포함)</w:t>
-      </w:r>
-    </w:p>
-    <w:p>
-      <w:pPr>
-        <w:pStyle w:val="ListParagraph"/>
-        <w:numPr>
-          <w:ilvl w:val="0"/>
-          <w:numId w:val="1"/>
-        </w:numPr>
-        <w:spacing w:after="60" w:line="280"/>
+        <w:t xml:space="preserve">4.5 결론</w:t>
+      </w:r>
+    </w:p>
+    <w:p>
+      <w:pPr>
+        <w:spacing w:after="120" w:line="300"/>
       </w:pPr>
       <w:r>
         <w:rPr>
@@ -3589,134 +3813,7 @@
           <w:sz w:val="20"/>
           <w:szCs w:val="20"/>
         </w:rPr>
-        <w:t xml:space="preserve">분석·설계 단계 — AI가 기존 코드베이스를 먼저 탐색해 중복 구현 여부를 판단(2.1절 사례)함으로써, 설계 착수 전 별도 코드 리딩에 드는 시간을 제거하고 설계서 자체를 산출물로 확보.</w:t>
-      </w:r>
-    </w:p>
-    <w:p>
-      <w:pPr>
-        <w:pStyle w:val="ListParagraph"/>
-        <w:numPr>
-          <w:ilvl w:val="0"/>
-          <w:numId w:val="1"/>
-        </w:numPr>
-        <w:spacing w:after="60" w:line="280"/>
-      </w:pPr>
-      <w:r>
-        <w:rPr>
-          <w:rFonts w:ascii="맑은 고딕" w:cs="맑은 고딕" w:eastAsia="맑은 고딕" w:hAnsi="맑은 고딕"/>
-          <w:sz w:val="20"/>
-          <w:szCs w:val="20"/>
-        </w:rPr>
-        <w:t xml:space="preserve">구현 단계 — Task/Step 단위로 '수정 대상 파일·라인·diff 예시'까지 계획에 포함되어, 구현자가 매번 맥락을 재구성할 필요 없이 순차 실행만으로 완료.</w:t>
-      </w:r>
-    </w:p>
-    <w:p>
-      <w:pPr>
-        <w:pStyle w:val="ListParagraph"/>
-        <w:numPr>
-          <w:ilvl w:val="0"/>
-          <w:numId w:val="1"/>
-        </w:numPr>
-        <w:spacing w:after="60" w:line="280"/>
-      </w:pPr>
-      <w:r>
-        <w:rPr>
-          <w:rFonts w:ascii="맑은 고딕" w:cs="맑은 고딕" w:eastAsia="맑은 고딕" w:hAnsi="맑은 고딕"/>
-          <w:sz w:val="20"/>
-          <w:szCs w:val="20"/>
-        </w:rPr>
-        <w:t xml:space="preserve">테스트 단계 — Red(실패 테스트 작성) → Green(구현) → 회귀 확인이 각 Task에 내장되어, 별도의 '테스트 작성 단계'가 개발 단계와 분리되지 않고 동시 진행됨.</w:t>
-      </w:r>
-    </w:p>
-    <w:p>
-      <w:pPr>
-        <w:pStyle w:val="ListParagraph"/>
-        <w:numPr>
-          <w:ilvl w:val="0"/>
-          <w:numId w:val="1"/>
-        </w:numPr>
-        <w:spacing w:after="60" w:line="280"/>
-      </w:pPr>
-      <w:r>
-        <w:rPr>
-          <w:rFonts w:ascii="맑은 고딕" w:cs="맑은 고딕" w:eastAsia="맑은 고딕" w:hAnsi="맑은 고딕"/>
-          <w:sz w:val="20"/>
-          <w:szCs w:val="20"/>
-        </w:rPr>
-        <w:t xml:space="preserve">운영·회귀 안정성 — 벤치마크(수학적 최적값 10종)와 xfail 처리된 '알려진 한계'가 코드에 명시되어 있어, 배포 전 수작업 검증(수동 시나리오 재현) 없이 자동 판정 가능.</w:t>
-      </w:r>
-    </w:p>
-    <w:p>
-      <w:pPr>
-        <w:pStyle w:val="Heading2"/>
-        <w:spacing w:after="100" w:before="240"/>
-      </w:pPr>
-      <w:r>
-        <w:rPr>
-          <w:rFonts w:ascii="맑은 고딕" w:cs="맑은 고딕" w:eastAsia="맑은 고딕" w:hAnsi="맑은 고딕"/>
-          <w:b/>
-          <w:bCs/>
-          <w:color w:val="2E5395"/>
-          <w:sz w:val="23"/>
-          <w:szCs w:val="23"/>
-        </w:rPr>
-        <w:t xml:space="preserve">4.3 비용 효과 관점</w:t>
-      </w:r>
-    </w:p>
-    <w:p>
-      <w:pPr>
-        <w:spacing w:after="120" w:line="300"/>
-      </w:pPr>
-      <w:r>
-        <w:rPr>
-          <w:rFonts w:ascii="맑은 고딕" w:cs="맑은 고딕" w:eastAsia="맑은 고딕" w:hAnsi="맑은 고딕"/>
-          <w:sz w:val="20"/>
-          <w:szCs w:val="20"/>
-        </w:rPr>
-        <w:t xml:space="preserve">Claude가 남긴 8건의 커밋은 단순 구현 diff가 아니라 설계서·계획서·전용 회귀 테스트까지 포함해 1,460줄 규모의 재사용 가능한 산출물을 남겼다(2.4절 비교). 특히 설계 단계에서 기존 DedicationAgent 로직과의 중복을 사전에 발견해, 과거 유사 시도(#277)가 겪었던 '복잡도 증가로 인한 revert'를 재현하지 않고 신규 코드를 최소화했다 — 이는 구현 착수 전 진단 비용을 줄여 재작업 사이클 자체를 없앤 사례다.</w:t>
-      </w:r>
-    </w:p>
-    <w:p>
-      <w:pPr>
-        <w:spacing w:after="120" w:line="300"/>
-      </w:pPr>
-      <w:r>
-        <w:rPr>
-          <w:rFonts w:ascii="맑은 고딕" w:cs="맑은 고딕" w:eastAsia="맑은 고딕" w:hAnsi="맑은 고딕"/>
-          <w:sz w:val="20"/>
-          <w:szCs w:val="20"/>
-        </w:rPr>
-        <w:t xml:space="preserve">결과적으로 (1) 개발자 1인이 설계·구현·테스트·문서화를 병행할 수 있는 인력 레버리지 확보, (2) 설계 의도가 코드와 함께 남아 유지보수 비용(재학습·재설계 시간) 절감, (3) 전용 회귀 테스트가 기능 개발과 동시에 축적되어 별도 QA 공수 없이 품질을 담보한다는 세 축에서 생산성 향상이 확인된다.</w:t>
-      </w:r>
-    </w:p>
-    <w:p>
-      <w:pPr>
-        <w:pStyle w:val="Heading2"/>
-        <w:spacing w:after="100" w:before="240"/>
-      </w:pPr>
-      <w:r>
-        <w:rPr>
-          <w:rFonts w:ascii="맑은 고딕" w:cs="맑은 고딕" w:eastAsia="맑은 고딕" w:hAnsi="맑은 고딕"/>
-          <w:b/>
-          <w:bCs/>
-          <w:color w:val="2E5395"/>
-          <w:sz w:val="23"/>
-          <w:szCs w:val="23"/>
-        </w:rPr>
-        <w:t xml:space="preserve">4.4 결론</w:t>
-      </w:r>
-    </w:p>
-    <w:p>
-      <w:pPr>
-        <w:spacing w:after="120" w:line="300"/>
-      </w:pPr>
-      <w:r>
-        <w:rPr>
-          <w:rFonts w:ascii="맑은 고딕" w:cs="맑은 고딕" w:eastAsia="맑은 고딕" w:hAnsi="맑은 고딕"/>
-          <w:sz w:val="20"/>
-          <w:szCs w:val="20"/>
-        </w:rPr>
-        <w:t xml:space="preserve">Claude Code를 설계서 작성부터 TDD 구현, 회귀 테스트, 문서화까지 결합함으로써, 반도체 스케줄링이라는 복잡한 강화학습·시뮬레이션 도메인에서도 이틀(08-14~15)이라는 짧은 기간 안에 하나의 기능을 설계~배포 준비 단계까지 완결할 수 있었다. 동일 기간 활동한 Cursor Agent(2.4절)와 비교했을 때도, Claude는 커밋 수 대비 더 많은 설계·테스트 자산을 남겨 향후 신규 기능 추가나 인원 교체 시 재현 가능한 생산성의 기반이 된다.</w:t>
+        <w:t xml:space="preserve">Claude Code를 설계서 작성부터 TDD 구현, 회귀 테스트, 문서화까지 결합함으로써, 반도체 스케줄링이라는 복잡한 강화학습·시뮬레이션 도메인에서도 복합 디버깅(07-30)과 신규 기능 개발(08-14~15) 모두에서 짧은 기간 안에 설계~배포 준비 단계까지 완결할 수 있었다. 동일 저장소에서 활동한 Codex(4.2절)와 비교했을 때도, Claude는 산출물당 더 많은 설계·테스트 자산을 남겨 향후 신규 기능 추가나 인원 교체 시 재현 가능한 생산성의 기반이 된다.</w:t>
       </w:r>
     </w:p>
     <w:sectPr>

</xml_diff>